<commit_message>
docs: rehacer el diagrama de arquitectura y actualizar informe y presentacion
- El diagrama de arquitectura dejaba una franja vacia bajo el panel de
  herramientas; se reorganiza para ocupar todo el lienzo.
- Diagrama To Be: la etiqueta "git push" quedaba lejos de las flechas.
- Informe Word regenerado con los diagramas corregidos e indice actualizado.
- Presentacion con ajustes de separacion y equilibrio en 5, 9, 13, 14 y 16.
</commit_message>
<xml_diff>
--- a/docs/Avance1-BiblioTech-UTP.docx
+++ b/docs/Avance1-BiblioTech-UTP.docx
@@ -174,7 +174,7 @@
           <w:left w:w="10" w:type="dxa"/>
           <w:right w:w="10" w:type="dxa"/>
         </w:tblCellMar>
-        <w:tblLook w:val="04A0" w:firstRow="1" w:lastRow="0" w:firstColumn="1" w:lastColumn="0" w:noHBand="0" w:noVBand="1"/>
+        <w:tblLook w:val="0000" w:firstRow="0" w:lastRow="0" w:firstColumn="0" w:lastColumn="0" w:noHBand="0" w:noVBand="0"/>
       </w:tblPr>
       <w:tblGrid>
         <w:gridCol w:w="2858"/>
@@ -1092,7 +1092,7 @@
     <w:sdt>
       <w:sdtPr>
         <w:alias w:val="Contenido"/>
-        <w:id w:val="680320951"/>
+        <w:id w:val="1130591093"/>
       </w:sdtPr>
       <w:sdtEndPr/>
       <w:sdtContent>
@@ -1117,7 +1117,7 @@
           <w:r>
             <w:fldChar w:fldCharType="separate"/>
           </w:r>
-          <w:hyperlink w:anchor="_Toc240215069" w:history="1">
+          <w:hyperlink w:anchor="_Toc240375310" w:history="1">
             <w:r>
               <w:rPr>
                 <w:rStyle w:val="Hipervnculo"/>
@@ -1141,7 +1141,7 @@
               <w:rPr>
                 <w:noProof/>
               </w:rPr>
-              <w:instrText xml:space="preserve"> PAGEREF _Toc240215069 \h </w:instrText>
+              <w:instrText xml:space="preserve"> PAGEREF _Toc240375310 \h </w:instrText>
             </w:r>
             <w:r>
               <w:rPr>
@@ -1180,7 +1180,7 @@
               <w:color w:val="auto"/>
             </w:rPr>
           </w:pPr>
-          <w:hyperlink w:anchor="_Toc240215070" w:history="1">
+          <w:hyperlink w:anchor="_Toc240375311" w:history="1">
             <w:r>
               <w:rPr>
                 <w:rStyle w:val="Hipervnculo"/>
@@ -1204,7 +1204,7 @@
               <w:rPr>
                 <w:noProof/>
               </w:rPr>
-              <w:instrText xml:space="preserve"> PAGEREF _Toc240215070 \h </w:instrText>
+              <w:instrText xml:space="preserve"> PAGEREF _Toc240375311 \h </w:instrText>
             </w:r>
             <w:r>
               <w:rPr>
@@ -1243,7 +1243,7 @@
               <w:color w:val="auto"/>
             </w:rPr>
           </w:pPr>
-          <w:hyperlink w:anchor="_Toc240215071" w:history="1">
+          <w:hyperlink w:anchor="_Toc240375312" w:history="1">
             <w:r>
               <w:rPr>
                 <w:rStyle w:val="Hipervnculo"/>
@@ -1267,7 +1267,7 @@
               <w:rPr>
                 <w:noProof/>
               </w:rPr>
-              <w:instrText xml:space="preserve"> PAGEREF _Toc240215071 \h </w:instrText>
+              <w:instrText xml:space="preserve"> PAGEREF _Toc240375312 \h </w:instrText>
             </w:r>
             <w:r>
               <w:rPr>
@@ -1306,7 +1306,7 @@
               <w:color w:val="auto"/>
             </w:rPr>
           </w:pPr>
-          <w:hyperlink w:anchor="_Toc240215072" w:history="1">
+          <w:hyperlink w:anchor="_Toc240375313" w:history="1">
             <w:r>
               <w:rPr>
                 <w:rStyle w:val="Hipervnculo"/>
@@ -1330,7 +1330,7 @@
               <w:rPr>
                 <w:noProof/>
               </w:rPr>
-              <w:instrText xml:space="preserve"> PAGEREF _Toc240215072 \h </w:instrText>
+              <w:instrText xml:space="preserve"> PAGEREF _Toc240375313 \h </w:instrText>
             </w:r>
             <w:r>
               <w:rPr>
@@ -1369,7 +1369,7 @@
               <w:color w:val="auto"/>
             </w:rPr>
           </w:pPr>
-          <w:hyperlink w:anchor="_Toc240215073" w:history="1">
+          <w:hyperlink w:anchor="_Toc240375314" w:history="1">
             <w:r>
               <w:rPr>
                 <w:rStyle w:val="Hipervnculo"/>
@@ -1393,7 +1393,7 @@
               <w:rPr>
                 <w:noProof/>
               </w:rPr>
-              <w:instrText xml:space="preserve"> PAGEREF _Toc240215073 \h </w:instrText>
+              <w:instrText xml:space="preserve"> PAGEREF _Toc240375314 \h </w:instrText>
             </w:r>
             <w:r>
               <w:rPr>
@@ -1432,7 +1432,7 @@
               <w:color w:val="auto"/>
             </w:rPr>
           </w:pPr>
-          <w:hyperlink w:anchor="_Toc240215074" w:history="1">
+          <w:hyperlink w:anchor="_Toc240375315" w:history="1">
             <w:r>
               <w:rPr>
                 <w:rStyle w:val="Hipervnculo"/>
@@ -1456,7 +1456,7 @@
               <w:rPr>
                 <w:noProof/>
               </w:rPr>
-              <w:instrText xml:space="preserve"> PAGEREF _Toc240215074 \h </w:instrText>
+              <w:instrText xml:space="preserve"> PAGEREF _Toc240375315 \h </w:instrText>
             </w:r>
             <w:r>
               <w:rPr>
@@ -1495,7 +1495,7 @@
               <w:color w:val="auto"/>
             </w:rPr>
           </w:pPr>
-          <w:hyperlink w:anchor="_Toc240215075" w:history="1">
+          <w:hyperlink w:anchor="_Toc240375316" w:history="1">
             <w:r>
               <w:rPr>
                 <w:rStyle w:val="Hipervnculo"/>
@@ -1519,7 +1519,7 @@
               <w:rPr>
                 <w:noProof/>
               </w:rPr>
-              <w:instrText xml:space="preserve"> PAGEREF _Toc240215075 \h </w:instrText>
+              <w:instrText xml:space="preserve"> PAGEREF _Toc240375316 \h </w:instrText>
             </w:r>
             <w:r>
               <w:rPr>
@@ -1558,7 +1558,7 @@
               <w:color w:val="auto"/>
             </w:rPr>
           </w:pPr>
-          <w:hyperlink w:anchor="_Toc240215076" w:history="1">
+          <w:hyperlink w:anchor="_Toc240375317" w:history="1">
             <w:r>
               <w:rPr>
                 <w:rStyle w:val="Hipervnculo"/>
@@ -1582,7 +1582,7 @@
               <w:rPr>
                 <w:noProof/>
               </w:rPr>
-              <w:instrText xml:space="preserve"> PAGEREF _Toc240215076 \h </w:instrText>
+              <w:instrText xml:space="preserve"> PAGEREF _Toc240375317 \h </w:instrText>
             </w:r>
             <w:r>
               <w:rPr>
@@ -1621,7 +1621,7 @@
               <w:color w:val="auto"/>
             </w:rPr>
           </w:pPr>
-          <w:hyperlink w:anchor="_Toc240215077" w:history="1">
+          <w:hyperlink w:anchor="_Toc240375318" w:history="1">
             <w:r>
               <w:rPr>
                 <w:rStyle w:val="Hipervnculo"/>
@@ -1645,7 +1645,7 @@
               <w:rPr>
                 <w:noProof/>
               </w:rPr>
-              <w:instrText xml:space="preserve"> PAGEREF _Toc240215077 \h </w:instrText>
+              <w:instrText xml:space="preserve"> PAGEREF _Toc240375318 \h </w:instrText>
             </w:r>
             <w:r>
               <w:rPr>
@@ -1684,7 +1684,7 @@
               <w:color w:val="auto"/>
             </w:rPr>
           </w:pPr>
-          <w:hyperlink w:anchor="_Toc240215078" w:history="1">
+          <w:hyperlink w:anchor="_Toc240375319" w:history="1">
             <w:r>
               <w:rPr>
                 <w:rStyle w:val="Hipervnculo"/>
@@ -1708,7 +1708,7 @@
               <w:rPr>
                 <w:noProof/>
               </w:rPr>
-              <w:instrText xml:space="preserve"> PAGEREF _Toc240215078 \h </w:instrText>
+              <w:instrText xml:space="preserve"> PAGEREF _Toc240375319 \h </w:instrText>
             </w:r>
             <w:r>
               <w:rPr>
@@ -1747,7 +1747,7 @@
               <w:color w:val="auto"/>
             </w:rPr>
           </w:pPr>
-          <w:hyperlink w:anchor="_Toc240215079" w:history="1">
+          <w:hyperlink w:anchor="_Toc240375320" w:history="1">
             <w:r>
               <w:rPr>
                 <w:rStyle w:val="Hipervnculo"/>
@@ -1771,7 +1771,7 @@
               <w:rPr>
                 <w:noProof/>
               </w:rPr>
-              <w:instrText xml:space="preserve"> PAGEREF _Toc240215079 \h </w:instrText>
+              <w:instrText xml:space="preserve"> PAGEREF _Toc240375320 \h </w:instrText>
             </w:r>
             <w:r>
               <w:rPr>
@@ -1810,7 +1810,7 @@
               <w:color w:val="auto"/>
             </w:rPr>
           </w:pPr>
-          <w:hyperlink w:anchor="_Toc240215080" w:history="1">
+          <w:hyperlink w:anchor="_Toc240375321" w:history="1">
             <w:r>
               <w:rPr>
                 <w:rStyle w:val="Hipervnculo"/>
@@ -1834,7 +1834,7 @@
               <w:rPr>
                 <w:noProof/>
               </w:rPr>
-              <w:instrText xml:space="preserve"> PAGEREF _Toc240215080 \h </w:instrText>
+              <w:instrText xml:space="preserve"> PAGEREF _Toc240375321 \h </w:instrText>
             </w:r>
             <w:r>
               <w:rPr>
@@ -1873,7 +1873,7 @@
               <w:color w:val="auto"/>
             </w:rPr>
           </w:pPr>
-          <w:hyperlink w:anchor="_Toc240215081" w:history="1">
+          <w:hyperlink w:anchor="_Toc240375322" w:history="1">
             <w:r>
               <w:rPr>
                 <w:rStyle w:val="Hipervnculo"/>
@@ -1897,7 +1897,7 @@
               <w:rPr>
                 <w:noProof/>
               </w:rPr>
-              <w:instrText xml:space="preserve"> PAGEREF _Toc240215081 \h </w:instrText>
+              <w:instrText xml:space="preserve"> PAGEREF _Toc240375322 \h </w:instrText>
             </w:r>
             <w:r>
               <w:rPr>
@@ -1936,7 +1936,7 @@
               <w:color w:val="auto"/>
             </w:rPr>
           </w:pPr>
-          <w:hyperlink w:anchor="_Toc240215082" w:history="1">
+          <w:hyperlink w:anchor="_Toc240375323" w:history="1">
             <w:r>
               <w:rPr>
                 <w:rStyle w:val="Hipervnculo"/>
@@ -1960,7 +1960,7 @@
               <w:rPr>
                 <w:noProof/>
               </w:rPr>
-              <w:instrText xml:space="preserve"> PAGEREF _Toc240215082 \h </w:instrText>
+              <w:instrText xml:space="preserve"> PAGEREF _Toc240375323 \h </w:instrText>
             </w:r>
             <w:r>
               <w:rPr>
@@ -1999,7 +1999,7 @@
               <w:color w:val="auto"/>
             </w:rPr>
           </w:pPr>
-          <w:hyperlink w:anchor="_Toc240215083" w:history="1">
+          <w:hyperlink w:anchor="_Toc240375324" w:history="1">
             <w:r>
               <w:rPr>
                 <w:rStyle w:val="Hipervnculo"/>
@@ -2023,7 +2023,7 @@
               <w:rPr>
                 <w:noProof/>
               </w:rPr>
-              <w:instrText xml:space="preserve"> PAGEREF _Toc240215083 \h </w:instrText>
+              <w:instrText xml:space="preserve"> PAGEREF _Toc240375324 \h </w:instrText>
             </w:r>
             <w:r>
               <w:rPr>
@@ -2062,7 +2062,7 @@
               <w:color w:val="auto"/>
             </w:rPr>
           </w:pPr>
-          <w:hyperlink w:anchor="_Toc240215084" w:history="1">
+          <w:hyperlink w:anchor="_Toc240375325" w:history="1">
             <w:r>
               <w:rPr>
                 <w:rStyle w:val="Hipervnculo"/>
@@ -2086,7 +2086,7 @@
               <w:rPr>
                 <w:noProof/>
               </w:rPr>
-              <w:instrText xml:space="preserve"> PAGEREF _Toc240215084 \h </w:instrText>
+              <w:instrText xml:space="preserve"> PAGEREF _Toc240375325 \h </w:instrText>
             </w:r>
             <w:r>
               <w:rPr>
@@ -2125,7 +2125,7 @@
               <w:color w:val="auto"/>
             </w:rPr>
           </w:pPr>
-          <w:hyperlink w:anchor="_Toc240215085" w:history="1">
+          <w:hyperlink w:anchor="_Toc240375326" w:history="1">
             <w:r>
               <w:rPr>
                 <w:rStyle w:val="Hipervnculo"/>
@@ -2149,7 +2149,7 @@
               <w:rPr>
                 <w:noProof/>
               </w:rPr>
-              <w:instrText xml:space="preserve"> PAGEREF _Toc240215085 \h </w:instrText>
+              <w:instrText xml:space="preserve"> PAGEREF _Toc240375326 \h </w:instrText>
             </w:r>
             <w:r>
               <w:rPr>
@@ -2188,7 +2188,7 @@
               <w:color w:val="auto"/>
             </w:rPr>
           </w:pPr>
-          <w:hyperlink w:anchor="_Toc240215086" w:history="1">
+          <w:hyperlink w:anchor="_Toc240375327" w:history="1">
             <w:r>
               <w:rPr>
                 <w:rStyle w:val="Hipervnculo"/>
@@ -2212,7 +2212,7 @@
               <w:rPr>
                 <w:noProof/>
               </w:rPr>
-              <w:instrText xml:space="preserve"> PAGEREF _Toc240215086 \h </w:instrText>
+              <w:instrText xml:space="preserve"> PAGEREF _Toc240375327 \h </w:instrText>
             </w:r>
             <w:r>
               <w:rPr>
@@ -2251,7 +2251,7 @@
               <w:color w:val="auto"/>
             </w:rPr>
           </w:pPr>
-          <w:hyperlink w:anchor="_Toc240215087" w:history="1">
+          <w:hyperlink w:anchor="_Toc240375328" w:history="1">
             <w:r>
               <w:rPr>
                 <w:rStyle w:val="Hipervnculo"/>
@@ -2275,7 +2275,7 @@
               <w:rPr>
                 <w:noProof/>
               </w:rPr>
-              <w:instrText xml:space="preserve"> PAGEREF _Toc240215087 \h </w:instrText>
+              <w:instrText xml:space="preserve"> PAGEREF _Toc240375328 \h </w:instrText>
             </w:r>
             <w:r>
               <w:rPr>
@@ -2314,7 +2314,7 @@
               <w:color w:val="auto"/>
             </w:rPr>
           </w:pPr>
-          <w:hyperlink w:anchor="_Toc240215088" w:history="1">
+          <w:hyperlink w:anchor="_Toc240375329" w:history="1">
             <w:r>
               <w:rPr>
                 <w:rStyle w:val="Hipervnculo"/>
@@ -2338,7 +2338,7 @@
               <w:rPr>
                 <w:noProof/>
               </w:rPr>
-              <w:instrText xml:space="preserve"> PAGEREF _Toc240215088 \h </w:instrText>
+              <w:instrText xml:space="preserve"> PAGEREF _Toc240375329 \h </w:instrText>
             </w:r>
             <w:r>
               <w:rPr>
@@ -2377,7 +2377,7 @@
               <w:color w:val="auto"/>
             </w:rPr>
           </w:pPr>
-          <w:hyperlink w:anchor="_Toc240215089" w:history="1">
+          <w:hyperlink w:anchor="_Toc240375330" w:history="1">
             <w:r>
               <w:rPr>
                 <w:rStyle w:val="Hipervnculo"/>
@@ -2401,7 +2401,7 @@
               <w:rPr>
                 <w:noProof/>
               </w:rPr>
-              <w:instrText xml:space="preserve"> PAGEREF _Toc240215089 \h </w:instrText>
+              <w:instrText xml:space="preserve"> PAGEREF _Toc240375330 \h </w:instrText>
             </w:r>
             <w:r>
               <w:rPr>
@@ -2440,7 +2440,7 @@
               <w:color w:val="auto"/>
             </w:rPr>
           </w:pPr>
-          <w:hyperlink w:anchor="_Toc240215090" w:history="1">
+          <w:hyperlink w:anchor="_Toc240375331" w:history="1">
             <w:r>
               <w:rPr>
                 <w:rStyle w:val="Hipervnculo"/>
@@ -2464,7 +2464,7 @@
               <w:rPr>
                 <w:noProof/>
               </w:rPr>
-              <w:instrText xml:space="preserve"> PAGEREF _Toc240215090 \h </w:instrText>
+              <w:instrText xml:space="preserve"> PAGEREF _Toc240375331 \h </w:instrText>
             </w:r>
             <w:r>
               <w:rPr>
@@ -2503,7 +2503,7 @@
               <w:color w:val="auto"/>
             </w:rPr>
           </w:pPr>
-          <w:hyperlink w:anchor="_Toc240215091" w:history="1">
+          <w:hyperlink w:anchor="_Toc240375332" w:history="1">
             <w:r>
               <w:rPr>
                 <w:rStyle w:val="Hipervnculo"/>
@@ -2527,7 +2527,7 @@
               <w:rPr>
                 <w:noProof/>
               </w:rPr>
-              <w:instrText xml:space="preserve"> PAGEREF _Toc240215091 \h </w:instrText>
+              <w:instrText xml:space="preserve"> PAGEREF _Toc240375332 \h </w:instrText>
             </w:r>
             <w:r>
               <w:rPr>
@@ -2566,7 +2566,7 @@
               <w:color w:val="auto"/>
             </w:rPr>
           </w:pPr>
-          <w:hyperlink w:anchor="_Toc240215092" w:history="1">
+          <w:hyperlink w:anchor="_Toc240375333" w:history="1">
             <w:r>
               <w:rPr>
                 <w:rStyle w:val="Hipervnculo"/>
@@ -2590,7 +2590,7 @@
               <w:rPr>
                 <w:noProof/>
               </w:rPr>
-              <w:instrText xml:space="preserve"> PAGEREF _Toc240215092 \h </w:instrText>
+              <w:instrText xml:space="preserve"> PAGEREF _Toc240375333 \h </w:instrText>
             </w:r>
             <w:r>
               <w:rPr>
@@ -2629,7 +2629,7 @@
               <w:color w:val="auto"/>
             </w:rPr>
           </w:pPr>
-          <w:hyperlink w:anchor="_Toc240215093" w:history="1">
+          <w:hyperlink w:anchor="_Toc240375334" w:history="1">
             <w:r>
               <w:rPr>
                 <w:rStyle w:val="Hipervnculo"/>
@@ -2653,7 +2653,7 @@
               <w:rPr>
                 <w:noProof/>
               </w:rPr>
-              <w:instrText xml:space="preserve"> PAGEREF _Toc240215093 \h </w:instrText>
+              <w:instrText xml:space="preserve"> PAGEREF _Toc240375334 \h </w:instrText>
             </w:r>
             <w:r>
               <w:rPr>
@@ -2692,7 +2692,7 @@
               <w:color w:val="auto"/>
             </w:rPr>
           </w:pPr>
-          <w:hyperlink w:anchor="_Toc240215094" w:history="1">
+          <w:hyperlink w:anchor="_Toc240375335" w:history="1">
             <w:r>
               <w:rPr>
                 <w:rStyle w:val="Hipervnculo"/>
@@ -2716,7 +2716,7 @@
               <w:rPr>
                 <w:noProof/>
               </w:rPr>
-              <w:instrText xml:space="preserve"> PAGEREF _Toc240215094 \h </w:instrText>
+              <w:instrText xml:space="preserve"> PAGEREF _Toc240375335 \h </w:instrText>
             </w:r>
             <w:r>
               <w:rPr>
@@ -2755,7 +2755,7 @@
               <w:color w:val="auto"/>
             </w:rPr>
           </w:pPr>
-          <w:hyperlink w:anchor="_Toc240215095" w:history="1">
+          <w:hyperlink w:anchor="_Toc240375336" w:history="1">
             <w:r>
               <w:rPr>
                 <w:rStyle w:val="Hipervnculo"/>
@@ -2779,7 +2779,7 @@
               <w:rPr>
                 <w:noProof/>
               </w:rPr>
-              <w:instrText xml:space="preserve"> PAGEREF _Toc240215095 \h </w:instrText>
+              <w:instrText xml:space="preserve"> PAGEREF _Toc240375336 \h </w:instrText>
             </w:r>
             <w:r>
               <w:rPr>
@@ -2818,7 +2818,7 @@
               <w:color w:val="auto"/>
             </w:rPr>
           </w:pPr>
-          <w:hyperlink w:anchor="_Toc240215096" w:history="1">
+          <w:hyperlink w:anchor="_Toc240375337" w:history="1">
             <w:r>
               <w:rPr>
                 <w:rStyle w:val="Hipervnculo"/>
@@ -2842,7 +2842,7 @@
               <w:rPr>
                 <w:noProof/>
               </w:rPr>
-              <w:instrText xml:space="preserve"> PAGEREF _Toc240215096 \h </w:instrText>
+              <w:instrText xml:space="preserve"> PAGEREF _Toc240375337 \h </w:instrText>
             </w:r>
             <w:r>
               <w:rPr>
@@ -2881,7 +2881,7 @@
               <w:color w:val="auto"/>
             </w:rPr>
           </w:pPr>
-          <w:hyperlink w:anchor="_Toc240215097" w:history="1">
+          <w:hyperlink w:anchor="_Toc240375338" w:history="1">
             <w:r>
               <w:rPr>
                 <w:rStyle w:val="Hipervnculo"/>
@@ -2905,7 +2905,7 @@
               <w:rPr>
                 <w:noProof/>
               </w:rPr>
-              <w:instrText xml:space="preserve"> PAGEREF _Toc240215097 \h </w:instrText>
+              <w:instrText xml:space="preserve"> PAGEREF _Toc240375338 \h </w:instrText>
             </w:r>
             <w:r>
               <w:rPr>
@@ -2944,7 +2944,7 @@
               <w:color w:val="auto"/>
             </w:rPr>
           </w:pPr>
-          <w:hyperlink w:anchor="_Toc240215098" w:history="1">
+          <w:hyperlink w:anchor="_Toc240375339" w:history="1">
             <w:r>
               <w:rPr>
                 <w:rStyle w:val="Hipervnculo"/>
@@ -2968,7 +2968,7 @@
               <w:rPr>
                 <w:noProof/>
               </w:rPr>
-              <w:instrText xml:space="preserve"> PAGEREF _Toc240215098 \h </w:instrText>
+              <w:instrText xml:space="preserve"> PAGEREF _Toc240375339 \h </w:instrText>
             </w:r>
             <w:r>
               <w:rPr>
@@ -3007,7 +3007,7 @@
               <w:color w:val="auto"/>
             </w:rPr>
           </w:pPr>
-          <w:hyperlink w:anchor="_Toc240215099" w:history="1">
+          <w:hyperlink w:anchor="_Toc240375340" w:history="1">
             <w:r>
               <w:rPr>
                 <w:rStyle w:val="Hipervnculo"/>
@@ -3031,7 +3031,7 @@
               <w:rPr>
                 <w:noProof/>
               </w:rPr>
-              <w:instrText xml:space="preserve"> PAGEREF _Toc240215099 \h </w:instrText>
+              <w:instrText xml:space="preserve"> PAGEREF _Toc240375340 \h </w:instrText>
             </w:r>
             <w:r>
               <w:rPr>
@@ -3070,7 +3070,7 @@
               <w:color w:val="auto"/>
             </w:rPr>
           </w:pPr>
-          <w:hyperlink w:anchor="_Toc240215100" w:history="1">
+          <w:hyperlink w:anchor="_Toc240375341" w:history="1">
             <w:r>
               <w:rPr>
                 <w:rStyle w:val="Hipervnculo"/>
@@ -3094,7 +3094,7 @@
               <w:rPr>
                 <w:noProof/>
               </w:rPr>
-              <w:instrText xml:space="preserve"> PAGEREF _Toc240215100 \h </w:instrText>
+              <w:instrText xml:space="preserve"> PAGEREF _Toc240375341 \h </w:instrText>
             </w:r>
             <w:r>
               <w:rPr>
@@ -3133,7 +3133,7 @@
               <w:color w:val="auto"/>
             </w:rPr>
           </w:pPr>
-          <w:hyperlink w:anchor="_Toc240215101" w:history="1">
+          <w:hyperlink w:anchor="_Toc240375342" w:history="1">
             <w:r>
               <w:rPr>
                 <w:rStyle w:val="Hipervnculo"/>
@@ -3157,7 +3157,7 @@
               <w:rPr>
                 <w:noProof/>
               </w:rPr>
-              <w:instrText xml:space="preserve"> PAGEREF _Toc240215101 \h </w:instrText>
+              <w:instrText xml:space="preserve"> PAGEREF _Toc240375342 \h </w:instrText>
             </w:r>
             <w:r>
               <w:rPr>
@@ -3196,7 +3196,7 @@
               <w:color w:val="auto"/>
             </w:rPr>
           </w:pPr>
-          <w:hyperlink w:anchor="_Toc240215102" w:history="1">
+          <w:hyperlink w:anchor="_Toc240375343" w:history="1">
             <w:r>
               <w:rPr>
                 <w:rStyle w:val="Hipervnculo"/>
@@ -3220,7 +3220,7 @@
               <w:rPr>
                 <w:noProof/>
               </w:rPr>
-              <w:instrText xml:space="preserve"> PAGEREF _Toc240215102 \h </w:instrText>
+              <w:instrText xml:space="preserve"> PAGEREF _Toc240375343 \h </w:instrText>
             </w:r>
             <w:r>
               <w:rPr>
@@ -3259,7 +3259,7 @@
               <w:color w:val="auto"/>
             </w:rPr>
           </w:pPr>
-          <w:hyperlink w:anchor="_Toc240215103" w:history="1">
+          <w:hyperlink w:anchor="_Toc240375344" w:history="1">
             <w:r>
               <w:rPr>
                 <w:rStyle w:val="Hipervnculo"/>
@@ -3283,7 +3283,7 @@
               <w:rPr>
                 <w:noProof/>
               </w:rPr>
-              <w:instrText xml:space="preserve"> PAGEREF _Toc240215103 \h </w:instrText>
+              <w:instrText xml:space="preserve"> PAGEREF _Toc240375344 \h </w:instrText>
             </w:r>
             <w:r>
               <w:rPr>
@@ -3322,7 +3322,7 @@
               <w:color w:val="auto"/>
             </w:rPr>
           </w:pPr>
-          <w:hyperlink w:anchor="_Toc240215104" w:history="1">
+          <w:hyperlink w:anchor="_Toc240375345" w:history="1">
             <w:r>
               <w:rPr>
                 <w:rStyle w:val="Hipervnculo"/>
@@ -3346,7 +3346,7 @@
               <w:rPr>
                 <w:noProof/>
               </w:rPr>
-              <w:instrText xml:space="preserve"> PAGEREF _Toc240215104 \h </w:instrText>
+              <w:instrText xml:space="preserve"> PAGEREF _Toc240375345 \h </w:instrText>
             </w:r>
             <w:r>
               <w:rPr>
@@ -3385,7 +3385,7 @@
               <w:color w:val="auto"/>
             </w:rPr>
           </w:pPr>
-          <w:hyperlink w:anchor="_Toc240215105" w:history="1">
+          <w:hyperlink w:anchor="_Toc240375346" w:history="1">
             <w:r>
               <w:rPr>
                 <w:rStyle w:val="Hipervnculo"/>
@@ -3409,7 +3409,7 @@
               <w:rPr>
                 <w:noProof/>
               </w:rPr>
-              <w:instrText xml:space="preserve"> PAGEREF _Toc240215105 \h </w:instrText>
+              <w:instrText xml:space="preserve"> PAGEREF _Toc240375346 \h </w:instrText>
             </w:r>
             <w:r>
               <w:rPr>
@@ -3448,7 +3448,7 @@
               <w:color w:val="auto"/>
             </w:rPr>
           </w:pPr>
-          <w:hyperlink w:anchor="_Toc240215106" w:history="1">
+          <w:hyperlink w:anchor="_Toc240375347" w:history="1">
             <w:r>
               <w:rPr>
                 <w:rStyle w:val="Hipervnculo"/>
@@ -3472,7 +3472,7 @@
               <w:rPr>
                 <w:noProof/>
               </w:rPr>
-              <w:instrText xml:space="preserve"> PAGEREF _Toc240215106 \h </w:instrText>
+              <w:instrText xml:space="preserve"> PAGEREF _Toc240375347 \h </w:instrText>
             </w:r>
             <w:r>
               <w:rPr>
@@ -3511,7 +3511,7 @@
               <w:color w:val="auto"/>
             </w:rPr>
           </w:pPr>
-          <w:hyperlink w:anchor="_Toc240215107" w:history="1">
+          <w:hyperlink w:anchor="_Toc240375348" w:history="1">
             <w:r>
               <w:rPr>
                 <w:rStyle w:val="Hipervnculo"/>
@@ -3535,7 +3535,7 @@
               <w:rPr>
                 <w:noProof/>
               </w:rPr>
-              <w:instrText xml:space="preserve"> PAGEREF _Toc240215107 \h </w:instrText>
+              <w:instrText xml:space="preserve"> PAGEREF _Toc240375348 \h </w:instrText>
             </w:r>
             <w:r>
               <w:rPr>
@@ -3574,7 +3574,7 @@
               <w:color w:val="auto"/>
             </w:rPr>
           </w:pPr>
-          <w:hyperlink w:anchor="_Toc240215108" w:history="1">
+          <w:hyperlink w:anchor="_Toc240375349" w:history="1">
             <w:r>
               <w:rPr>
                 <w:rStyle w:val="Hipervnculo"/>
@@ -3598,7 +3598,7 @@
               <w:rPr>
                 <w:noProof/>
               </w:rPr>
-              <w:instrText xml:space="preserve"> PAGEREF _Toc240215108 \h </w:instrText>
+              <w:instrText xml:space="preserve"> PAGEREF _Toc240375349 \h </w:instrText>
             </w:r>
             <w:r>
               <w:rPr>
@@ -3637,7 +3637,7 @@
               <w:color w:val="auto"/>
             </w:rPr>
           </w:pPr>
-          <w:hyperlink w:anchor="_Toc240215109" w:history="1">
+          <w:hyperlink w:anchor="_Toc240375350" w:history="1">
             <w:r>
               <w:rPr>
                 <w:rStyle w:val="Hipervnculo"/>
@@ -3661,7 +3661,7 @@
               <w:rPr>
                 <w:noProof/>
               </w:rPr>
-              <w:instrText xml:space="preserve"> PAGEREF _Toc240215109 \h </w:instrText>
+              <w:instrText xml:space="preserve"> PAGEREF _Toc240375350 \h </w:instrText>
             </w:r>
             <w:r>
               <w:rPr>
@@ -3700,7 +3700,7 @@
               <w:color w:val="auto"/>
             </w:rPr>
           </w:pPr>
-          <w:hyperlink w:anchor="_Toc240215110" w:history="1">
+          <w:hyperlink w:anchor="_Toc240375351" w:history="1">
             <w:r>
               <w:rPr>
                 <w:rStyle w:val="Hipervnculo"/>
@@ -3724,7 +3724,7 @@
               <w:rPr>
                 <w:noProof/>
               </w:rPr>
-              <w:instrText xml:space="preserve"> PAGEREF _Toc240215110 \h </w:instrText>
+              <w:instrText xml:space="preserve"> PAGEREF _Toc240375351 \h </w:instrText>
             </w:r>
             <w:r>
               <w:rPr>
@@ -3763,7 +3763,7 @@
               <w:color w:val="auto"/>
             </w:rPr>
           </w:pPr>
-          <w:hyperlink w:anchor="_Toc240215111" w:history="1">
+          <w:hyperlink w:anchor="_Toc240375352" w:history="1">
             <w:r>
               <w:rPr>
                 <w:rStyle w:val="Hipervnculo"/>
@@ -3787,7 +3787,7 @@
               <w:rPr>
                 <w:noProof/>
               </w:rPr>
-              <w:instrText xml:space="preserve"> PAGEREF _Toc240215111 \h </w:instrText>
+              <w:instrText xml:space="preserve"> PAGEREF _Toc240375352 \h </w:instrText>
             </w:r>
             <w:r>
               <w:rPr>
@@ -3826,7 +3826,7 @@
               <w:color w:val="auto"/>
             </w:rPr>
           </w:pPr>
-          <w:hyperlink w:anchor="_Toc240215112" w:history="1">
+          <w:hyperlink w:anchor="_Toc240375353" w:history="1">
             <w:r>
               <w:rPr>
                 <w:rStyle w:val="Hipervnculo"/>
@@ -3850,7 +3850,7 @@
               <w:rPr>
                 <w:noProof/>
               </w:rPr>
-              <w:instrText xml:space="preserve"> PAGEREF _Toc240215112 \h </w:instrText>
+              <w:instrText xml:space="preserve"> PAGEREF _Toc240375353 \h </w:instrText>
             </w:r>
             <w:r>
               <w:rPr>
@@ -3889,7 +3889,7 @@
               <w:color w:val="auto"/>
             </w:rPr>
           </w:pPr>
-          <w:hyperlink w:anchor="_Toc240215113" w:history="1">
+          <w:hyperlink w:anchor="_Toc240375354" w:history="1">
             <w:r>
               <w:rPr>
                 <w:rStyle w:val="Hipervnculo"/>
@@ -3913,7 +3913,7 @@
               <w:rPr>
                 <w:noProof/>
               </w:rPr>
-              <w:instrText xml:space="preserve"> PAGEREF _Toc240215113 \h </w:instrText>
+              <w:instrText xml:space="preserve"> PAGEREF _Toc240375354 \h </w:instrText>
             </w:r>
             <w:r>
               <w:rPr>
@@ -3952,7 +3952,7 @@
               <w:color w:val="auto"/>
             </w:rPr>
           </w:pPr>
-          <w:hyperlink w:anchor="_Toc240215114" w:history="1">
+          <w:hyperlink w:anchor="_Toc240375355" w:history="1">
             <w:r>
               <w:rPr>
                 <w:rStyle w:val="Hipervnculo"/>
@@ -3976,7 +3976,7 @@
               <w:rPr>
                 <w:noProof/>
               </w:rPr>
-              <w:instrText xml:space="preserve"> PAGEREF _Toc240215114 \h </w:instrText>
+              <w:instrText xml:space="preserve"> PAGEREF _Toc240375355 \h </w:instrText>
             </w:r>
             <w:r>
               <w:rPr>
@@ -4015,7 +4015,7 @@
               <w:color w:val="auto"/>
             </w:rPr>
           </w:pPr>
-          <w:hyperlink w:anchor="_Toc240215115" w:history="1">
+          <w:hyperlink w:anchor="_Toc240375356" w:history="1">
             <w:r>
               <w:rPr>
                 <w:rStyle w:val="Hipervnculo"/>
@@ -4039,7 +4039,7 @@
               <w:rPr>
                 <w:noProof/>
               </w:rPr>
-              <w:instrText xml:space="preserve"> PAGEREF _Toc240215115 \h </w:instrText>
+              <w:instrText xml:space="preserve"> PAGEREF _Toc240375356 \h </w:instrText>
             </w:r>
             <w:r>
               <w:rPr>
@@ -4078,7 +4078,7 @@
               <w:color w:val="auto"/>
             </w:rPr>
           </w:pPr>
-          <w:hyperlink w:anchor="_Toc240215116" w:history="1">
+          <w:hyperlink w:anchor="_Toc240375357" w:history="1">
             <w:r>
               <w:rPr>
                 <w:rStyle w:val="Hipervnculo"/>
@@ -4102,7 +4102,7 @@
               <w:rPr>
                 <w:noProof/>
               </w:rPr>
-              <w:instrText xml:space="preserve"> PAGEREF _Toc240215116 \h </w:instrText>
+              <w:instrText xml:space="preserve"> PAGEREF _Toc240375357 \h </w:instrText>
             </w:r>
             <w:r>
               <w:rPr>
@@ -4141,7 +4141,7 @@
               <w:color w:val="auto"/>
             </w:rPr>
           </w:pPr>
-          <w:hyperlink w:anchor="_Toc240215117" w:history="1">
+          <w:hyperlink w:anchor="_Toc240375358" w:history="1">
             <w:r>
               <w:rPr>
                 <w:rStyle w:val="Hipervnculo"/>
@@ -4165,7 +4165,7 @@
               <w:rPr>
                 <w:noProof/>
               </w:rPr>
-              <w:instrText xml:space="preserve"> PAGEREF _Toc240215117 \h </w:instrText>
+              <w:instrText xml:space="preserve"> PAGEREF _Toc240375358 \h </w:instrText>
             </w:r>
             <w:r>
               <w:rPr>
@@ -4204,7 +4204,7 @@
               <w:color w:val="auto"/>
             </w:rPr>
           </w:pPr>
-          <w:hyperlink w:anchor="_Toc240215118" w:history="1">
+          <w:hyperlink w:anchor="_Toc240375359" w:history="1">
             <w:r>
               <w:rPr>
                 <w:rStyle w:val="Hipervnculo"/>
@@ -4228,7 +4228,7 @@
               <w:rPr>
                 <w:noProof/>
               </w:rPr>
-              <w:instrText xml:space="preserve"> PAGEREF _Toc240215118 \h </w:instrText>
+              <w:instrText xml:space="preserve"> PAGEREF _Toc240375359 \h </w:instrText>
             </w:r>
             <w:r>
               <w:rPr>
@@ -4267,7 +4267,7 @@
               <w:color w:val="auto"/>
             </w:rPr>
           </w:pPr>
-          <w:hyperlink w:anchor="_Toc240215119" w:history="1">
+          <w:hyperlink w:anchor="_Toc240375360" w:history="1">
             <w:r>
               <w:rPr>
                 <w:rStyle w:val="Hipervnculo"/>
@@ -4291,7 +4291,7 @@
               <w:rPr>
                 <w:noProof/>
               </w:rPr>
-              <w:instrText xml:space="preserve"> PAGEREF _Toc240215119 \h </w:instrText>
+              <w:instrText xml:space="preserve"> PAGEREF _Toc240375360 \h </w:instrText>
             </w:r>
             <w:r>
               <w:rPr>
@@ -4330,7 +4330,7 @@
               <w:color w:val="auto"/>
             </w:rPr>
           </w:pPr>
-          <w:hyperlink w:anchor="_Toc240215120" w:history="1">
+          <w:hyperlink w:anchor="_Toc240375361" w:history="1">
             <w:r>
               <w:rPr>
                 <w:rStyle w:val="Hipervnculo"/>
@@ -4354,7 +4354,7 @@
               <w:rPr>
                 <w:noProof/>
               </w:rPr>
-              <w:instrText xml:space="preserve"> PAGEREF _Toc240215120 \h </w:instrText>
+              <w:instrText xml:space="preserve"> PAGEREF _Toc240375361 \h </w:instrText>
             </w:r>
             <w:r>
               <w:rPr>
@@ -4393,7 +4393,7 @@
               <w:color w:val="auto"/>
             </w:rPr>
           </w:pPr>
-          <w:hyperlink w:anchor="_Toc240215121" w:history="1">
+          <w:hyperlink w:anchor="_Toc240375362" w:history="1">
             <w:r>
               <w:rPr>
                 <w:rStyle w:val="Hipervnculo"/>
@@ -4417,7 +4417,7 @@
               <w:rPr>
                 <w:noProof/>
               </w:rPr>
-              <w:instrText xml:space="preserve"> PAGEREF _Toc240215121 \h </w:instrText>
+              <w:instrText xml:space="preserve"> PAGEREF _Toc240375362 \h </w:instrText>
             </w:r>
             <w:r>
               <w:rPr>
@@ -4456,7 +4456,7 @@
               <w:color w:val="auto"/>
             </w:rPr>
           </w:pPr>
-          <w:hyperlink w:anchor="_Toc240215122" w:history="1">
+          <w:hyperlink w:anchor="_Toc240375363" w:history="1">
             <w:r>
               <w:rPr>
                 <w:rStyle w:val="Hipervnculo"/>
@@ -4480,7 +4480,7 @@
               <w:rPr>
                 <w:noProof/>
               </w:rPr>
-              <w:instrText xml:space="preserve"> PAGEREF _Toc240215122 \h </w:instrText>
+              <w:instrText xml:space="preserve"> PAGEREF _Toc240375363 \h </w:instrText>
             </w:r>
             <w:r>
               <w:rPr>
@@ -4523,7 +4523,7 @@
       <w:pPr>
         <w:pStyle w:val="Ttulo1"/>
       </w:pPr>
-      <w:bookmarkStart w:id="0" w:name="_Toc240215069"/>
+      <w:bookmarkStart w:id="0" w:name="_Toc240375310"/>
       <w:r>
         <w:lastRenderedPageBreak/>
         <w:t>1. Descripción de la propuesta</w:t>
@@ -4534,7 +4534,7 @@
       <w:pPr>
         <w:pStyle w:val="Ttulo2"/>
       </w:pPr>
-      <w:bookmarkStart w:id="1" w:name="_Toc240215070"/>
+      <w:bookmarkStart w:id="1" w:name="_Toc240375311"/>
       <w:r>
         <w:t>1.1 Objetivo del Proyecto</w:t>
       </w:r>
@@ -4546,10 +4546,10 @@
         <w:jc w:val="both"/>
       </w:pPr>
       <w:r>
-        <w:t xml:space="preserve">El propósito de este proyecto es desarrollar de forma colaborativa una solución de software real —BiblioTech UTP, un sistema web para la gestión de una biblioteca universitaria— aplicando durante todo su ciclo de trabajo un sistema de control de versiones </w:t>
-      </w:r>
-      <w:r>
-        <w:t>distribuido: Git, con repositorio remoto alojado en GitHub.</w:t>
+        <w:t>El propósito de este proyecto es desarrollar de forma colaborativa una solución de software real —BiblioTech UTP, un sistema web para la gestión de una biblioteca universitaria— aplicando durante tod</w:t>
+      </w:r>
+      <w:r>
+        <w:t>o su ciclo de trabajo un sistema de control de versiones distribuido: Git, con repositorio remoto alojado en GitHub.</w:t>
       </w:r>
     </w:p>
     <w:p>
@@ -4558,10 +4558,13 @@
         <w:jc w:val="both"/>
       </w:pPr>
       <w:r>
-        <w:t>El objetivo no se limita a entregar una aplicación que funcione. Lo que se busca demostrar es el dominio del ciclo completo de control de versiones: la gestión de repositorios locales y remotos, l</w:t>
-      </w:r>
-      <w:r>
-        <w:t>a creación y administración de ramas, la elaboración de commits atómicos con mensajes descriptivos, la integración de código mediante fusiones, la resolución de conflictos reales y la gestión de releases mediante etiquetas.</w:t>
+        <w:t>El objetivo no se limita a entregar una aplicación que funcione. Lo que se busca demostrar es el dominio del ciclo completo de control de v</w:t>
+      </w:r>
+      <w:r>
+        <w:t>ersiones: la gestión de repositorios locales y remotos, la creación y administración de ramas, la elaboración de commits atómicos con mensajes descriptivos, la integración de código mediante fusiones, la resolución de conflictos reales y la gestión de rele</w:t>
+      </w:r>
+      <w:r>
+        <w:t>ases mediante etiquetas.</w:t>
       </w:r>
     </w:p>
     <w:p>
@@ -4570,20 +4573,17 @@
         <w:jc w:val="both"/>
       </w:pPr>
       <w:r>
-        <w:t xml:space="preserve">La solución permite administrar </w:t>
-      </w:r>
-      <w:r>
-        <w:t>el catálogo de libros, registrar a los socios de la biblioteca, controlar los préstamos y devoluciones con sus reglas de negocio, y consultar indicadores de gestión en un tablero de reportes. El trabajo se repartió en cuatro módulos independientes, uno por</w:t>
-      </w:r>
-      <w:r>
-        <w:t xml:space="preserve"> integrante, precisamente para forzar el desarrollo en paralelo y poner a prueba el flujo colaborativo con Git.</w:t>
+        <w:t>La solución permite administrar el catálogo de libros, registrar a los socios de la biblioteca, controlar los préstamos y devoluciones con sus reglas de negocio, y consultar indicadores de gestión en un tablero de reportes. El trab</w:t>
+      </w:r>
+      <w:r>
+        <w:t>ajo se repartió en cuatro módulos independientes, uno por integrante, precisamente para forzar el desarrollo en paralelo y poner a prueba el flujo colaborativo con Git.</w:t>
       </w:r>
     </w:p>
     <w:p>
       <w:pPr>
         <w:pStyle w:val="Ttulo2"/>
       </w:pPr>
-      <w:bookmarkStart w:id="2" w:name="_Toc240215071"/>
+      <w:bookmarkStart w:id="2" w:name="_Toc240375312"/>
       <w:r>
         <w:t>1.2 Antecedentes y problemática</w:t>
       </w:r>
@@ -4595,13 +4595,13 @@
         <w:jc w:val="both"/>
       </w:pPr>
       <w:r>
-        <w:t>La biblioteca de la sede lleva el control de préstamos en cuadernos físicos y en una hoja de cálculo que circula</w:t>
-      </w:r>
-      <w:r>
-        <w:t xml:space="preserve"> por correo electrónico. Cuando la coordinación encargó a un grupo de practicantes automatizar ese proceso, el desarrollo se realizó sin ningún sistema de control de versiones: cada practicante trabajaba sobre una copia local del proyecto y los archivos se</w:t>
-      </w:r>
-      <w:r>
-        <w:t xml:space="preserve"> intercambiaban por WhatsApp, correo y memorias USB.</w:t>
+        <w:t xml:space="preserve">La biblioteca de la sede lleva el control de préstamos </w:t>
+      </w:r>
+      <w:r>
+        <w:t>en cuadernos físicos y en una hoja de cálculo que circula por correo electrónico. Cuando la coordinación encargó a un grupo de practicantes automatizar ese proceso, el desarrollo se realizó sin ningún sistema de control de versiones: cada practicante traba</w:t>
+      </w:r>
+      <w:r>
+        <w:t>jaba sobre una copia local del proyecto y los archivos se intercambiaban por WhatsApp, correo y memorias USB.</w:t>
       </w:r>
     </w:p>
     <w:p>
@@ -4704,7 +4704,7 @@
       <w:pPr>
         <w:pStyle w:val="Ttulo2"/>
       </w:pPr>
-      <w:bookmarkStart w:id="3" w:name="_Toc240215072"/>
+      <w:bookmarkStart w:id="3" w:name="_Toc240375313"/>
       <w:r>
         <w:t>1.3 Situación actual (As Is)</w:t>
       </w:r>
@@ -4732,7 +4732,7 @@
           <w:noProof/>
         </w:rPr>
         <w:drawing>
-          <wp:inline distT="0" distB="0" distL="0" distR="0" wp14:anchorId="1C3499B1" wp14:editId="28F8DA3E">
+          <wp:inline distT="0" distB="0" distL="0" distR="0" wp14:anchorId="33BE6B33" wp14:editId="2B2361A4">
             <wp:extent cx="5715000" cy="3314700"/>
             <wp:effectExtent l="0" t="0" r="0" b="0"/>
             <wp:docPr id="1" name="Figura 1. Situación actual (As Is): trabajo sin control de versiones." descr="Figura 1. Situación actual (As Is): trabajo sin control de versiones." title="Figura 1. Situación actual (As Is): trabajo sin control de versiones."/>
@@ -4791,7 +4791,7 @@
       <w:pPr>
         <w:pStyle w:val="Ttulo2"/>
       </w:pPr>
-      <w:bookmarkStart w:id="4" w:name="_Toc240215073"/>
+      <w:bookmarkStart w:id="4" w:name="_Toc240375314"/>
       <w:r>
         <w:t>1.4 Situación propuesta (To Be)</w:t>
       </w:r>
@@ -4820,7 +4820,7 @@
         </w:rPr>
         <w:lastRenderedPageBreak/>
         <w:drawing>
-          <wp:inline distT="0" distB="0" distL="0" distR="0" wp14:anchorId="6DD9462D" wp14:editId="43661B64">
+          <wp:inline distT="0" distB="0" distL="0" distR="0" wp14:anchorId="07658974" wp14:editId="5D56D572">
             <wp:extent cx="5715000" cy="3209925"/>
             <wp:effectExtent l="0" t="0" r="0" b="0"/>
             <wp:docPr id="2" name="Figura 2. Situación propuesta (To Be): flujo colaborativo con Git y GitHub." descr="Figura 2. Situación propuesta (To Be): flujo colaborativo con Git y GitHub." title="Figura 2. Situación propuesta (To Be): flujo colaborativo con Git y GitHub."/>
@@ -4891,7 +4891,7 @@
       <w:pPr>
         <w:pStyle w:val="Ttulo2"/>
       </w:pPr>
-      <w:bookmarkStart w:id="5" w:name="_Toc240215074"/>
+      <w:bookmarkStart w:id="5" w:name="_Toc240375315"/>
       <w:r>
         <w:t>1.5 Arquitectura</w:t>
       </w:r>
@@ -4919,7 +4919,7 @@
           <w:noProof/>
         </w:rPr>
         <w:drawing>
-          <wp:inline distT="0" distB="0" distL="0" distR="0" wp14:anchorId="3F35ACA9" wp14:editId="092DA75D">
+          <wp:inline distT="0" distB="0" distL="0" distR="0" wp14:anchorId="674759FE" wp14:editId="37544E79">
             <wp:extent cx="5715000" cy="2752725"/>
             <wp:effectExtent l="0" t="0" r="0" b="0"/>
             <wp:docPr id="3" name="Figura 3. Arquitectura de la solución BiblioTech UTP." descr="Figura 3. Arquitectura de la solución BiblioTech UTP." title="Figura 3. Arquitectura de la solución BiblioTech UTP."/>
@@ -5001,7 +5001,7 @@
           <w:left w:w="10" w:type="dxa"/>
           <w:right w:w="10" w:type="dxa"/>
         </w:tblCellMar>
-        <w:tblLook w:val="04A0" w:firstRow="1" w:lastRow="0" w:firstColumn="1" w:lastColumn="0" w:noHBand="0" w:noVBand="1"/>
+        <w:tblLook w:val="0000" w:firstRow="0" w:lastRow="0" w:firstColumn="0" w:lastColumn="0" w:noHBand="0" w:noVBand="0"/>
       </w:tblPr>
       <w:tblGrid>
         <w:gridCol w:w="1700"/>
@@ -6647,7 +6647,7 @@
       <w:pPr>
         <w:pStyle w:val="Ttulo2"/>
       </w:pPr>
-      <w:bookmarkStart w:id="6" w:name="_Toc240215075"/>
+      <w:bookmarkStart w:id="6" w:name="_Toc240375316"/>
       <w:r>
         <w:t>1.6 Plan de trabajo</w:t>
       </w:r>
@@ -6677,7 +6677,7 @@
           <w:left w:w="10" w:type="dxa"/>
           <w:right w:w="10" w:type="dxa"/>
         </w:tblCellMar>
-        <w:tblLook w:val="04A0" w:firstRow="1" w:lastRow="0" w:firstColumn="1" w:lastColumn="0" w:noHBand="0" w:noVBand="1"/>
+        <w:tblLook w:val="0000" w:firstRow="0" w:lastRow="0" w:firstColumn="0" w:lastColumn="0" w:noHBand="0" w:noVBand="0"/>
       </w:tblPr>
       <w:tblGrid>
         <w:gridCol w:w="600"/>
@@ -7650,7 +7650,7 @@
       <w:pPr>
         <w:pStyle w:val="Ttulo2"/>
       </w:pPr>
-      <w:bookmarkStart w:id="7" w:name="_Toc240215076"/>
+      <w:bookmarkStart w:id="7" w:name="_Toc240375317"/>
       <w:r>
         <w:t>1.7 Riesgos</w:t>
       </w:r>
@@ -7683,7 +7683,7 @@
           <w:left w:w="10" w:type="dxa"/>
           <w:right w:w="10" w:type="dxa"/>
         </w:tblCellMar>
-        <w:tblLook w:val="04A0" w:firstRow="1" w:lastRow="0" w:firstColumn="1" w:lastColumn="0" w:noHBand="0" w:noVBand="1"/>
+        <w:tblLook w:val="0000" w:firstRow="0" w:lastRow="0" w:firstColumn="0" w:lastColumn="0" w:noHBand="0" w:noVBand="0"/>
       </w:tblPr>
       <w:tblGrid>
         <w:gridCol w:w="2500"/>
@@ -8922,7 +8922,7 @@
       <w:pPr>
         <w:pStyle w:val="Ttulo1"/>
       </w:pPr>
-      <w:bookmarkStart w:id="8" w:name="_Toc240215077"/>
+      <w:bookmarkStart w:id="8" w:name="_Toc240375318"/>
       <w:r>
         <w:lastRenderedPageBreak/>
         <w:t>2. Proce</w:t>
@@ -8936,7 +8936,7 @@
       <w:pPr>
         <w:pStyle w:val="Ttulo2"/>
       </w:pPr>
-      <w:bookmarkStart w:id="9" w:name="_Toc240215078"/>
+      <w:bookmarkStart w:id="9" w:name="_Toc240375319"/>
       <w:r>
         <w:t>2.1 Configuración Inicial del Repositorio</w:t>
       </w:r>
@@ -8946,7 +8946,7 @@
       <w:pPr>
         <w:pStyle w:val="Ttulo3"/>
       </w:pPr>
-      <w:bookmarkStart w:id="10" w:name="_Toc240215079"/>
+      <w:bookmarkStart w:id="10" w:name="_Toc240375320"/>
       <w:r>
         <w:t>a) Pasos realizados para crear el repositorio en GitHub</w:t>
       </w:r>
@@ -9040,7 +9040,7 @@
       <w:pPr>
         <w:pStyle w:val="Ttulo3"/>
       </w:pPr>
-      <w:bookmarkStart w:id="11" w:name="_Toc240215080"/>
+      <w:bookmarkStart w:id="11" w:name="_Toc240375321"/>
       <w:r>
         <w:t xml:space="preserve">b) </w:t>
       </w:r>
@@ -9077,7 +9077,7 @@
       <w:pPr>
         <w:pStyle w:val="Ttulo3"/>
       </w:pPr>
-      <w:bookmarkStart w:id="12" w:name="_Toc240215081"/>
+      <w:bookmarkStart w:id="12" w:name="_Toc240375322"/>
       <w:r>
         <w:t>c) Configuración del entorno local</w:t>
       </w:r>
@@ -9553,7 +9553,7 @@
       <w:pPr>
         <w:pStyle w:val="Ttulo3"/>
       </w:pPr>
-      <w:bookmarkStart w:id="13" w:name="_Toc240215082"/>
+      <w:bookmarkStart w:id="13" w:name="_Toc240375323"/>
       <w:r>
         <w:t>d) Configuración de las ramas principal y de trabajo</w:t>
       </w:r>
@@ -9715,7 +9715,7 @@
       <w:pPr>
         <w:pStyle w:val="Ttulo2"/>
       </w:pPr>
-      <w:bookmarkStart w:id="14" w:name="_Toc240215083"/>
+      <w:bookmarkStart w:id="14" w:name="_Toc240375324"/>
       <w:r>
         <w:t>2.2 Estructura del Proyecto</w:t>
       </w:r>
@@ -10617,30 +10617,30 @@
           <w:sz w:val="18"/>
           <w:szCs w:val="18"/>
         </w:rPr>
-        <w:t>// --- ZONA MODULO 3: PRESTAMOS Y DEVOLUCIONES (feature/prestamos)</w:t>
-      </w:r>
-      <w:r>
-        <w:rPr>
-          <w:rFonts w:ascii="Consolas" w:eastAsia="Consolas" w:hAnsi="Consolas" w:cs="Consolas"/>
-          <w:sz w:val="18"/>
-          <w:szCs w:val="18"/>
-        </w:rPr>
-        <w:t xml:space="preserve"> ---</w:t>
-      </w:r>
-    </w:p>
-    <w:p>
-      <w:pPr>
-        <w:shd w:val="clear" w:color="auto" w:fill="F4F6F8"/>
-        <w:spacing w:line="250" w:lineRule="auto"/>
-        <w:ind w:left="140" w:right="140"/>
-      </w:pPr>
-      <w:r>
-        <w:rPr>
-          <w:rFonts w:ascii="Consolas" w:eastAsia="Consolas" w:hAnsi="Consolas" w:cs="Consolas"/>
-          <w:sz w:val="18"/>
-          <w:szCs w:val="18"/>
-        </w:rPr>
-        <w:t>Route::get('prestamos', [\App\Http\Controllers\Api\PrestamoController::class, 'index']);</w:t>
+        <w:t>// --- ZONA MODULO 3: PRESTAMOS Y DEVOLUCIONES (feature/prestamos) ---</w:t>
+      </w:r>
+    </w:p>
+    <w:p>
+      <w:pPr>
+        <w:shd w:val="clear" w:color="auto" w:fill="F4F6F8"/>
+        <w:spacing w:line="250" w:lineRule="auto"/>
+        <w:ind w:left="140" w:right="140"/>
+      </w:pPr>
+      <w:r>
+        <w:rPr>
+          <w:rFonts w:ascii="Consolas" w:eastAsia="Consolas" w:hAnsi="Consolas" w:cs="Consolas"/>
+          <w:sz w:val="18"/>
+          <w:szCs w:val="18"/>
+        </w:rPr>
+        <w:t>Route::get('prestamos', [\App\Http\Controllers\Api\PrestamoController::clas</w:t>
+      </w:r>
+      <w:r>
+        <w:rPr>
+          <w:rFonts w:ascii="Consolas" w:eastAsia="Consolas" w:hAnsi="Consolas" w:cs="Consolas"/>
+          <w:sz w:val="18"/>
+          <w:szCs w:val="18"/>
+        </w:rPr>
+        <w:t>s, 'index']);</w:t>
       </w:r>
     </w:p>
     <w:p>
@@ -10664,10 +10664,10 @@
         <w:jc w:val="both"/>
       </w:pPr>
       <w:r>
-        <w:t xml:space="preserve">Esta decisión redujo notablemente los conflictos: de los cuatro módulos </w:t>
-      </w:r>
-      <w:r>
-        <w:t>integrados, solo uno produjo conflicto, y precisamente en el archivo que no admitía esa división por zonas.</w:t>
+        <w:t>Esta decisión redujo notablemente los conflictos: de los cuatro módulos integrados, solo uno produjo conflicto, y precisamente en el archivo que no admi</w:t>
+      </w:r>
+      <w:r>
+        <w:t>tía esa división por zonas.</w:t>
       </w:r>
     </w:p>
     <w:p>
@@ -10676,10 +10676,7 @@
         <w:jc w:val="both"/>
       </w:pPr>
       <w:r>
-        <w:t>El archivo .gitignore define qué queda fuera del control de versiones. Se escribió antes del primer commit, para no tener que reescribir el historia</w:t>
-      </w:r>
-      <w:r>
-        <w:t>l más adelante:</w:t>
+        <w:t>El archivo .gitignore define qué queda fuera del control de versiones. Se escribió antes del primer commit, para no tener que reescribir el historial más adelante:</w:t>
       </w:r>
     </w:p>
     <w:p>
@@ -10754,7 +10751,15 @@
           <w:sz w:val="18"/>
           <w:szCs w:val="18"/>
         </w:rPr>
-        <w:t># Variables de entorno (se versiona solo el ejemplo)</w:t>
+        <w:t># Vari</w:t>
+      </w:r>
+      <w:r>
+        <w:rPr>
+          <w:rFonts w:ascii="Consolas" w:eastAsia="Consolas" w:hAnsi="Consolas" w:cs="Consolas"/>
+          <w:sz w:val="18"/>
+          <w:szCs w:val="18"/>
+        </w:rPr>
+        <w:t>ables de entorno (se versiona solo el ejemplo)</w:t>
       </w:r>
     </w:p>
     <w:p>
@@ -10987,7 +10992,7 @@
       <w:pPr>
         <w:pStyle w:val="Ttulo2"/>
       </w:pPr>
-      <w:bookmarkStart w:id="15" w:name="_Toc240215084"/>
+      <w:bookmarkStart w:id="15" w:name="_Toc240375325"/>
       <w:r>
         <w:t>2.3 Gestión de Ramas</w:t>
       </w:r>
@@ -10999,10 +11004,10 @@
         <w:jc w:val="both"/>
       </w:pPr>
       <w:r>
-        <w:t>El equipo adoptó una variante simplificada de Git Flow, con dos ramas permanentes y ramas temporales por funcionalidad. La re</w:t>
-      </w:r>
-      <w:r>
-        <w:t>gla fundamental es que nunca se realiza un commit directo sobre main ni sobre develop: todo cambio llega por fusión desde una rama de trabajo.</w:t>
+        <w:t>El equipo adoptó una variante simplificada de Git Flow, con dos ramas permanentes y ramas temporales por funcionalidad. La regla fundamental es</w:t>
+      </w:r>
+      <w:r>
+        <w:t xml:space="preserve"> que nunca se realiza un commit directo sobre main ni sobre develop: todo cambio llega por fusión desde una rama de trabajo.</w:t>
       </w:r>
     </w:p>
     <w:tbl>
@@ -11020,7 +11025,7 @@
           <w:left w:w="10" w:type="dxa"/>
           <w:right w:w="10" w:type="dxa"/>
         </w:tblCellMar>
-        <w:tblLook w:val="04A0" w:firstRow="1" w:lastRow="0" w:firstColumn="1" w:lastColumn="0" w:noHBand="0" w:noVBand="1"/>
+        <w:tblLook w:val="0000" w:firstRow="0" w:lastRow="0" w:firstColumn="0" w:lastColumn="0" w:noHBand="0" w:noVBand="0"/>
       </w:tblPr>
       <w:tblGrid>
         <w:gridCol w:w="1900"/>
@@ -11729,7 +11734,7 @@
           <w:left w:w="10" w:type="dxa"/>
           <w:right w:w="10" w:type="dxa"/>
         </w:tblCellMar>
-        <w:tblLook w:val="04A0" w:firstRow="1" w:lastRow="0" w:firstColumn="1" w:lastColumn="0" w:noHBand="0" w:noVBand="1"/>
+        <w:tblLook w:val="0000" w:firstRow="0" w:lastRow="0" w:firstColumn="0" w:lastColumn="0" w:noHBand="0" w:noVBand="0"/>
       </w:tblPr>
       <w:tblGrid>
         <w:gridCol w:w="2900"/>
@@ -12341,7 +12346,7 @@
         </w:rPr>
         <w:lastRenderedPageBreak/>
         <w:drawing>
-          <wp:inline distT="0" distB="0" distL="0" distR="0" wp14:anchorId="377A57B4" wp14:editId="6B8361B7">
+          <wp:inline distT="0" distB="0" distL="0" distR="0" wp14:anchorId="385352B2" wp14:editId="6F984F3A">
             <wp:extent cx="5715000" cy="2828925"/>
             <wp:effectExtent l="0" t="0" r="0" b="0"/>
             <wp:docPr id="4" name="Figura 4. Estrategia de ramas aplicada en el proyecto (Git Flow simplificado)." descr="Figura 4. Estrategia de ramas aplicada en el proyecto (Git Flow simplificado)." title="Figura 4. Estrategia de ramas aplicada en el proyecto (Git Flow simplificado)."/>
@@ -12405,7 +12410,7 @@
       <w:pPr>
         <w:pStyle w:val="Ttulo1"/>
       </w:pPr>
-      <w:bookmarkStart w:id="16" w:name="_Toc240215085"/>
+      <w:bookmarkStart w:id="16" w:name="_Toc240375326"/>
       <w:r>
         <w:lastRenderedPageBreak/>
         <w:t>3. Procedimientos de Control de Versiones</w:t>
@@ -12416,7 +12421,7 @@
       <w:pPr>
         <w:pStyle w:val="Ttulo2"/>
       </w:pPr>
-      <w:bookmarkStart w:id="17" w:name="_Toc240215086"/>
+      <w:bookmarkStart w:id="17" w:name="_Toc240375327"/>
       <w:r>
         <w:t>3.1 Realización de Comm</w:t>
       </w:r>
@@ -12429,7 +12434,7 @@
       <w:pPr>
         <w:pStyle w:val="Ttulo3"/>
       </w:pPr>
-      <w:bookmarkStart w:id="18" w:name="_Toc240215087"/>
+      <w:bookmarkStart w:id="18" w:name="_Toc240375328"/>
       <w:r>
         <w:t>a) Cuándo se realiza un commit</w:t>
       </w:r>
@@ -12515,7 +12520,7 @@
       <w:pPr>
         <w:pStyle w:val="Ttulo3"/>
       </w:pPr>
-      <w:bookmarkStart w:id="19" w:name="_Toc240215088"/>
+      <w:bookmarkStart w:id="19" w:name="_Toc240375329"/>
       <w:r>
         <w:t>b) Cómo se realiza un commit</w:t>
       </w:r>
@@ -12755,7 +12760,7 @@
       <w:pPr>
         <w:pStyle w:val="Ttulo3"/>
       </w:pPr>
-      <w:bookmarkStart w:id="20" w:name="_Toc240215089"/>
+      <w:bookmarkStart w:id="20" w:name="_Toc240375330"/>
       <w:r>
         <w:t>c) Convención de mensajes de commit</w:t>
       </w:r>
@@ -12785,7 +12790,7 @@
           <w:left w:w="10" w:type="dxa"/>
           <w:right w:w="10" w:type="dxa"/>
         </w:tblCellMar>
-        <w:tblLook w:val="04A0" w:firstRow="1" w:lastRow="0" w:firstColumn="1" w:lastColumn="0" w:noHBand="0" w:noVBand="1"/>
+        <w:tblLook w:val="0000" w:firstRow="0" w:lastRow="0" w:firstColumn="0" w:lastColumn="0" w:noHBand="0" w:noVBand="0"/>
       </w:tblPr>
       <w:tblGrid>
         <w:gridCol w:w="1300"/>
@@ -13538,7 +13543,7 @@
       <w:pPr>
         <w:pStyle w:val="Ttulo3"/>
       </w:pPr>
-      <w:bookmarkStart w:id="21" w:name="_Toc240215090"/>
+      <w:bookmarkStart w:id="21" w:name="_Toc240375331"/>
       <w:r>
         <w:t>d) Historial real de commits del proyecto</w:t>
       </w:r>
@@ -13571,7 +13576,7 @@
           <w:left w:w="10" w:type="dxa"/>
           <w:right w:w="10" w:type="dxa"/>
         </w:tblCellMar>
-        <w:tblLook w:val="04A0" w:firstRow="1" w:lastRow="0" w:firstColumn="1" w:lastColumn="0" w:noHBand="0" w:noVBand="1"/>
+        <w:tblLook w:val="0000" w:firstRow="0" w:lastRow="0" w:firstColumn="0" w:lastColumn="0" w:noHBand="0" w:noVBand="0"/>
       </w:tblPr>
       <w:tblGrid>
         <w:gridCol w:w="952"/>
@@ -18277,7 +18282,7 @@
       <w:pPr>
         <w:pStyle w:val="Ttulo2"/>
       </w:pPr>
-      <w:bookmarkStart w:id="22" w:name="_Toc240215091"/>
+      <w:bookmarkStart w:id="22" w:name="_Toc240375332"/>
       <w:r>
         <w:t>3.2 Fusión de Ramas (Merge)</w:t>
       </w:r>
@@ -18302,7 +18307,7 @@
       <w:pPr>
         <w:pStyle w:val="Ttulo3"/>
       </w:pPr>
-      <w:bookmarkStart w:id="23" w:name="_Toc240215092"/>
+      <w:bookmarkStart w:id="23" w:name="_Toc240375333"/>
       <w:r>
         <w:t>a) Comandos utilizados para realizar la fusión</w:t>
       </w:r>
@@ -18515,7 +18520,7 @@
       <w:pPr>
         <w:pStyle w:val="Ttulo3"/>
       </w:pPr>
-      <w:bookmarkStart w:id="24" w:name="_Toc240215093"/>
+      <w:bookmarkStart w:id="24" w:name="_Toc240375334"/>
       <w:r>
         <w:t>b) Resultado obtenido en la fusión del módulo 1</w:t>
       </w:r>
@@ -18742,7 +18747,7 @@
       <w:pPr>
         <w:pStyle w:val="Ttulo3"/>
       </w:pPr>
-      <w:bookmarkStart w:id="25" w:name="_Toc240215094"/>
+      <w:bookmarkStart w:id="25" w:name="_Toc240375335"/>
       <w:r>
         <w:t>c) Fusión final a main y etiquetado del release</w:t>
       </w:r>
@@ -18883,7 +18888,7 @@
       <w:pPr>
         <w:pStyle w:val="Ttulo3"/>
       </w:pPr>
-      <w:bookmarkStart w:id="26" w:name="_Toc240215095"/>
+      <w:bookmarkStart w:id="26" w:name="_Toc240375336"/>
       <w:r>
         <w:t>d) Fusión de trabajo publicado por otro integrante en el remoto</w:t>
       </w:r>
@@ -19172,7 +19177,7 @@
       <w:pPr>
         <w:pStyle w:val="Ttulo2"/>
       </w:pPr>
-      <w:bookmarkStart w:id="27" w:name="_Toc240215096"/>
+      <w:bookmarkStart w:id="27" w:name="_Toc240375337"/>
       <w:r>
         <w:t>3.3 Manejo de Conflictos de Fusión</w:t>
       </w:r>
@@ -19182,7 +19187,7 @@
       <w:pPr>
         <w:pStyle w:val="Ttulo3"/>
       </w:pPr>
-      <w:bookmarkStart w:id="28" w:name="_Toc240215097"/>
+      <w:bookmarkStart w:id="28" w:name="_Toc240375338"/>
       <w:r>
         <w:t xml:space="preserve">a) Origen del </w:t>
       </w:r>
@@ -19261,7 +19266,7 @@
       <w:pPr>
         <w:pStyle w:val="Ttulo3"/>
       </w:pPr>
-      <w:bookmarkStart w:id="29" w:name="_Toc240215098"/>
+      <w:bookmarkStart w:id="29" w:name="_Toc240375339"/>
       <w:r>
         <w:t>b) Detección del conflicto</w:t>
       </w:r>
@@ -19640,7 +19645,7 @@
       <w:pPr>
         <w:pStyle w:val="Ttulo3"/>
       </w:pPr>
-      <w:bookmarkStart w:id="30" w:name="_Toc240215099"/>
+      <w:bookmarkStart w:id="30" w:name="_Toc240375340"/>
       <w:r>
         <w:t>c) Contenido del archivo en conflicto</w:t>
       </w:r>
@@ -20287,7 +20292,7 @@
       <w:pPr>
         <w:pStyle w:val="Ttulo3"/>
       </w:pPr>
-      <w:bookmarkStart w:id="31" w:name="_Toc240215100"/>
+      <w:bookmarkStart w:id="31" w:name="_Toc240375341"/>
       <w:r>
         <w:t>d) Pasos detallados para resolver el conflicto</w:t>
       </w:r>
@@ -20561,7 +20566,7 @@
       <w:pPr>
         <w:pStyle w:val="Ttulo3"/>
       </w:pPr>
-      <w:bookmarkStart w:id="32" w:name="_Toc240215101"/>
+      <w:bookmarkStart w:id="32" w:name="_Toc240375342"/>
       <w:r>
         <w:t>e) Resul</w:t>
       </w:r>
@@ -21074,7 +21079,7 @@
       <w:pPr>
         <w:pStyle w:val="Ttulo3"/>
       </w:pPr>
-      <w:bookmarkStart w:id="33" w:name="_Toc240215102"/>
+      <w:bookmarkStart w:id="33" w:name="_Toc240375343"/>
       <w:r>
         <w:t>f) Corrección posterior al release mediante hotfix</w:t>
       </w:r>
@@ -21457,7 +21462,7 @@
       <w:pPr>
         <w:pStyle w:val="Ttulo1"/>
       </w:pPr>
-      <w:bookmarkStart w:id="34" w:name="_Toc240215103"/>
+      <w:bookmarkStart w:id="34" w:name="_Toc240375344"/>
       <w:r>
         <w:lastRenderedPageBreak/>
         <w:t>4. Documentación Técnica</w:t>
@@ -21480,7 +21485,7 @@
       <w:pPr>
         <w:pStyle w:val="Ttulo2"/>
       </w:pPr>
-      <w:bookmarkStart w:id="35" w:name="_Toc240215104"/>
+      <w:bookmarkStart w:id="35" w:name="_Toc240375345"/>
       <w:r>
         <w:t>4.1 Guía para Colaboradores</w:t>
       </w:r>
@@ -21490,7 +21495,7 @@
       <w:pPr>
         <w:pStyle w:val="Ttulo3"/>
       </w:pPr>
-      <w:bookmarkStart w:id="36" w:name="_Toc240215105"/>
+      <w:bookmarkStart w:id="36" w:name="_Toc240375346"/>
       <w:r>
         <w:t>a) Requisitos previos</w:t>
       </w:r>
@@ -21511,7 +21516,7 @@
           <w:left w:w="10" w:type="dxa"/>
           <w:right w:w="10" w:type="dxa"/>
         </w:tblCellMar>
-        <w:tblLook w:val="04A0" w:firstRow="1" w:lastRow="0" w:firstColumn="1" w:lastColumn="0" w:noHBand="0" w:noVBand="1"/>
+        <w:tblLook w:val="0000" w:firstRow="0" w:lastRow="0" w:firstColumn="0" w:lastColumn="0" w:noHBand="0" w:noVBand="0"/>
       </w:tblPr>
       <w:tblGrid>
         <w:gridCol w:w="2600"/>
@@ -22153,7 +22158,7 @@
       <w:pPr>
         <w:pStyle w:val="Ttulo3"/>
       </w:pPr>
-      <w:bookmarkStart w:id="37" w:name="_Toc240215106"/>
+      <w:bookmarkStart w:id="37" w:name="_Toc240375347"/>
       <w:r>
         <w:t>b) Cómo clonar el repositorio</w:t>
       </w:r>
@@ -22253,7 +22258,7 @@
       <w:pPr>
         <w:pStyle w:val="Ttulo3"/>
       </w:pPr>
-      <w:bookmarkStart w:id="38" w:name="_Toc240215107"/>
+      <w:bookmarkStart w:id="38" w:name="_Toc240375348"/>
       <w:r>
         <w:t>c) Instalación y ejecución del proyecto</w:t>
       </w:r>
@@ -22587,7 +22592,7 @@
       <w:pPr>
         <w:pStyle w:val="Ttulo3"/>
       </w:pPr>
-      <w:bookmarkStart w:id="39" w:name="_Toc240215108"/>
+      <w:bookmarkStart w:id="39" w:name="_Toc240375349"/>
       <w:r>
         <w:t>d) Cómo crear ramas y realizar commits</w:t>
       </w:r>
@@ -22954,7 +22959,7 @@
       <w:pPr>
         <w:pStyle w:val="Ttulo3"/>
       </w:pPr>
-      <w:bookmarkStart w:id="40" w:name="_Toc240215109"/>
+      <w:bookmarkStart w:id="40" w:name="_Toc240375350"/>
       <w:r>
         <w:t>e) Reglas acor</w:t>
       </w:r>
@@ -23048,7 +23053,7 @@
       <w:pPr>
         <w:pStyle w:val="Ttulo3"/>
       </w:pPr>
-      <w:bookmarkStart w:id="41" w:name="_Toc240215110"/>
+      <w:bookmarkStart w:id="41" w:name="_Toc240375351"/>
       <w:r>
         <w:t>f) Endpoints de la API</w:t>
       </w:r>
@@ -23078,7 +23083,7 @@
           <w:left w:w="10" w:type="dxa"/>
           <w:right w:w="10" w:type="dxa"/>
         </w:tblCellMar>
-        <w:tblLook w:val="04A0" w:firstRow="1" w:lastRow="0" w:firstColumn="1" w:lastColumn="0" w:noHBand="0" w:noVBand="1"/>
+        <w:tblLook w:val="0000" w:firstRow="0" w:lastRow="0" w:firstColumn="0" w:lastColumn="0" w:noHBand="0" w:noVBand="0"/>
       </w:tblPr>
       <w:tblGrid>
         <w:gridCol w:w="988"/>
@@ -25782,7 +25787,7 @@
       <w:pPr>
         <w:pStyle w:val="Ttulo3"/>
       </w:pPr>
-      <w:bookmarkStart w:id="42" w:name="_Toc240215111"/>
+      <w:bookmarkStart w:id="42" w:name="_Toc240375352"/>
       <w:r>
         <w:t>g) Reglas de negocio implementadas</w:t>
       </w:r>
@@ -25812,7 +25817,7 @@
           <w:left w:w="10" w:type="dxa"/>
           <w:right w:w="10" w:type="dxa"/>
         </w:tblCellMar>
-        <w:tblLook w:val="04A0" w:firstRow="1" w:lastRow="0" w:firstColumn="1" w:lastColumn="0" w:noHBand="0" w:noVBand="1"/>
+        <w:tblLook w:val="0000" w:firstRow="0" w:lastRow="0" w:firstColumn="0" w:lastColumn="0" w:noHBand="0" w:noVBand="0"/>
       </w:tblPr>
       <w:tblGrid>
         <w:gridCol w:w="4200"/>
@@ -26200,7 +26205,7 @@
       <w:pPr>
         <w:pStyle w:val="Ttulo3"/>
       </w:pPr>
-      <w:bookmarkStart w:id="43" w:name="_Toc240215112"/>
+      <w:bookmarkStart w:id="43" w:name="_Toc240375353"/>
       <w:r>
         <w:lastRenderedPageBreak/>
         <w:t>h) Evidencia de funcionamiento del sistema</w:t>
@@ -26213,10 +26218,10 @@
         <w:jc w:val="both"/>
       </w:pPr>
       <w:r>
-        <w:t>Las siguientes capturas corresponden al sistema en ejecución, con el backend y el frontend levantados a la vez y la base de datos poblada por los seeders. Se tomaron después de integrar las mejoras de interfaz, por lo que reflejan el estado actual del proy</w:t>
-      </w:r>
-      <w:r>
-        <w:t>ecto.</w:t>
+        <w:t>Las siguientes capturas corresponden al sistema en ejecución, con el backend y el frontend levantados a la vez y la base de datos poblada por los seeders. Se tomaron después de integrar las mejor</w:t>
+      </w:r>
+      <w:r>
+        <w:t>as de interfaz, por lo que reflejan el estado actual del proyecto.</w:t>
       </w:r>
     </w:p>
     <w:p>
@@ -26229,7 +26234,7 @@
           <w:noProof/>
         </w:rPr>
         <w:drawing>
-          <wp:inline distT="0" distB="0" distL="0" distR="0" wp14:anchorId="2A4894B4" wp14:editId="3D7D9488">
+          <wp:inline distT="0" distB="0" distL="0" distR="0" wp14:anchorId="412458BC" wp14:editId="2A6CF718">
             <wp:extent cx="3524250" cy="4638675"/>
             <wp:effectExtent l="0" t="0" r="0" b="0"/>
             <wp:docPr id="5" name="Figura 5. Página de inicio con el estado de conexión a la API." descr="Figura 5. Página de inicio con el estado de conexión a la API." title="Figura 5. Página de inicio con el estado de conexión a la API."/>
@@ -26295,7 +26300,7 @@
         </w:rPr>
         <w:lastRenderedPageBreak/>
         <w:drawing>
-          <wp:inline distT="0" distB="0" distL="0" distR="0" wp14:anchorId="15B808C4" wp14:editId="5034F522">
+          <wp:inline distT="0" distB="0" distL="0" distR="0" wp14:anchorId="3150228B" wp14:editId="6A4A0BA1">
             <wp:extent cx="4953000" cy="3276600"/>
             <wp:effectExtent l="0" t="0" r="0" b="0"/>
             <wp:docPr id="6" name="Figura 6. Pantalla de inicio de sesión." descr="Figura 6. Pantalla de inicio de sesión." title="Figura 6. Pantalla de inicio de sesión."/>
@@ -26360,7 +26365,7 @@
           <w:noProof/>
         </w:rPr>
         <w:drawing>
-          <wp:inline distT="0" distB="0" distL="0" distR="0" wp14:anchorId="1AAD0075" wp14:editId="79F73994">
+          <wp:inline distT="0" distB="0" distL="0" distR="0" wp14:anchorId="35AD173A" wp14:editId="4C60C996">
             <wp:extent cx="4286250" cy="4343400"/>
             <wp:effectExtent l="0" t="0" r="0" b="0"/>
             <wp:docPr id="7" name="Figura 7. Módulo 1 — Catálogo de libros: registro, búsqueda y control de ejemplares." descr="Figura 7. Módulo 1 — Catálogo de libros: registro, búsqueda y control de ejemplares." title="Figura 7. Módulo 1 — Catálogo de libros: registro, búsqueda y control de ejemplares."/>
@@ -26426,7 +26431,7 @@
         </w:rPr>
         <w:lastRenderedPageBreak/>
         <w:drawing>
-          <wp:inline distT="0" distB="0" distL="0" distR="0" wp14:anchorId="1C68E1FF" wp14:editId="7EB2B798">
+          <wp:inline distT="0" distB="0" distL="0" distR="0" wp14:anchorId="38225E34" wp14:editId="1984BB26">
             <wp:extent cx="4572000" cy="3895725"/>
             <wp:effectExtent l="0" t="0" r="0" b="0"/>
             <wp:docPr id="8" name="Figura 8. Módulo 2 — Gestión de socios: alta, edición y suspensión." descr="Figura 8. Módulo 2 — Gestión de socios: alta, edición y suspensión." title="Figura 8. Módulo 2 — Gestión de socios: alta, edición y suspensión."/>
@@ -26478,17 +26483,7 @@
           <w:sz w:val="18"/>
           <w:szCs w:val="18"/>
         </w:rPr>
-        <w:t xml:space="preserve">Figura 8. Módulo 2 — Gestión de socios: alta, edición </w:t>
-      </w:r>
-      <w:r>
-        <w:rPr>
-          <w:i/>
-          <w:iCs/>
-          <w:color w:val="52606D"/>
-          <w:sz w:val="18"/>
-          <w:szCs w:val="18"/>
-        </w:rPr>
-        <w:t>y suspensión.</w:t>
+        <w:t>Figura 8. Módulo 2 — Gestión de socios: alta, edición y suspensión.</w:t>
       </w:r>
     </w:p>
     <w:p>
@@ -26501,7 +26496,7 @@
           <w:noProof/>
         </w:rPr>
         <w:drawing>
-          <wp:inline distT="0" distB="0" distL="0" distR="0" wp14:anchorId="293A38C2" wp14:editId="39A02BBD">
+          <wp:inline distT="0" distB="0" distL="0" distR="0" wp14:anchorId="140C5482" wp14:editId="3812BF71">
             <wp:extent cx="4762500" cy="3743325"/>
             <wp:effectExtent l="0" t="0" r="0" b="0"/>
             <wp:docPr id="9" name="Figura 9. Módulo 3 — Préstamos y devoluciones con cálculo de días de retraso." descr="Figura 9. Módulo 3 — Préstamos y devoluciones con cálculo de días de retraso." title="Figura 9. Módulo 3 — Préstamos y devoluciones con cálculo de días de retraso."/>
@@ -26567,7 +26562,7 @@
         </w:rPr>
         <w:lastRenderedPageBreak/>
         <w:drawing>
-          <wp:inline distT="0" distB="0" distL="0" distR="0" wp14:anchorId="50BAD384" wp14:editId="2A515156">
+          <wp:inline distT="0" distB="0" distL="0" distR="0" wp14:anchorId="42471F14" wp14:editId="3D80119D">
             <wp:extent cx="3714750" cy="4467225"/>
             <wp:effectExtent l="0" t="0" r="0" b="0"/>
             <wp:docPr id="10" name="Figura 10. Módulo 4 — Dashboard de indicadores y ranking de libros." descr="Figura 10. Módulo 4 — Dashboard de indicadores y ranking de libros." title="Figura 10. Módulo 4 — Dashboard de indicadores y ranking de libros."/>
@@ -26619,7 +26614,17 @@
           <w:sz w:val="18"/>
           <w:szCs w:val="18"/>
         </w:rPr>
-        <w:t>Figura 10. Módulo 4 — Dashboard de indicadores y ranking de libros.</w:t>
+        <w:t>Figura 10. Módulo 4</w:t>
+      </w:r>
+      <w:r>
+        <w:rPr>
+          <w:i/>
+          <w:iCs/>
+          <w:color w:val="52606D"/>
+          <w:sz w:val="18"/>
+          <w:szCs w:val="18"/>
+        </w:rPr>
+        <w:t xml:space="preserve"> — Dashboard de indicadores y ranking de libros.</w:t>
       </w:r>
     </w:p>
     <w:p>
@@ -26631,7 +26636,7 @@
       <w:pPr>
         <w:pStyle w:val="Ttulo1"/>
       </w:pPr>
-      <w:bookmarkStart w:id="44" w:name="_Toc240215113"/>
+      <w:bookmarkStart w:id="44" w:name="_Toc240375354"/>
       <w:r>
         <w:lastRenderedPageBreak/>
         <w:t>5. Conclusiones</w:t>
@@ -26642,7 +26647,7 @@
       <w:pPr>
         <w:pStyle w:val="Ttulo2"/>
       </w:pPr>
-      <w:bookmarkStart w:id="45" w:name="_Toc240215114"/>
+      <w:bookmarkStart w:id="45" w:name="_Toc240375355"/>
       <w:r>
         <w:t>5.1 Lecciones Aprendidas</w:t>
       </w:r>
@@ -26654,10 +26659,7 @@
         <w:jc w:val="both"/>
       </w:pPr>
       <w:r>
-        <w:t xml:space="preserve">Trabajar con Git cambió por completo la dinámica </w:t>
-      </w:r>
-      <w:r>
-        <w:t>del equipo respecto de la forma de trabajo descrita en la sección 1.2. Estas son las lecciones que dejó el proceso:</w:t>
+        <w:t>Trabajar con Git cambió por completo la dinámica del equipo respecto de la forma de trabajo descrita en la sección 1.2. Estas son las lecciones que dejó el proceso:</w:t>
       </w:r>
     </w:p>
     <w:p>
@@ -26677,10 +26679,10 @@
         <w:t xml:space="preserve">Prevenir conflictos resulta más barato que resolverlos. </w:t>
       </w:r>
       <w:r>
-        <w:t>Dividir los archivos compartidos en zonas comentadas por módulo fue la decisión de m</w:t>
-      </w:r>
-      <w:r>
-        <w:t>ayor impacto del proyecto: de los cuatro módulos integrados, solo uno generó conflicto, y fue precisamente en el único archivo donde esa división no era aplicable.</w:t>
+        <w:t>Dividir los archivos compartidos en zonas comentadas por módulo fue la decisión de mayor impacto del proyecto: de los cuatro módulos integrados, solo uno generó conflicto, y fue precisamente en el ún</w:t>
+      </w:r>
+      <w:r>
+        <w:t>ico archivo donde esa división no era aplicable.</w:t>
       </w:r>
     </w:p>
     <w:p>
@@ -26825,7 +26827,7 @@
       <w:pPr>
         <w:pStyle w:val="Ttulo3"/>
       </w:pPr>
-      <w:bookmarkStart w:id="46" w:name="_Toc240215115"/>
+      <w:bookmarkStart w:id="46" w:name="_Toc240375356"/>
       <w:r>
         <w:t>Desafíos encontrados</w:t>
       </w:r>
@@ -26913,7 +26915,7 @@
       <w:pPr>
         <w:pStyle w:val="Ttulo2"/>
       </w:pPr>
-      <w:bookmarkStart w:id="47" w:name="_Toc240215116"/>
+      <w:bookmarkStart w:id="47" w:name="_Toc240375357"/>
       <w:r>
         <w:t>5.2 Mejoras Futuras</w:t>
       </w:r>
@@ -27115,7 +27117,7 @@
       <w:pPr>
         <w:pStyle w:val="Ttulo1"/>
       </w:pPr>
-      <w:bookmarkStart w:id="48" w:name="_Toc240215117"/>
+      <w:bookmarkStart w:id="48" w:name="_Toc240375358"/>
       <w:r>
         <w:lastRenderedPageBreak/>
         <w:t>Anexo A. Evidencias del repositorio</w:t>
@@ -27138,7 +27140,7 @@
       <w:pPr>
         <w:pStyle w:val="Ttulo2"/>
       </w:pPr>
-      <w:bookmarkStart w:id="49" w:name="_Toc240215118"/>
+      <w:bookmarkStart w:id="49" w:name="_Toc240375359"/>
       <w:r>
         <w:t>A.1 Historial completo con estructura de ramas</w:t>
       </w:r>
@@ -27676,30 +27678,30 @@
           <w:sz w:val="18"/>
           <w:szCs w:val="18"/>
         </w:rPr>
-        <w:t xml:space="preserve">| * | | 0dbfb27 (feature/gestion-socios) </w:t>
-      </w:r>
-      <w:r>
-        <w:rPr>
-          <w:rFonts w:ascii="Consolas" w:eastAsia="Consolas" w:hAnsi="Consolas" w:cs="Consolas"/>
-          <w:sz w:val="18"/>
-          <w:szCs w:val="18"/>
-        </w:rPr>
-        <w:t>feat(socios): agregar Socios.jsx</w:t>
-      </w:r>
-    </w:p>
-    <w:p>
-      <w:pPr>
-        <w:shd w:val="clear" w:color="auto" w:fill="F4F6F8"/>
-        <w:spacing w:line="250" w:lineRule="auto"/>
-        <w:ind w:left="140" w:right="140"/>
-      </w:pPr>
-      <w:r>
-        <w:rPr>
-          <w:rFonts w:ascii="Consolas" w:eastAsia="Consolas" w:hAnsi="Consolas" w:cs="Consolas"/>
-          <w:sz w:val="18"/>
-          <w:szCs w:val="18"/>
-        </w:rPr>
-        <w:t>| * | | d9bdff3 feat(socios): implementar SocioController con validaciones</w:t>
+        <w:t>| * | | 0dbfb27 (feature/gestion-socios) feat(socios): agregar Socios.jsx</w:t>
+      </w:r>
+    </w:p>
+    <w:p>
+      <w:pPr>
+        <w:shd w:val="clear" w:color="auto" w:fill="F4F6F8"/>
+        <w:spacing w:line="250" w:lineRule="auto"/>
+        <w:ind w:left="140" w:right="140"/>
+      </w:pPr>
+      <w:r>
+        <w:rPr>
+          <w:rFonts w:ascii="Consolas" w:eastAsia="Consolas" w:hAnsi="Consolas" w:cs="Consolas"/>
+          <w:sz w:val="18"/>
+          <w:szCs w:val="18"/>
+        </w:rPr>
+        <w:t>| * | | d9bdff3 feat(socios): implementar</w:t>
+      </w:r>
+      <w:r>
+        <w:rPr>
+          <w:rFonts w:ascii="Consolas" w:eastAsia="Consolas" w:hAnsi="Consolas" w:cs="Consolas"/>
+          <w:sz w:val="18"/>
+          <w:szCs w:val="18"/>
+        </w:rPr>
+        <w:t xml:space="preserve"> SocioController con validaciones</w:t>
       </w:r>
     </w:p>
     <w:p>
@@ -27759,30 +27761,30 @@
           <w:sz w:val="18"/>
           <w:szCs w:val="18"/>
         </w:rPr>
-        <w:t>| * | e12133</w:t>
-      </w:r>
-      <w:r>
-        <w:rPr>
-          <w:rFonts w:ascii="Consolas" w:eastAsia="Consolas" w:hAnsi="Consolas" w:cs="Consolas"/>
-          <w:sz w:val="18"/>
-          <w:szCs w:val="18"/>
-        </w:rPr>
-        <w:t>7 (feature/catalogo-libros) feat(libros): agregar Libros.jsx</w:t>
-      </w:r>
-    </w:p>
-    <w:p>
-      <w:pPr>
-        <w:shd w:val="clear" w:color="auto" w:fill="F4F6F8"/>
-        <w:spacing w:line="250" w:lineRule="auto"/>
-        <w:ind w:left="140" w:right="140"/>
-      </w:pPr>
-      <w:r>
-        <w:rPr>
-          <w:rFonts w:ascii="Consolas" w:eastAsia="Consolas" w:hAnsi="Consolas" w:cs="Consolas"/>
-          <w:sz w:val="18"/>
-          <w:szCs w:val="18"/>
-        </w:rPr>
-        <w:t>| * | 98291c4 feat(libros): implementar LibroController con CRUD</w:t>
+        <w:t>| * | e121337 (feature/catalogo-libros) feat(libros): agregar Libros.jsx</w:t>
+      </w:r>
+    </w:p>
+    <w:p>
+      <w:pPr>
+        <w:shd w:val="clear" w:color="auto" w:fill="F4F6F8"/>
+        <w:spacing w:line="250" w:lineRule="auto"/>
+        <w:ind w:left="140" w:right="140"/>
+      </w:pPr>
+      <w:r>
+        <w:rPr>
+          <w:rFonts w:ascii="Consolas" w:eastAsia="Consolas" w:hAnsi="Consolas" w:cs="Consolas"/>
+          <w:sz w:val="18"/>
+          <w:szCs w:val="18"/>
+        </w:rPr>
+        <w:t>| * | 98291c4</w:t>
+      </w:r>
+      <w:r>
+        <w:rPr>
+          <w:rFonts w:ascii="Consolas" w:eastAsia="Consolas" w:hAnsi="Consolas" w:cs="Consolas"/>
+          <w:sz w:val="18"/>
+          <w:szCs w:val="18"/>
+        </w:rPr>
+        <w:t xml:space="preserve"> feat(libros): implementar LibroController con CRUD</w:t>
       </w:r>
     </w:p>
     <w:p>
@@ -27849,7 +27851,7 @@
       <w:pPr>
         <w:pStyle w:val="Ttulo2"/>
       </w:pPr>
-      <w:bookmarkStart w:id="50" w:name="_Toc240215119"/>
+      <w:bookmarkStart w:id="50" w:name="_Toc240375360"/>
       <w:r>
         <w:t>A.2 Ramas del repositorio</w:t>
       </w:r>
@@ -28085,9 +28087,12 @@
       <w:pPr>
         <w:pStyle w:val="Ttulo2"/>
       </w:pPr>
-      <w:bookmarkStart w:id="51" w:name="_Toc240215120"/>
-      <w:r>
-        <w:t>A.3 Publicación en el repositorio remoto</w:t>
+      <w:bookmarkStart w:id="51" w:name="_Toc240375361"/>
+      <w:r>
+        <w:t xml:space="preserve">A.3 Publicación en el repositorio </w:t>
+      </w:r>
+      <w:r>
+        <w:t>remoto</w:t>
       </w:r>
       <w:bookmarkEnd w:id="51"/>
     </w:p>
@@ -28193,15 +28198,7 @@
           <w:sz w:val="18"/>
           <w:szCs w:val="18"/>
         </w:rPr>
-        <w:t xml:space="preserve">         feature/prestamos feature/reportes-dashboard hotfix/respuestas-js</w:t>
-      </w:r>
-      <w:r>
-        <w:rPr>
-          <w:rFonts w:ascii="Consolas" w:eastAsia="Consolas" w:hAnsi="Consolas" w:cs="Consolas"/>
-          <w:sz w:val="18"/>
-          <w:szCs w:val="18"/>
-        </w:rPr>
-        <w:t>on</w:t>
+        <w:t xml:space="preserve">         feature/prestamos feature/reportes-dashboard hotfix/respuestas-json</w:t>
       </w:r>
     </w:p>
     <w:p>
@@ -28231,7 +28228,15 @@
           <w:sz w:val="18"/>
           <w:szCs w:val="18"/>
         </w:rPr>
-        <w:t xml:space="preserve"> * [new branch]      feature/catalogo-libros -&gt; feature/catalogo-libros</w:t>
+        <w:t xml:space="preserve"> * [new branch]      feature/catalogo-libros -&gt; feature/catalogo</w:t>
+      </w:r>
+      <w:r>
+        <w:rPr>
+          <w:rFonts w:ascii="Consolas" w:eastAsia="Consolas" w:hAnsi="Consolas" w:cs="Consolas"/>
+          <w:sz w:val="18"/>
+          <w:szCs w:val="18"/>
+        </w:rPr>
+        <w:t>-libros</w:t>
       </w:r>
     </w:p>
     <w:p>
@@ -28336,15 +28341,7 @@
           <w:sz w:val="18"/>
           <w:szCs w:val="18"/>
         </w:rPr>
-        <w:t xml:space="preserve"> * [new tag]         </w:t>
-      </w:r>
-      <w:r>
-        <w:rPr>
-          <w:rFonts w:ascii="Consolas" w:eastAsia="Consolas" w:hAnsi="Consolas" w:cs="Consolas"/>
-          <w:sz w:val="18"/>
-          <w:szCs w:val="18"/>
-        </w:rPr>
-        <w:t>v1.0.0 -&gt; v1.0.0</w:t>
+        <w:t xml:space="preserve"> * [new tag]         v1.0.0 -&gt; v1.0.0</w:t>
       </w:r>
     </w:p>
     <w:p>
@@ -28366,9 +28363,12 @@
       <w:pPr>
         <w:pStyle w:val="Ttulo2"/>
       </w:pPr>
-      <w:bookmarkStart w:id="52" w:name="_Toc240215121"/>
-      <w:r>
-        <w:t>A.4 Resumen cuantitativo del proyecto</w:t>
+      <w:bookmarkStart w:id="52" w:name="_Toc240375362"/>
+      <w:r>
+        <w:t>A.4 R</w:t>
+      </w:r>
+      <w:r>
+        <w:t>esumen cuantitativo del proyecto</w:t>
       </w:r>
       <w:bookmarkEnd w:id="52"/>
     </w:p>
@@ -28387,7 +28387,7 @@
           <w:left w:w="10" w:type="dxa"/>
           <w:right w:w="10" w:type="dxa"/>
         </w:tblCellMar>
-        <w:tblLook w:val="04A0" w:firstRow="1" w:lastRow="0" w:firstColumn="1" w:lastColumn="0" w:noHBand="0" w:noVBand="1"/>
+        <w:tblLook w:val="0000" w:firstRow="0" w:lastRow="0" w:firstColumn="0" w:lastColumn="0" w:noHBand="0" w:noVBand="0"/>
       </w:tblPr>
       <w:tblGrid>
         <w:gridCol w:w="5200"/>
@@ -29320,7 +29320,7 @@
       <w:pPr>
         <w:pStyle w:val="Ttulo1"/>
       </w:pPr>
-      <w:bookmarkStart w:id="53" w:name="_Toc240215122"/>
+      <w:bookmarkStart w:id="53" w:name="_Toc240375363"/>
       <w:r>
         <w:lastRenderedPageBreak/>
         <w:t>Anexo B. Cumplimiento de la rúbrica</w:t>
@@ -29351,7 +29351,7 @@
           <w:left w:w="10" w:type="dxa"/>
           <w:right w:w="10" w:type="dxa"/>
         </w:tblCellMar>
-        <w:tblLook w:val="04A0" w:firstRow="1" w:lastRow="0" w:firstColumn="1" w:lastColumn="0" w:noHBand="0" w:noVBand="1"/>
+        <w:tblLook w:val="0000" w:firstRow="0" w:lastRow="0" w:firstColumn="0" w:lastColumn="0" w:noHBand="0" w:noVBand="0"/>
       </w:tblPr>
       <w:tblGrid>
         <w:gridCol w:w="3398"/>
@@ -30370,10 +30370,10 @@
 <file path=word/numbering.xml><?xml version="1.0" encoding="utf-8"?>
 <w:numbering xmlns:wpc="http://schemas.microsoft.com/office/word/2010/wordprocessingCanvas" xmlns:cx="http://schemas.microsoft.com/office/drawing/2014/chartex" xmlns:cx1="http://schemas.microsoft.com/office/drawing/2015/9/8/chartex" xmlns:cx2="http://schemas.microsoft.com/office/drawing/2015/10/21/chartex" xmlns:cx3="http://schemas.microsoft.com/office/drawing/2016/5/9/chartex" xmlns:cx4="http://schemas.microsoft.com/office/drawing/2016/5/10/chartex" xmlns:cx5="http://schemas.microsoft.com/office/drawing/2016/5/11/chartex" xmlns:cx6="http://schemas.microsoft.com/office/drawing/2016/5/12/chartex" xmlns:cx7="http://schemas.microsoft.com/office/drawing/2016/5/13/chartex" xmlns:cx8="http://schemas.microsoft.com/office/drawing/2016/5/14/chartex" xmlns:mc="http://schemas.openxmlformats.org/markup-compatibility/2006" xmlns:aink="http://schemas.microsoft.com/office/drawing/2016/ink" xmlns:am3d="http://schemas.microsoft.com/office/drawing/2017/model3d" xmlns:o="urn:schemas-microsoft-com:office:office" xmlns:r="http://schemas.openxmlformats.org/officeDocument/2006/relationships" xmlns:m="http://schemas.openxmlformats.org/officeDocument/2006/math" xmlns:v="urn:schemas-microsoft-com:vml" xmlns:wp14="http://schemas.microsoft.com/office/word/2010/wordprocessingDrawing" xmlns:wp="http://schemas.openxmlformats.org/drawingml/2006/wordprocessingDrawing" xmlns:w10="urn:schemas-microsoft-com:office:word" xmlns:w="http://schemas.openxmlformats.org/wordprocessingml/2006/main" xmlns:w14="http://schemas.microsoft.com/office/word/2010/wordml" xmlns:w15="http://schemas.microsoft.com/office/word/2012/wordml" xmlns:w16cex="http://schemas.microsoft.com/office/word/2018/wordml/cex" xmlns:w16cid="http://schemas.microsoft.com/office/word/2016/wordml/cid" xmlns:w16="http://schemas.microsoft.com/office/word/2018/wordml" xmlns:w16sdtdh="http://schemas.microsoft.com/office/word/2020/wordml/sdtdatahash" xmlns:w16se="http://schemas.microsoft.com/office/word/2015/wordml/symex" xmlns:wpg="http://schemas.microsoft.com/office/word/2010/wordprocessingGroup" xmlns:wpi="http://schemas.microsoft.com/office/word/2010/wordprocessingInk" xmlns:wne="http://schemas.microsoft.com/office/word/2006/wordml" xmlns:wps="http://schemas.microsoft.com/office/word/2010/wordprocessingShape" mc:Ignorable="w14 w15 w16se w16cid w16 w16cex w16sdtdh wp14">
   <w:abstractNum w:abstractNumId="0" w15:restartNumberingAfterBreak="0">
-    <w:nsid w:val="0B3A61CF"/>
+    <w:nsid w:val="05286CDD"/>
     <w:multiLevelType w:val="hybridMultilevel"/>
-    <w:tmpl w:val="0340290C"/>
-    <w:lvl w:ilvl="0" w:tplc="1F020DAC">
+    <w:tmpl w:val="69C065BA"/>
+    <w:lvl w:ilvl="0" w:tplc="286643BC">
       <w:start w:val="1"/>
       <w:numFmt w:val="bullet"/>
       <w:lvlText w:val="•"/>
@@ -30382,52 +30382,52 @@
         <w:ind w:left="560" w:hanging="280"/>
       </w:pPr>
     </w:lvl>
-    <w:lvl w:ilvl="1" w:tplc="BC7A3ED4">
+    <w:lvl w:ilvl="1" w:tplc="119864B6">
       <w:numFmt w:val="decimal"/>
       <w:lvlText w:val=""/>
       <w:lvlJc w:val="left"/>
     </w:lvl>
-    <w:lvl w:ilvl="2" w:tplc="9C4224CC">
+    <w:lvl w:ilvl="2" w:tplc="0318161A">
       <w:numFmt w:val="decimal"/>
       <w:lvlText w:val=""/>
       <w:lvlJc w:val="left"/>
     </w:lvl>
-    <w:lvl w:ilvl="3" w:tplc="15B2C528">
+    <w:lvl w:ilvl="3" w:tplc="50CC0F5C">
       <w:numFmt w:val="decimal"/>
       <w:lvlText w:val=""/>
       <w:lvlJc w:val="left"/>
     </w:lvl>
-    <w:lvl w:ilvl="4" w:tplc="3084B160">
+    <w:lvl w:ilvl="4" w:tplc="B024FD58">
       <w:numFmt w:val="decimal"/>
       <w:lvlText w:val=""/>
       <w:lvlJc w:val="left"/>
     </w:lvl>
-    <w:lvl w:ilvl="5" w:tplc="63228A2A">
+    <w:lvl w:ilvl="5" w:tplc="C6844D66">
       <w:numFmt w:val="decimal"/>
       <w:lvlText w:val=""/>
       <w:lvlJc w:val="left"/>
     </w:lvl>
-    <w:lvl w:ilvl="6" w:tplc="030AD2FE">
+    <w:lvl w:ilvl="6" w:tplc="B600B95C">
       <w:numFmt w:val="decimal"/>
       <w:lvlText w:val=""/>
       <w:lvlJc w:val="left"/>
     </w:lvl>
-    <w:lvl w:ilvl="7" w:tplc="09C41C44">
+    <w:lvl w:ilvl="7" w:tplc="7FC8A1E4">
       <w:numFmt w:val="decimal"/>
       <w:lvlText w:val=""/>
       <w:lvlJc w:val="left"/>
     </w:lvl>
-    <w:lvl w:ilvl="8" w:tplc="CEE85B08">
+    <w:lvl w:ilvl="8" w:tplc="1182FE70">
       <w:numFmt w:val="decimal"/>
       <w:lvlText w:val=""/>
       <w:lvlJc w:val="left"/>
     </w:lvl>
   </w:abstractNum>
   <w:abstractNum w:abstractNumId="1" w15:restartNumberingAfterBreak="0">
-    <w:nsid w:val="0CD168EC"/>
+    <w:nsid w:val="48897CEA"/>
     <w:multiLevelType w:val="hybridMultilevel"/>
-    <w:tmpl w:val="FAE0EB80"/>
-    <w:lvl w:ilvl="0" w:tplc="48F662DE">
+    <w:tmpl w:val="EC10D74E"/>
+    <w:lvl w:ilvl="0" w:tplc="7136828A">
       <w:start w:val="1"/>
       <w:numFmt w:val="decimal"/>
       <w:lvlText w:val="%1."/>
@@ -30436,52 +30436,52 @@
         <w:ind w:left="560" w:hanging="280"/>
       </w:pPr>
     </w:lvl>
-    <w:lvl w:ilvl="1" w:tplc="607288C4">
+    <w:lvl w:ilvl="1" w:tplc="6374E80A">
       <w:numFmt w:val="decimal"/>
       <w:lvlText w:val=""/>
       <w:lvlJc w:val="left"/>
     </w:lvl>
-    <w:lvl w:ilvl="2" w:tplc="6E309E3C">
+    <w:lvl w:ilvl="2" w:tplc="6ACED032">
       <w:numFmt w:val="decimal"/>
       <w:lvlText w:val=""/>
       <w:lvlJc w:val="left"/>
     </w:lvl>
-    <w:lvl w:ilvl="3" w:tplc="F048B2DA">
+    <w:lvl w:ilvl="3" w:tplc="BD68C6D0">
       <w:numFmt w:val="decimal"/>
       <w:lvlText w:val=""/>
       <w:lvlJc w:val="left"/>
     </w:lvl>
-    <w:lvl w:ilvl="4" w:tplc="D5B28CC8">
+    <w:lvl w:ilvl="4" w:tplc="A4EC6F56">
       <w:numFmt w:val="decimal"/>
       <w:lvlText w:val=""/>
       <w:lvlJc w:val="left"/>
     </w:lvl>
-    <w:lvl w:ilvl="5" w:tplc="364086C0">
+    <w:lvl w:ilvl="5" w:tplc="99CC9922">
       <w:numFmt w:val="decimal"/>
       <w:lvlText w:val=""/>
       <w:lvlJc w:val="left"/>
     </w:lvl>
-    <w:lvl w:ilvl="6" w:tplc="13C26C2A">
+    <w:lvl w:ilvl="6" w:tplc="5A4A3CC6">
       <w:numFmt w:val="decimal"/>
       <w:lvlText w:val=""/>
       <w:lvlJc w:val="left"/>
     </w:lvl>
-    <w:lvl w:ilvl="7" w:tplc="2954D550">
+    <w:lvl w:ilvl="7" w:tplc="F9720EB8">
       <w:numFmt w:val="decimal"/>
       <w:lvlText w:val=""/>
       <w:lvlJc w:val="left"/>
     </w:lvl>
-    <w:lvl w:ilvl="8" w:tplc="E50E0DC4">
+    <w:lvl w:ilvl="8" w:tplc="0126621A">
       <w:numFmt w:val="decimal"/>
       <w:lvlText w:val=""/>
       <w:lvlJc w:val="left"/>
     </w:lvl>
   </w:abstractNum>
   <w:abstractNum w:abstractNumId="2" w15:restartNumberingAfterBreak="0">
-    <w:nsid w:val="515C0F47"/>
+    <w:nsid w:val="5B99590A"/>
     <w:multiLevelType w:val="hybridMultilevel"/>
-    <w:tmpl w:val="70FA8C2C"/>
-    <w:lvl w:ilvl="0" w:tplc="0A827006">
+    <w:tmpl w:val="29D682EA"/>
+    <w:lvl w:ilvl="0" w:tplc="E9C48492">
       <w:start w:val="1"/>
       <w:numFmt w:val="bullet"/>
       <w:lvlText w:val="●"/>
@@ -30490,7 +30490,7 @@
         <w:ind w:left="720" w:hanging="360"/>
       </w:pPr>
     </w:lvl>
-    <w:lvl w:ilvl="1" w:tplc="214A7986">
+    <w:lvl w:ilvl="1" w:tplc="6220EFB6">
       <w:start w:val="1"/>
       <w:numFmt w:val="bullet"/>
       <w:lvlText w:val="○"/>
@@ -30499,7 +30499,7 @@
         <w:ind w:left="1440" w:hanging="360"/>
       </w:pPr>
     </w:lvl>
-    <w:lvl w:ilvl="2" w:tplc="9530E932">
+    <w:lvl w:ilvl="2" w:tplc="D4D44E54">
       <w:start w:val="1"/>
       <w:numFmt w:val="bullet"/>
       <w:lvlText w:val="■"/>
@@ -30508,7 +30508,7 @@
         <w:ind w:left="2160" w:hanging="360"/>
       </w:pPr>
     </w:lvl>
-    <w:lvl w:ilvl="3" w:tplc="DE2E3C3A">
+    <w:lvl w:ilvl="3" w:tplc="648A72CC">
       <w:start w:val="1"/>
       <w:numFmt w:val="bullet"/>
       <w:lvlText w:val="●"/>
@@ -30517,7 +30517,7 @@
         <w:ind w:left="2880" w:hanging="360"/>
       </w:pPr>
     </w:lvl>
-    <w:lvl w:ilvl="4" w:tplc="07DA9EF0">
+    <w:lvl w:ilvl="4" w:tplc="566AA25C">
       <w:start w:val="1"/>
       <w:numFmt w:val="bullet"/>
       <w:lvlText w:val="○"/>
@@ -30526,7 +30526,7 @@
         <w:ind w:left="3600" w:hanging="360"/>
       </w:pPr>
     </w:lvl>
-    <w:lvl w:ilvl="5" w:tplc="FF7AB35C">
+    <w:lvl w:ilvl="5" w:tplc="4E3E0F22">
       <w:start w:val="1"/>
       <w:numFmt w:val="bullet"/>
       <w:lvlText w:val="■"/>
@@ -30535,7 +30535,7 @@
         <w:ind w:left="4320" w:hanging="360"/>
       </w:pPr>
     </w:lvl>
-    <w:lvl w:ilvl="6" w:tplc="79589964">
+    <w:lvl w:ilvl="6" w:tplc="EF38CA34">
       <w:start w:val="1"/>
       <w:numFmt w:val="bullet"/>
       <w:lvlText w:val="●"/>
@@ -30544,7 +30544,7 @@
         <w:ind w:left="5040" w:hanging="360"/>
       </w:pPr>
     </w:lvl>
-    <w:lvl w:ilvl="7" w:tplc="0190341C">
+    <w:lvl w:ilvl="7" w:tplc="B148C8BA">
       <w:start w:val="1"/>
       <w:numFmt w:val="bullet"/>
       <w:lvlText w:val="●"/>
@@ -30553,7 +30553,7 @@
         <w:ind w:left="5760" w:hanging="360"/>
       </w:pPr>
     </w:lvl>
-    <w:lvl w:ilvl="8" w:tplc="6E7E58B8">
+    <w:lvl w:ilvl="8" w:tplc="3B325F6C">
       <w:start w:val="1"/>
       <w:numFmt w:val="bullet"/>
       <w:lvlText w:val="●"/>
@@ -30564,10 +30564,10 @@
     </w:lvl>
   </w:abstractNum>
   <w:abstractNum w:abstractNumId="3" w15:restartNumberingAfterBreak="0">
-    <w:nsid w:val="556422D5"/>
+    <w:nsid w:val="79672854"/>
     <w:multiLevelType w:val="hybridMultilevel"/>
-    <w:tmpl w:val="E416BBFC"/>
-    <w:lvl w:ilvl="0" w:tplc="60285742">
+    <w:tmpl w:val="D61A45F4"/>
+    <w:lvl w:ilvl="0" w:tplc="FF4824B4">
       <w:start w:val="1"/>
       <w:numFmt w:val="decimal"/>
       <w:lvlText w:val="%1."/>
@@ -30576,42 +30576,42 @@
         <w:ind w:left="560" w:hanging="280"/>
       </w:pPr>
     </w:lvl>
-    <w:lvl w:ilvl="1" w:tplc="06AEA66C">
+    <w:lvl w:ilvl="1" w:tplc="65246FDC">
       <w:numFmt w:val="decimal"/>
       <w:lvlText w:val=""/>
       <w:lvlJc w:val="left"/>
     </w:lvl>
-    <w:lvl w:ilvl="2" w:tplc="EF52BD44">
+    <w:lvl w:ilvl="2" w:tplc="A36AB6AC">
       <w:numFmt w:val="decimal"/>
       <w:lvlText w:val=""/>
       <w:lvlJc w:val="left"/>
     </w:lvl>
-    <w:lvl w:ilvl="3" w:tplc="5EA6A118">
+    <w:lvl w:ilvl="3" w:tplc="9DFEAB8C">
       <w:numFmt w:val="decimal"/>
       <w:lvlText w:val=""/>
       <w:lvlJc w:val="left"/>
     </w:lvl>
-    <w:lvl w:ilvl="4" w:tplc="A0707B5C">
+    <w:lvl w:ilvl="4" w:tplc="B38C6E08">
       <w:numFmt w:val="decimal"/>
       <w:lvlText w:val=""/>
       <w:lvlJc w:val="left"/>
     </w:lvl>
-    <w:lvl w:ilvl="5" w:tplc="D6CE33D6">
+    <w:lvl w:ilvl="5" w:tplc="A2D662EE">
       <w:numFmt w:val="decimal"/>
       <w:lvlText w:val=""/>
       <w:lvlJc w:val="left"/>
     </w:lvl>
-    <w:lvl w:ilvl="6" w:tplc="2AFEB9E6">
+    <w:lvl w:ilvl="6" w:tplc="A55097F0">
       <w:numFmt w:val="decimal"/>
       <w:lvlText w:val=""/>
       <w:lvlJc w:val="left"/>
     </w:lvl>
-    <w:lvl w:ilvl="7" w:tplc="2678563A">
+    <w:lvl w:ilvl="7" w:tplc="373EC134">
       <w:numFmt w:val="decimal"/>
       <w:lvlText w:val=""/>
       <w:lvlJc w:val="left"/>
     </w:lvl>
-    <w:lvl w:ilvl="8" w:tplc="872065BA">
+    <w:lvl w:ilvl="8" w:tplc="5C92D8BC">
       <w:numFmt w:val="decimal"/>
       <w:lvlText w:val=""/>
       <w:lvlJc w:val="left"/>
@@ -30630,13 +30630,13 @@
     </w:lvlOverride>
   </w:num>
   <w:num w:numId="3">
-    <w:abstractNumId w:val="3"/>
+    <w:abstractNumId w:val="1"/>
     <w:lvlOverride w:ilvl="0">
       <w:startOverride w:val="1"/>
     </w:lvlOverride>
   </w:num>
   <w:num w:numId="4">
-    <w:abstractNumId w:val="1"/>
+    <w:abstractNumId w:val="3"/>
     <w:lvlOverride w:ilvl="0">
       <w:startOverride w:val="1"/>
     </w:lvlOverride>
@@ -31257,7 +31257,7 @@
     <w:autoRedefine/>
     <w:uiPriority w:val="39"/>
     <w:unhideWhenUsed/>
-    <w:rsid w:val="001E0362"/>
+    <w:rsid w:val="00797A7D"/>
     <w:pPr>
       <w:spacing w:after="100"/>
     </w:pPr>
@@ -31269,7 +31269,7 @@
     <w:autoRedefine/>
     <w:uiPriority w:val="39"/>
     <w:unhideWhenUsed/>
-    <w:rsid w:val="001E0362"/>
+    <w:rsid w:val="00797A7D"/>
     <w:pPr>
       <w:spacing w:after="100"/>
       <w:ind w:left="220"/>
@@ -31282,7 +31282,7 @@
     <w:autoRedefine/>
     <w:uiPriority w:val="39"/>
     <w:unhideWhenUsed/>
-    <w:rsid w:val="001E0362"/>
+    <w:rsid w:val="00797A7D"/>
     <w:pPr>
       <w:spacing w:after="100"/>
       <w:ind w:left="440"/>

</xml_diff>

<commit_message>
docs: caratula con el logo institucional y sin marcadores en color
- Se incorpora el logo de la UTP en la portada del informe.
- Los campos pendientes pasan a negro, como el resto de la caratula.

Co-Authored-By: Claude Opus 5 (1M context) <noreply@anthropic.com>
</commit_message>
<xml_diff>
--- a/docs/Avance1-BiblioTech-UTP.docx
+++ b/docs/Avance1-BiblioTech-UTP.docx
@@ -2,8 +2,55 @@
 <file path=word/document.xml><?xml version="1.0" encoding="utf-8"?>
 <w:document xmlns:wpc="http://schemas.microsoft.com/office/word/2010/wordprocessingCanvas" xmlns:cx="http://schemas.microsoft.com/office/drawing/2014/chartex" xmlns:cx1="http://schemas.microsoft.com/office/drawing/2015/9/8/chartex" xmlns:cx2="http://schemas.microsoft.com/office/drawing/2015/10/21/chartex" xmlns:cx3="http://schemas.microsoft.com/office/drawing/2016/5/9/chartex" xmlns:cx4="http://schemas.microsoft.com/office/drawing/2016/5/10/chartex" xmlns:cx5="http://schemas.microsoft.com/office/drawing/2016/5/11/chartex" xmlns:cx6="http://schemas.microsoft.com/office/drawing/2016/5/12/chartex" xmlns:cx7="http://schemas.microsoft.com/office/drawing/2016/5/13/chartex" xmlns:cx8="http://schemas.microsoft.com/office/drawing/2016/5/14/chartex" xmlns:mc="http://schemas.openxmlformats.org/markup-compatibility/2006" xmlns:aink="http://schemas.microsoft.com/office/drawing/2016/ink" xmlns:am3d="http://schemas.microsoft.com/office/drawing/2017/model3d" xmlns:o="urn:schemas-microsoft-com:office:office" xmlns:r="http://schemas.openxmlformats.org/officeDocument/2006/relationships" xmlns:m="http://schemas.openxmlformats.org/officeDocument/2006/math" xmlns:v="urn:schemas-microsoft-com:vml" xmlns:wp14="http://schemas.microsoft.com/office/word/2010/wordprocessingDrawing" xmlns:wp="http://schemas.openxmlformats.org/drawingml/2006/wordprocessingDrawing" xmlns:w10="urn:schemas-microsoft-com:office:word" xmlns:w="http://schemas.openxmlformats.org/wordprocessingml/2006/main" xmlns:w14="http://schemas.microsoft.com/office/word/2010/wordml" xmlns:w15="http://schemas.microsoft.com/office/word/2012/wordml" xmlns:w16cex="http://schemas.microsoft.com/office/word/2018/wordml/cex" xmlns:w16cid="http://schemas.microsoft.com/office/word/2016/wordml/cid" xmlns:w16="http://schemas.microsoft.com/office/word/2018/wordml" xmlns:w16sdtdh="http://schemas.microsoft.com/office/word/2020/wordml/sdtdatahash" xmlns:w16se="http://schemas.microsoft.com/office/word/2015/wordml/symex" xmlns:wpg="http://schemas.microsoft.com/office/word/2010/wordprocessingGroup" xmlns:wpi="http://schemas.microsoft.com/office/word/2010/wordprocessingInk" xmlns:wne="http://schemas.microsoft.com/office/word/2006/wordml" xmlns:wps="http://schemas.microsoft.com/office/word/2010/wordprocessingShape" mc:Ignorable="w14 w15 w16se w16cid w16 w16cex w16sdtdh wp14">
   <w:body>
-    <w:p/>
-    <w:p/>
+    <w:p>
+      <w:pPr>
+        <w:spacing w:before="240" w:after="320"/>
+        <w:jc w:val="center"/>
+      </w:pPr>
+      <w:r>
+        <w:rPr>
+          <w:noProof/>
+        </w:rPr>
+        <w:drawing>
+          <wp:inline distT="0" distB="0" distL="0" distR="0" wp14:anchorId="0201CCE1" wp14:editId="1A1D8EA2">
+            <wp:extent cx="2190750" cy="828675"/>
+            <wp:effectExtent l="0" t="0" r="0" b="0"/>
+            <wp:docPr id="1" name="UTP" descr="Universidad Tecnológica del Perú" title="UTP"/>
+            <wp:cNvGraphicFramePr>
+              <a:graphicFrameLocks xmlns:a="http://schemas.openxmlformats.org/drawingml/2006/main" noChangeAspect="1"/>
+            </wp:cNvGraphicFramePr>
+            <a:graphic xmlns:a="http://schemas.openxmlformats.org/drawingml/2006/main">
+              <a:graphicData uri="http://schemas.openxmlformats.org/drawingml/2006/picture">
+                <pic:pic xmlns:pic="http://schemas.openxmlformats.org/drawingml/2006/picture">
+                  <pic:nvPicPr>
+                    <pic:cNvPr id="0" name=""/>
+                    <pic:cNvPicPr>
+                      <a:picLocks noChangeAspect="1" noChangeArrowheads="1"/>
+                    </pic:cNvPicPr>
+                  </pic:nvPicPr>
+                  <pic:blipFill>
+                    <a:blip r:embed="rId7"/>
+                    <a:srcRect/>
+                    <a:stretch>
+                      <a:fillRect/>
+                    </a:stretch>
+                  </pic:blipFill>
+                  <pic:spPr bwMode="auto">
+                    <a:xfrm>
+                      <a:off x="0" y="0"/>
+                      <a:ext cx="2190750" cy="828675"/>
+                    </a:xfrm>
+                    <a:prstGeom prst="rect">
+                      <a:avLst/>
+                    </a:prstGeom>
+                  </pic:spPr>
+                </pic:pic>
+              </a:graphicData>
+            </a:graphic>
+          </wp:inline>
+        </w:drawing>
+      </w:r>
+    </w:p>
     <w:p>
       <w:pPr>
         <w:spacing w:after="120" w:line="276" w:lineRule="auto"/>
@@ -28,9 +75,6 @@
       <w:r>
         <w:rPr>
           <w:rFonts w:ascii="Times New Roman" w:eastAsia="Times New Roman" w:hAnsi="Times New Roman" w:cs="Times New Roman"/>
-          <w:b/>
-          <w:bCs/>
-          <w:color w:val="1D4ED8"/>
           <w:sz w:val="24"/>
           <w:szCs w:val="24"/>
         </w:rPr>
@@ -42,9 +86,6 @@
       <w:r>
         <w:rPr>
           <w:rFonts w:ascii="Times New Roman" w:eastAsia="Times New Roman" w:hAnsi="Times New Roman" w:cs="Times New Roman"/>
-          <w:b/>
-          <w:bCs/>
-          <w:color w:val="1D4ED8"/>
           <w:sz w:val="24"/>
           <w:szCs w:val="24"/>
         </w:rPr>
@@ -187,9 +228,6 @@
       <w:r>
         <w:rPr>
           <w:rFonts w:ascii="Times New Roman" w:eastAsia="Times New Roman" w:hAnsi="Times New Roman" w:cs="Times New Roman"/>
-          <w:b/>
-          <w:bCs/>
-          <w:color w:val="1D4ED8"/>
           <w:sz w:val="24"/>
           <w:szCs w:val="24"/>
         </w:rPr>
@@ -216,9 +254,6 @@
       <w:r>
         <w:rPr>
           <w:rFonts w:ascii="Times New Roman" w:eastAsia="Times New Roman" w:hAnsi="Times New Roman" w:cs="Times New Roman"/>
-          <w:b/>
-          <w:bCs/>
-          <w:color w:val="1D4ED8"/>
           <w:sz w:val="24"/>
           <w:szCs w:val="24"/>
         </w:rPr>
@@ -227,9 +262,6 @@
       <w:r>
         <w:rPr>
           <w:rFonts w:ascii="Times New Roman" w:eastAsia="Times New Roman" w:hAnsi="Times New Roman" w:cs="Times New Roman"/>
-          <w:b/>
-          <w:bCs/>
-          <w:color w:val="1D4ED8"/>
           <w:sz w:val="24"/>
           <w:szCs w:val="24"/>
         </w:rPr>
@@ -288,7 +320,7 @@
     <w:sdt>
       <w:sdtPr>
         <w:alias w:val="Contenido"/>
-        <w:id w:val="-219677511"/>
+        <w:id w:val="-1538041622"/>
       </w:sdtPr>
       <w:sdtEndPr/>
       <w:sdtContent>
@@ -313,7 +345,7 @@
           <w:r>
             <w:fldChar w:fldCharType="separate"/>
           </w:r>
-          <w:hyperlink w:anchor="_Toc240377962" w:history="1">
+          <w:hyperlink w:anchor="_Toc240378444" w:history="1">
             <w:r>
               <w:rPr>
                 <w:rStyle w:val="Hipervnculo"/>
@@ -337,7 +369,7 @@
               <w:rPr>
                 <w:noProof/>
               </w:rPr>
-              <w:instrText xml:space="preserve"> PAGEREF _Toc240377962 \h </w:instrText>
+              <w:instrText xml:space="preserve"> PAGEREF _Toc240378444 \h </w:instrText>
             </w:r>
             <w:r>
               <w:rPr>
@@ -376,7 +408,7 @@
               <w:color w:val="auto"/>
             </w:rPr>
           </w:pPr>
-          <w:hyperlink w:anchor="_Toc240377963" w:history="1">
+          <w:hyperlink w:anchor="_Toc240378445" w:history="1">
             <w:r>
               <w:rPr>
                 <w:rStyle w:val="Hipervnculo"/>
@@ -400,7 +432,7 @@
               <w:rPr>
                 <w:noProof/>
               </w:rPr>
-              <w:instrText xml:space="preserve"> PAGEREF _Toc240377963 \h </w:instrText>
+              <w:instrText xml:space="preserve"> PAGEREF _Toc240378445 \h </w:instrText>
             </w:r>
             <w:r>
               <w:rPr>
@@ -439,7 +471,7 @@
               <w:color w:val="auto"/>
             </w:rPr>
           </w:pPr>
-          <w:hyperlink w:anchor="_Toc240377964" w:history="1">
+          <w:hyperlink w:anchor="_Toc240378446" w:history="1">
             <w:r>
               <w:rPr>
                 <w:rStyle w:val="Hipervnculo"/>
@@ -463,7 +495,7 @@
               <w:rPr>
                 <w:noProof/>
               </w:rPr>
-              <w:instrText xml:space="preserve"> PAGEREF _Toc240377964 \h </w:instrText>
+              <w:instrText xml:space="preserve"> PAGEREF _Toc240378446 \h </w:instrText>
             </w:r>
             <w:r>
               <w:rPr>
@@ -502,7 +534,7 @@
               <w:color w:val="auto"/>
             </w:rPr>
           </w:pPr>
-          <w:hyperlink w:anchor="_Toc240377965" w:history="1">
+          <w:hyperlink w:anchor="_Toc240378447" w:history="1">
             <w:r>
               <w:rPr>
                 <w:rStyle w:val="Hipervnculo"/>
@@ -526,7 +558,7 @@
               <w:rPr>
                 <w:noProof/>
               </w:rPr>
-              <w:instrText xml:space="preserve"> PAGEREF _Toc240377965 \h </w:instrText>
+              <w:instrText xml:space="preserve"> PAGEREF _Toc240378447 \h </w:instrText>
             </w:r>
             <w:r>
               <w:rPr>
@@ -565,7 +597,7 @@
               <w:color w:val="auto"/>
             </w:rPr>
           </w:pPr>
-          <w:hyperlink w:anchor="_Toc240377966" w:history="1">
+          <w:hyperlink w:anchor="_Toc240378448" w:history="1">
             <w:r>
               <w:rPr>
                 <w:rStyle w:val="Hipervnculo"/>
@@ -589,7 +621,7 @@
               <w:rPr>
                 <w:noProof/>
               </w:rPr>
-              <w:instrText xml:space="preserve"> PAGEREF _Toc240377966 \h </w:instrText>
+              <w:instrText xml:space="preserve"> PAGEREF _Toc240378448 \h </w:instrText>
             </w:r>
             <w:r>
               <w:rPr>
@@ -628,7 +660,7 @@
               <w:color w:val="auto"/>
             </w:rPr>
           </w:pPr>
-          <w:hyperlink w:anchor="_Toc240377967" w:history="1">
+          <w:hyperlink w:anchor="_Toc240378449" w:history="1">
             <w:r>
               <w:rPr>
                 <w:rStyle w:val="Hipervnculo"/>
@@ -652,7 +684,7 @@
               <w:rPr>
                 <w:noProof/>
               </w:rPr>
-              <w:instrText xml:space="preserve"> PAGEREF _Toc240377967 \h </w:instrText>
+              <w:instrText xml:space="preserve"> PAGEREF _Toc240378449 \h </w:instrText>
             </w:r>
             <w:r>
               <w:rPr>
@@ -691,7 +723,7 @@
               <w:color w:val="auto"/>
             </w:rPr>
           </w:pPr>
-          <w:hyperlink w:anchor="_Toc240377968" w:history="1">
+          <w:hyperlink w:anchor="_Toc240378450" w:history="1">
             <w:r>
               <w:rPr>
                 <w:rStyle w:val="Hipervnculo"/>
@@ -715,7 +747,7 @@
               <w:rPr>
                 <w:noProof/>
               </w:rPr>
-              <w:instrText xml:space="preserve"> PAGEREF _Toc240377968 \h </w:instrText>
+              <w:instrText xml:space="preserve"> PAGEREF _Toc240378450 \h </w:instrText>
             </w:r>
             <w:r>
               <w:rPr>
@@ -754,7 +786,7 @@
               <w:color w:val="auto"/>
             </w:rPr>
           </w:pPr>
-          <w:hyperlink w:anchor="_Toc240377969" w:history="1">
+          <w:hyperlink w:anchor="_Toc240378451" w:history="1">
             <w:r>
               <w:rPr>
                 <w:rStyle w:val="Hipervnculo"/>
@@ -778,7 +810,7 @@
               <w:rPr>
                 <w:noProof/>
               </w:rPr>
-              <w:instrText xml:space="preserve"> PAGEREF _Toc240377969 \h </w:instrText>
+              <w:instrText xml:space="preserve"> PAGEREF _Toc240378451 \h </w:instrText>
             </w:r>
             <w:r>
               <w:rPr>
@@ -817,7 +849,7 @@
               <w:color w:val="auto"/>
             </w:rPr>
           </w:pPr>
-          <w:hyperlink w:anchor="_Toc240377970" w:history="1">
+          <w:hyperlink w:anchor="_Toc240378452" w:history="1">
             <w:r>
               <w:rPr>
                 <w:rStyle w:val="Hipervnculo"/>
@@ -841,7 +873,7 @@
               <w:rPr>
                 <w:noProof/>
               </w:rPr>
-              <w:instrText xml:space="preserve"> PAGEREF _Toc240377970 \h </w:instrText>
+              <w:instrText xml:space="preserve"> PAGEREF _Toc240378452 \h </w:instrText>
             </w:r>
             <w:r>
               <w:rPr>
@@ -880,7 +912,7 @@
               <w:color w:val="auto"/>
             </w:rPr>
           </w:pPr>
-          <w:hyperlink w:anchor="_Toc240377971" w:history="1">
+          <w:hyperlink w:anchor="_Toc240378453" w:history="1">
             <w:r>
               <w:rPr>
                 <w:rStyle w:val="Hipervnculo"/>
@@ -904,7 +936,7 @@
               <w:rPr>
                 <w:noProof/>
               </w:rPr>
-              <w:instrText xml:space="preserve"> PAGEREF _Toc240377971 \h </w:instrText>
+              <w:instrText xml:space="preserve"> PAGEREF _Toc240378453 \h </w:instrText>
             </w:r>
             <w:r>
               <w:rPr>
@@ -943,7 +975,7 @@
               <w:color w:val="auto"/>
             </w:rPr>
           </w:pPr>
-          <w:hyperlink w:anchor="_Toc240377972" w:history="1">
+          <w:hyperlink w:anchor="_Toc240378454" w:history="1">
             <w:r>
               <w:rPr>
                 <w:rStyle w:val="Hipervnculo"/>
@@ -967,7 +999,7 @@
               <w:rPr>
                 <w:noProof/>
               </w:rPr>
-              <w:instrText xml:space="preserve"> PAGEREF _Toc240377972 \h </w:instrText>
+              <w:instrText xml:space="preserve"> PAGEREF _Toc240378454 \h </w:instrText>
             </w:r>
             <w:r>
               <w:rPr>
@@ -1006,7 +1038,7 @@
               <w:color w:val="auto"/>
             </w:rPr>
           </w:pPr>
-          <w:hyperlink w:anchor="_Toc240377973" w:history="1">
+          <w:hyperlink w:anchor="_Toc240378455" w:history="1">
             <w:r>
               <w:rPr>
                 <w:rStyle w:val="Hipervnculo"/>
@@ -1030,7 +1062,7 @@
               <w:rPr>
                 <w:noProof/>
               </w:rPr>
-              <w:instrText xml:space="preserve"> PAGEREF _Toc240377973 \h </w:instrText>
+              <w:instrText xml:space="preserve"> PAGEREF _Toc240378455 \h </w:instrText>
             </w:r>
             <w:r>
               <w:rPr>
@@ -1069,7 +1101,7 @@
               <w:color w:val="auto"/>
             </w:rPr>
           </w:pPr>
-          <w:hyperlink w:anchor="_Toc240377974" w:history="1">
+          <w:hyperlink w:anchor="_Toc240378456" w:history="1">
             <w:r>
               <w:rPr>
                 <w:rStyle w:val="Hipervnculo"/>
@@ -1093,7 +1125,7 @@
               <w:rPr>
                 <w:noProof/>
               </w:rPr>
-              <w:instrText xml:space="preserve"> PAGEREF _Toc240377974 \h </w:instrText>
+              <w:instrText xml:space="preserve"> PAGEREF _Toc240378456 \h </w:instrText>
             </w:r>
             <w:r>
               <w:rPr>
@@ -1132,7 +1164,7 @@
               <w:color w:val="auto"/>
             </w:rPr>
           </w:pPr>
-          <w:hyperlink w:anchor="_Toc240377975" w:history="1">
+          <w:hyperlink w:anchor="_Toc240378457" w:history="1">
             <w:r>
               <w:rPr>
                 <w:rStyle w:val="Hipervnculo"/>
@@ -1156,7 +1188,7 @@
               <w:rPr>
                 <w:noProof/>
               </w:rPr>
-              <w:instrText xml:space="preserve"> PAGEREF _Toc240377975 \h </w:instrText>
+              <w:instrText xml:space="preserve"> PAGEREF _Toc240378457 \h </w:instrText>
             </w:r>
             <w:r>
               <w:rPr>
@@ -1195,7 +1227,7 @@
               <w:color w:val="auto"/>
             </w:rPr>
           </w:pPr>
-          <w:hyperlink w:anchor="_Toc240377976" w:history="1">
+          <w:hyperlink w:anchor="_Toc240378458" w:history="1">
             <w:r>
               <w:rPr>
                 <w:rStyle w:val="Hipervnculo"/>
@@ -1219,7 +1251,7 @@
               <w:rPr>
                 <w:noProof/>
               </w:rPr>
-              <w:instrText xml:space="preserve"> PAGEREF _Toc240377976 \h </w:instrText>
+              <w:instrText xml:space="preserve"> PAGEREF _Toc240378458 \h </w:instrText>
             </w:r>
             <w:r>
               <w:rPr>
@@ -1258,7 +1290,7 @@
               <w:color w:val="auto"/>
             </w:rPr>
           </w:pPr>
-          <w:hyperlink w:anchor="_Toc240377977" w:history="1">
+          <w:hyperlink w:anchor="_Toc240378459" w:history="1">
             <w:r>
               <w:rPr>
                 <w:rStyle w:val="Hipervnculo"/>
@@ -1282,7 +1314,7 @@
               <w:rPr>
                 <w:noProof/>
               </w:rPr>
-              <w:instrText xml:space="preserve"> PAGEREF _Toc240377977 \h </w:instrText>
+              <w:instrText xml:space="preserve"> PAGEREF _Toc240378459 \h </w:instrText>
             </w:r>
             <w:r>
               <w:rPr>
@@ -1321,7 +1353,7 @@
               <w:color w:val="auto"/>
             </w:rPr>
           </w:pPr>
-          <w:hyperlink w:anchor="_Toc240377978" w:history="1">
+          <w:hyperlink w:anchor="_Toc240378460" w:history="1">
             <w:r>
               <w:rPr>
                 <w:rStyle w:val="Hipervnculo"/>
@@ -1345,7 +1377,7 @@
               <w:rPr>
                 <w:noProof/>
               </w:rPr>
-              <w:instrText xml:space="preserve"> PAGEREF _Toc240377978 \h </w:instrText>
+              <w:instrText xml:space="preserve"> PAGEREF _Toc240378460 \h </w:instrText>
             </w:r>
             <w:r>
               <w:rPr>
@@ -1384,7 +1416,7 @@
               <w:color w:val="auto"/>
             </w:rPr>
           </w:pPr>
-          <w:hyperlink w:anchor="_Toc240377979" w:history="1">
+          <w:hyperlink w:anchor="_Toc240378461" w:history="1">
             <w:r>
               <w:rPr>
                 <w:rStyle w:val="Hipervnculo"/>
@@ -1408,7 +1440,7 @@
               <w:rPr>
                 <w:noProof/>
               </w:rPr>
-              <w:instrText xml:space="preserve"> PAGEREF _Toc240377979 \h </w:instrText>
+              <w:instrText xml:space="preserve"> PAGEREF _Toc240378461 \h </w:instrText>
             </w:r>
             <w:r>
               <w:rPr>
@@ -1447,7 +1479,7 @@
               <w:color w:val="auto"/>
             </w:rPr>
           </w:pPr>
-          <w:hyperlink w:anchor="_Toc240377980" w:history="1">
+          <w:hyperlink w:anchor="_Toc240378462" w:history="1">
             <w:r>
               <w:rPr>
                 <w:rStyle w:val="Hipervnculo"/>
@@ -1471,7 +1503,7 @@
               <w:rPr>
                 <w:noProof/>
               </w:rPr>
-              <w:instrText xml:space="preserve"> PAGEREF _Toc240377980 \h </w:instrText>
+              <w:instrText xml:space="preserve"> PAGEREF _Toc240378462 \h </w:instrText>
             </w:r>
             <w:r>
               <w:rPr>
@@ -1510,7 +1542,7 @@
               <w:color w:val="auto"/>
             </w:rPr>
           </w:pPr>
-          <w:hyperlink w:anchor="_Toc240377981" w:history="1">
+          <w:hyperlink w:anchor="_Toc240378463" w:history="1">
             <w:r>
               <w:rPr>
                 <w:rStyle w:val="Hipervnculo"/>
@@ -1534,7 +1566,7 @@
               <w:rPr>
                 <w:noProof/>
               </w:rPr>
-              <w:instrText xml:space="preserve"> PAGEREF _Toc240377981 \h </w:instrText>
+              <w:instrText xml:space="preserve"> PAGEREF _Toc240378463 \h </w:instrText>
             </w:r>
             <w:r>
               <w:rPr>
@@ -1573,7 +1605,7 @@
               <w:color w:val="auto"/>
             </w:rPr>
           </w:pPr>
-          <w:hyperlink w:anchor="_Toc240377982" w:history="1">
+          <w:hyperlink w:anchor="_Toc240378464" w:history="1">
             <w:r>
               <w:rPr>
                 <w:rStyle w:val="Hipervnculo"/>
@@ -1597,7 +1629,7 @@
               <w:rPr>
                 <w:noProof/>
               </w:rPr>
-              <w:instrText xml:space="preserve"> PAGEREF _Toc240377982 \h </w:instrText>
+              <w:instrText xml:space="preserve"> PAGEREF _Toc240378464 \h </w:instrText>
             </w:r>
             <w:r>
               <w:rPr>
@@ -1636,7 +1668,7 @@
               <w:color w:val="auto"/>
             </w:rPr>
           </w:pPr>
-          <w:hyperlink w:anchor="_Toc240377983" w:history="1">
+          <w:hyperlink w:anchor="_Toc240378465" w:history="1">
             <w:r>
               <w:rPr>
                 <w:rStyle w:val="Hipervnculo"/>
@@ -1660,7 +1692,7 @@
               <w:rPr>
                 <w:noProof/>
               </w:rPr>
-              <w:instrText xml:space="preserve"> PAGEREF _Toc240377983 \h </w:instrText>
+              <w:instrText xml:space="preserve"> PAGEREF _Toc240378465 \h </w:instrText>
             </w:r>
             <w:r>
               <w:rPr>
@@ -1699,7 +1731,7 @@
               <w:color w:val="auto"/>
             </w:rPr>
           </w:pPr>
-          <w:hyperlink w:anchor="_Toc240377984" w:history="1">
+          <w:hyperlink w:anchor="_Toc240378466" w:history="1">
             <w:r>
               <w:rPr>
                 <w:rStyle w:val="Hipervnculo"/>
@@ -1723,7 +1755,7 @@
               <w:rPr>
                 <w:noProof/>
               </w:rPr>
-              <w:instrText xml:space="preserve"> PAGEREF _Toc240377984 \h </w:instrText>
+              <w:instrText xml:space="preserve"> PAGEREF _Toc240378466 \h </w:instrText>
             </w:r>
             <w:r>
               <w:rPr>
@@ -1762,7 +1794,7 @@
               <w:color w:val="auto"/>
             </w:rPr>
           </w:pPr>
-          <w:hyperlink w:anchor="_Toc240377985" w:history="1">
+          <w:hyperlink w:anchor="_Toc240378467" w:history="1">
             <w:r>
               <w:rPr>
                 <w:rStyle w:val="Hipervnculo"/>
@@ -1786,7 +1818,7 @@
               <w:rPr>
                 <w:noProof/>
               </w:rPr>
-              <w:instrText xml:space="preserve"> PAGEREF _Toc240377985 \h </w:instrText>
+              <w:instrText xml:space="preserve"> PAGEREF _Toc240378467 \h </w:instrText>
             </w:r>
             <w:r>
               <w:rPr>
@@ -1825,7 +1857,7 @@
               <w:color w:val="auto"/>
             </w:rPr>
           </w:pPr>
-          <w:hyperlink w:anchor="_Toc240377986" w:history="1">
+          <w:hyperlink w:anchor="_Toc240378468" w:history="1">
             <w:r>
               <w:rPr>
                 <w:rStyle w:val="Hipervnculo"/>
@@ -1849,7 +1881,7 @@
               <w:rPr>
                 <w:noProof/>
               </w:rPr>
-              <w:instrText xml:space="preserve"> PAGEREF _Toc240377986 \h </w:instrText>
+              <w:instrText xml:space="preserve"> PAGEREF _Toc240378468 \h </w:instrText>
             </w:r>
             <w:r>
               <w:rPr>
@@ -1888,7 +1920,7 @@
               <w:color w:val="auto"/>
             </w:rPr>
           </w:pPr>
-          <w:hyperlink w:anchor="_Toc240377987" w:history="1">
+          <w:hyperlink w:anchor="_Toc240378469" w:history="1">
             <w:r>
               <w:rPr>
                 <w:rStyle w:val="Hipervnculo"/>
@@ -1912,7 +1944,7 @@
               <w:rPr>
                 <w:noProof/>
               </w:rPr>
-              <w:instrText xml:space="preserve"> PAGEREF _Toc240377987 \h </w:instrText>
+              <w:instrText xml:space="preserve"> PAGEREF _Toc240378469 \h </w:instrText>
             </w:r>
             <w:r>
               <w:rPr>
@@ -1951,7 +1983,7 @@
               <w:color w:val="auto"/>
             </w:rPr>
           </w:pPr>
-          <w:hyperlink w:anchor="_Toc240377988" w:history="1">
+          <w:hyperlink w:anchor="_Toc240378470" w:history="1">
             <w:r>
               <w:rPr>
                 <w:rStyle w:val="Hipervnculo"/>
@@ -1975,7 +2007,7 @@
               <w:rPr>
                 <w:noProof/>
               </w:rPr>
-              <w:instrText xml:space="preserve"> PAGEREF _Toc240377988 \h </w:instrText>
+              <w:instrText xml:space="preserve"> PAGEREF _Toc240378470 \h </w:instrText>
             </w:r>
             <w:r>
               <w:rPr>
@@ -2014,7 +2046,7 @@
               <w:color w:val="auto"/>
             </w:rPr>
           </w:pPr>
-          <w:hyperlink w:anchor="_Toc240377989" w:history="1">
+          <w:hyperlink w:anchor="_Toc240378471" w:history="1">
             <w:r>
               <w:rPr>
                 <w:rStyle w:val="Hipervnculo"/>
@@ -2038,7 +2070,7 @@
               <w:rPr>
                 <w:noProof/>
               </w:rPr>
-              <w:instrText xml:space="preserve"> PAGEREF _Toc240377989 \h </w:instrText>
+              <w:instrText xml:space="preserve"> PAGEREF _Toc240378471 \h </w:instrText>
             </w:r>
             <w:r>
               <w:rPr>
@@ -2077,7 +2109,7 @@
               <w:color w:val="auto"/>
             </w:rPr>
           </w:pPr>
-          <w:hyperlink w:anchor="_Toc240377990" w:history="1">
+          <w:hyperlink w:anchor="_Toc240378472" w:history="1">
             <w:r>
               <w:rPr>
                 <w:rStyle w:val="Hipervnculo"/>
@@ -2101,7 +2133,7 @@
               <w:rPr>
                 <w:noProof/>
               </w:rPr>
-              <w:instrText xml:space="preserve"> PAGEREF _Toc240377990 \h </w:instrText>
+              <w:instrText xml:space="preserve"> PAGEREF _Toc240378472 \h </w:instrText>
             </w:r>
             <w:r>
               <w:rPr>
@@ -2140,7 +2172,7 @@
               <w:color w:val="auto"/>
             </w:rPr>
           </w:pPr>
-          <w:hyperlink w:anchor="_Toc240377991" w:history="1">
+          <w:hyperlink w:anchor="_Toc240378473" w:history="1">
             <w:r>
               <w:rPr>
                 <w:rStyle w:val="Hipervnculo"/>
@@ -2164,7 +2196,7 @@
               <w:rPr>
                 <w:noProof/>
               </w:rPr>
-              <w:instrText xml:space="preserve"> PAGEREF _Toc240377991 \h </w:instrText>
+              <w:instrText xml:space="preserve"> PAGEREF _Toc240378473 \h </w:instrText>
             </w:r>
             <w:r>
               <w:rPr>
@@ -2203,7 +2235,7 @@
               <w:color w:val="auto"/>
             </w:rPr>
           </w:pPr>
-          <w:hyperlink w:anchor="_Toc240377992" w:history="1">
+          <w:hyperlink w:anchor="_Toc240378474" w:history="1">
             <w:r>
               <w:rPr>
                 <w:rStyle w:val="Hipervnculo"/>
@@ -2227,7 +2259,7 @@
               <w:rPr>
                 <w:noProof/>
               </w:rPr>
-              <w:instrText xml:space="preserve"> PAGEREF _Toc240377992 \h </w:instrText>
+              <w:instrText xml:space="preserve"> PAGEREF _Toc240378474 \h </w:instrText>
             </w:r>
             <w:r>
               <w:rPr>
@@ -2266,7 +2298,7 @@
               <w:color w:val="auto"/>
             </w:rPr>
           </w:pPr>
-          <w:hyperlink w:anchor="_Toc240377993" w:history="1">
+          <w:hyperlink w:anchor="_Toc240378475" w:history="1">
             <w:r>
               <w:rPr>
                 <w:rStyle w:val="Hipervnculo"/>
@@ -2290,7 +2322,7 @@
               <w:rPr>
                 <w:noProof/>
               </w:rPr>
-              <w:instrText xml:space="preserve"> PAGEREF _Toc240377993 \h </w:instrText>
+              <w:instrText xml:space="preserve"> PAGEREF _Toc240378475 \h </w:instrText>
             </w:r>
             <w:r>
               <w:rPr>
@@ -2329,7 +2361,7 @@
               <w:color w:val="auto"/>
             </w:rPr>
           </w:pPr>
-          <w:hyperlink w:anchor="_Toc240377994" w:history="1">
+          <w:hyperlink w:anchor="_Toc240378476" w:history="1">
             <w:r>
               <w:rPr>
                 <w:rStyle w:val="Hipervnculo"/>
@@ -2353,7 +2385,7 @@
               <w:rPr>
                 <w:noProof/>
               </w:rPr>
-              <w:instrText xml:space="preserve"> PAGEREF _Toc240377994 \h </w:instrText>
+              <w:instrText xml:space="preserve"> PAGEREF _Toc240378476 \h </w:instrText>
             </w:r>
             <w:r>
               <w:rPr>
@@ -2392,7 +2424,7 @@
               <w:color w:val="auto"/>
             </w:rPr>
           </w:pPr>
-          <w:hyperlink w:anchor="_Toc240377995" w:history="1">
+          <w:hyperlink w:anchor="_Toc240378477" w:history="1">
             <w:r>
               <w:rPr>
                 <w:rStyle w:val="Hipervnculo"/>
@@ -2416,7 +2448,7 @@
               <w:rPr>
                 <w:noProof/>
               </w:rPr>
-              <w:instrText xml:space="preserve"> PAGEREF _Toc240377995 \h </w:instrText>
+              <w:instrText xml:space="preserve"> PAGEREF _Toc240378477 \h </w:instrText>
             </w:r>
             <w:r>
               <w:rPr>
@@ -2455,7 +2487,7 @@
               <w:color w:val="auto"/>
             </w:rPr>
           </w:pPr>
-          <w:hyperlink w:anchor="_Toc240377996" w:history="1">
+          <w:hyperlink w:anchor="_Toc240378478" w:history="1">
             <w:r>
               <w:rPr>
                 <w:rStyle w:val="Hipervnculo"/>
@@ -2479,7 +2511,7 @@
               <w:rPr>
                 <w:noProof/>
               </w:rPr>
-              <w:instrText xml:space="preserve"> PAGEREF _Toc240377996 \h </w:instrText>
+              <w:instrText xml:space="preserve"> PAGEREF _Toc240378478 \h </w:instrText>
             </w:r>
             <w:r>
               <w:rPr>
@@ -2518,7 +2550,7 @@
               <w:color w:val="auto"/>
             </w:rPr>
           </w:pPr>
-          <w:hyperlink w:anchor="_Toc240377997" w:history="1">
+          <w:hyperlink w:anchor="_Toc240378479" w:history="1">
             <w:r>
               <w:rPr>
                 <w:rStyle w:val="Hipervnculo"/>
@@ -2542,7 +2574,7 @@
               <w:rPr>
                 <w:noProof/>
               </w:rPr>
-              <w:instrText xml:space="preserve"> PAGEREF _Toc240377997 \h </w:instrText>
+              <w:instrText xml:space="preserve"> PAGEREF _Toc240378479 \h </w:instrText>
             </w:r>
             <w:r>
               <w:rPr>
@@ -2581,7 +2613,7 @@
               <w:color w:val="auto"/>
             </w:rPr>
           </w:pPr>
-          <w:hyperlink w:anchor="_Toc240377998" w:history="1">
+          <w:hyperlink w:anchor="_Toc240378480" w:history="1">
             <w:r>
               <w:rPr>
                 <w:rStyle w:val="Hipervnculo"/>
@@ -2605,7 +2637,7 @@
               <w:rPr>
                 <w:noProof/>
               </w:rPr>
-              <w:instrText xml:space="preserve"> PAGEREF _Toc240377998 \h </w:instrText>
+              <w:instrText xml:space="preserve"> PAGEREF _Toc240378480 \h </w:instrText>
             </w:r>
             <w:r>
               <w:rPr>
@@ -2644,7 +2676,7 @@
               <w:color w:val="auto"/>
             </w:rPr>
           </w:pPr>
-          <w:hyperlink w:anchor="_Toc240377999" w:history="1">
+          <w:hyperlink w:anchor="_Toc240378481" w:history="1">
             <w:r>
               <w:rPr>
                 <w:rStyle w:val="Hipervnculo"/>
@@ -2668,7 +2700,7 @@
               <w:rPr>
                 <w:noProof/>
               </w:rPr>
-              <w:instrText xml:space="preserve"> PAGEREF _Toc240377999 \h </w:instrText>
+              <w:instrText xml:space="preserve"> PAGEREF _Toc240378481 \h </w:instrText>
             </w:r>
             <w:r>
               <w:rPr>
@@ -2707,7 +2739,7 @@
               <w:color w:val="auto"/>
             </w:rPr>
           </w:pPr>
-          <w:hyperlink w:anchor="_Toc240378000" w:history="1">
+          <w:hyperlink w:anchor="_Toc240378482" w:history="1">
             <w:r>
               <w:rPr>
                 <w:rStyle w:val="Hipervnculo"/>
@@ -2731,7 +2763,7 @@
               <w:rPr>
                 <w:noProof/>
               </w:rPr>
-              <w:instrText xml:space="preserve"> PAGEREF _Toc240378000 \h </w:instrText>
+              <w:instrText xml:space="preserve"> PAGEREF _Toc240378482 \h </w:instrText>
             </w:r>
             <w:r>
               <w:rPr>
@@ -2770,7 +2802,7 @@
               <w:color w:val="auto"/>
             </w:rPr>
           </w:pPr>
-          <w:hyperlink w:anchor="_Toc240378001" w:history="1">
+          <w:hyperlink w:anchor="_Toc240378483" w:history="1">
             <w:r>
               <w:rPr>
                 <w:rStyle w:val="Hipervnculo"/>
@@ -2794,7 +2826,7 @@
               <w:rPr>
                 <w:noProof/>
               </w:rPr>
-              <w:instrText xml:space="preserve"> PAGEREF _Toc240378001 \h </w:instrText>
+              <w:instrText xml:space="preserve"> PAGEREF _Toc240378483 \h </w:instrText>
             </w:r>
             <w:r>
               <w:rPr>
@@ -2833,7 +2865,7 @@
               <w:color w:val="auto"/>
             </w:rPr>
           </w:pPr>
-          <w:hyperlink w:anchor="_Toc240378002" w:history="1">
+          <w:hyperlink w:anchor="_Toc240378484" w:history="1">
             <w:r>
               <w:rPr>
                 <w:rStyle w:val="Hipervnculo"/>
@@ -2857,7 +2889,7 @@
               <w:rPr>
                 <w:noProof/>
               </w:rPr>
-              <w:instrText xml:space="preserve"> PAGEREF _Toc240378002 \h </w:instrText>
+              <w:instrText xml:space="preserve"> PAGEREF _Toc240378484 \h </w:instrText>
             </w:r>
             <w:r>
               <w:rPr>
@@ -2896,7 +2928,7 @@
               <w:color w:val="auto"/>
             </w:rPr>
           </w:pPr>
-          <w:hyperlink w:anchor="_Toc240378003" w:history="1">
+          <w:hyperlink w:anchor="_Toc240378485" w:history="1">
             <w:r>
               <w:rPr>
                 <w:rStyle w:val="Hipervnculo"/>
@@ -2920,7 +2952,7 @@
               <w:rPr>
                 <w:noProof/>
               </w:rPr>
-              <w:instrText xml:space="preserve"> PAGEREF _Toc240378003 \h </w:instrText>
+              <w:instrText xml:space="preserve"> PAGEREF _Toc240378485 \h </w:instrText>
             </w:r>
             <w:r>
               <w:rPr>
@@ -2959,7 +2991,7 @@
               <w:color w:val="auto"/>
             </w:rPr>
           </w:pPr>
-          <w:hyperlink w:anchor="_Toc240378004" w:history="1">
+          <w:hyperlink w:anchor="_Toc240378486" w:history="1">
             <w:r>
               <w:rPr>
                 <w:rStyle w:val="Hipervnculo"/>
@@ -2983,7 +3015,7 @@
               <w:rPr>
                 <w:noProof/>
               </w:rPr>
-              <w:instrText xml:space="preserve"> PAGEREF _Toc240378004 \h </w:instrText>
+              <w:instrText xml:space="preserve"> PAGEREF _Toc240378486 \h </w:instrText>
             </w:r>
             <w:r>
               <w:rPr>
@@ -3022,7 +3054,7 @@
               <w:color w:val="auto"/>
             </w:rPr>
           </w:pPr>
-          <w:hyperlink w:anchor="_Toc240378005" w:history="1">
+          <w:hyperlink w:anchor="_Toc240378487" w:history="1">
             <w:r>
               <w:rPr>
                 <w:rStyle w:val="Hipervnculo"/>
@@ -3046,7 +3078,7 @@
               <w:rPr>
                 <w:noProof/>
               </w:rPr>
-              <w:instrText xml:space="preserve"> PAGEREF _Toc240378005 \h </w:instrText>
+              <w:instrText xml:space="preserve"> PAGEREF _Toc240378487 \h </w:instrText>
             </w:r>
             <w:r>
               <w:rPr>
@@ -3085,7 +3117,7 @@
               <w:color w:val="auto"/>
             </w:rPr>
           </w:pPr>
-          <w:hyperlink w:anchor="_Toc240378006" w:history="1">
+          <w:hyperlink w:anchor="_Toc240378488" w:history="1">
             <w:r>
               <w:rPr>
                 <w:rStyle w:val="Hipervnculo"/>
@@ -3109,7 +3141,7 @@
               <w:rPr>
                 <w:noProof/>
               </w:rPr>
-              <w:instrText xml:space="preserve"> PAGEREF _Toc240378006 \h </w:instrText>
+              <w:instrText xml:space="preserve"> PAGEREF _Toc240378488 \h </w:instrText>
             </w:r>
             <w:r>
               <w:rPr>
@@ -3148,7 +3180,7 @@
               <w:color w:val="auto"/>
             </w:rPr>
           </w:pPr>
-          <w:hyperlink w:anchor="_Toc240378007" w:history="1">
+          <w:hyperlink w:anchor="_Toc240378489" w:history="1">
             <w:r>
               <w:rPr>
                 <w:rStyle w:val="Hipervnculo"/>
@@ -3172,7 +3204,7 @@
               <w:rPr>
                 <w:noProof/>
               </w:rPr>
-              <w:instrText xml:space="preserve"> PAGEREF _Toc240378007 \h </w:instrText>
+              <w:instrText xml:space="preserve"> PAGEREF _Toc240378489 \h </w:instrText>
             </w:r>
             <w:r>
               <w:rPr>
@@ -3211,7 +3243,7 @@
               <w:color w:val="auto"/>
             </w:rPr>
           </w:pPr>
-          <w:hyperlink w:anchor="_Toc240378008" w:history="1">
+          <w:hyperlink w:anchor="_Toc240378490" w:history="1">
             <w:r>
               <w:rPr>
                 <w:rStyle w:val="Hipervnculo"/>
@@ -3235,7 +3267,7 @@
               <w:rPr>
                 <w:noProof/>
               </w:rPr>
-              <w:instrText xml:space="preserve"> PAGEREF _Toc240378008 \h </w:instrText>
+              <w:instrText xml:space="preserve"> PAGEREF _Toc240378490 \h </w:instrText>
             </w:r>
             <w:r>
               <w:rPr>
@@ -3274,7 +3306,7 @@
               <w:color w:val="auto"/>
             </w:rPr>
           </w:pPr>
-          <w:hyperlink w:anchor="_Toc240378009" w:history="1">
+          <w:hyperlink w:anchor="_Toc240378491" w:history="1">
             <w:r>
               <w:rPr>
                 <w:rStyle w:val="Hipervnculo"/>
@@ -3298,7 +3330,7 @@
               <w:rPr>
                 <w:noProof/>
               </w:rPr>
-              <w:instrText xml:space="preserve"> PAGEREF _Toc240378009 \h </w:instrText>
+              <w:instrText xml:space="preserve"> PAGEREF _Toc240378491 \h </w:instrText>
             </w:r>
             <w:r>
               <w:rPr>
@@ -3337,7 +3369,7 @@
               <w:color w:val="auto"/>
             </w:rPr>
           </w:pPr>
-          <w:hyperlink w:anchor="_Toc240378010" w:history="1">
+          <w:hyperlink w:anchor="_Toc240378492" w:history="1">
             <w:r>
               <w:rPr>
                 <w:rStyle w:val="Hipervnculo"/>
@@ -3361,7 +3393,7 @@
               <w:rPr>
                 <w:noProof/>
               </w:rPr>
-              <w:instrText xml:space="preserve"> PAGEREF _Toc240378010 \h </w:instrText>
+              <w:instrText xml:space="preserve"> PAGEREF _Toc240378492 \h </w:instrText>
             </w:r>
             <w:r>
               <w:rPr>
@@ -3400,7 +3432,7 @@
               <w:color w:val="auto"/>
             </w:rPr>
           </w:pPr>
-          <w:hyperlink w:anchor="_Toc240378011" w:history="1">
+          <w:hyperlink w:anchor="_Toc240378493" w:history="1">
             <w:r>
               <w:rPr>
                 <w:rStyle w:val="Hipervnculo"/>
@@ -3424,7 +3456,7 @@
               <w:rPr>
                 <w:noProof/>
               </w:rPr>
-              <w:instrText xml:space="preserve"> PAGEREF _Toc240378011 \h </w:instrText>
+              <w:instrText xml:space="preserve"> PAGEREF _Toc240378493 \h </w:instrText>
             </w:r>
             <w:r>
               <w:rPr>
@@ -3463,7 +3495,7 @@
               <w:color w:val="auto"/>
             </w:rPr>
           </w:pPr>
-          <w:hyperlink w:anchor="_Toc240378012" w:history="1">
+          <w:hyperlink w:anchor="_Toc240378494" w:history="1">
             <w:r>
               <w:rPr>
                 <w:rStyle w:val="Hipervnculo"/>
@@ -3487,7 +3519,7 @@
               <w:rPr>
                 <w:noProof/>
               </w:rPr>
-              <w:instrText xml:space="preserve"> PAGEREF _Toc240378012 \h </w:instrText>
+              <w:instrText xml:space="preserve"> PAGEREF _Toc240378494 \h </w:instrText>
             </w:r>
             <w:r>
               <w:rPr>
@@ -3526,7 +3558,7 @@
               <w:color w:val="auto"/>
             </w:rPr>
           </w:pPr>
-          <w:hyperlink w:anchor="_Toc240378013" w:history="1">
+          <w:hyperlink w:anchor="_Toc240378495" w:history="1">
             <w:r>
               <w:rPr>
                 <w:rStyle w:val="Hipervnculo"/>
@@ -3550,7 +3582,7 @@
               <w:rPr>
                 <w:noProof/>
               </w:rPr>
-              <w:instrText xml:space="preserve"> PAGEREF _Toc240378013 \h </w:instrText>
+              <w:instrText xml:space="preserve"> PAGEREF _Toc240378495 \h </w:instrText>
             </w:r>
             <w:r>
               <w:rPr>
@@ -3589,7 +3621,7 @@
               <w:color w:val="auto"/>
             </w:rPr>
           </w:pPr>
-          <w:hyperlink w:anchor="_Toc240378014" w:history="1">
+          <w:hyperlink w:anchor="_Toc240378496" w:history="1">
             <w:r>
               <w:rPr>
                 <w:rStyle w:val="Hipervnculo"/>
@@ -3613,7 +3645,7 @@
               <w:rPr>
                 <w:noProof/>
               </w:rPr>
-              <w:instrText xml:space="preserve"> PAGEREF _Toc240378014 \h </w:instrText>
+              <w:instrText xml:space="preserve"> PAGEREF _Toc240378496 \h </w:instrText>
             </w:r>
             <w:r>
               <w:rPr>
@@ -3652,7 +3684,7 @@
               <w:color w:val="auto"/>
             </w:rPr>
           </w:pPr>
-          <w:hyperlink w:anchor="_Toc240378015" w:history="1">
+          <w:hyperlink w:anchor="_Toc240378497" w:history="1">
             <w:r>
               <w:rPr>
                 <w:rStyle w:val="Hipervnculo"/>
@@ -3676,7 +3708,7 @@
               <w:rPr>
                 <w:noProof/>
               </w:rPr>
-              <w:instrText xml:space="preserve"> PAGEREF _Toc240378015 \h </w:instrText>
+              <w:instrText xml:space="preserve"> PAGEREF _Toc240378497 \h </w:instrText>
             </w:r>
             <w:r>
               <w:rPr>
@@ -3715,7 +3747,7 @@
               <w:color w:val="auto"/>
             </w:rPr>
           </w:pPr>
-          <w:hyperlink w:anchor="_Toc240378016" w:history="1">
+          <w:hyperlink w:anchor="_Toc240378498" w:history="1">
             <w:r>
               <w:rPr>
                 <w:rStyle w:val="Hipervnculo"/>
@@ -3739,7 +3771,7 @@
               <w:rPr>
                 <w:noProof/>
               </w:rPr>
-              <w:instrText xml:space="preserve"> PAGEREF _Toc240378016 \h </w:instrText>
+              <w:instrText xml:space="preserve"> PAGEREF _Toc240378498 \h </w:instrText>
             </w:r>
             <w:r>
               <w:rPr>
@@ -3782,7 +3814,7 @@
       <w:pPr>
         <w:pStyle w:val="Ttulo1"/>
       </w:pPr>
-      <w:bookmarkStart w:id="0" w:name="_Toc240377962"/>
+      <w:bookmarkStart w:id="0" w:name="_Toc240378444"/>
       <w:r>
         <w:lastRenderedPageBreak/>
         <w:t>1. Descripción de la propuesta</w:t>
@@ -3793,7 +3825,7 @@
       <w:pPr>
         <w:pStyle w:val="Ttulo2"/>
       </w:pPr>
-      <w:bookmarkStart w:id="1" w:name="_Toc240377963"/>
+      <w:bookmarkStart w:id="1" w:name="_Toc240378445"/>
       <w:r>
         <w:t>1.1 Objetivo del Proyecto</w:t>
       </w:r>
@@ -3842,7 +3874,7 @@
       <w:pPr>
         <w:pStyle w:val="Ttulo2"/>
       </w:pPr>
-      <w:bookmarkStart w:id="2" w:name="_Toc240377964"/>
+      <w:bookmarkStart w:id="2" w:name="_Toc240378446"/>
       <w:r>
         <w:t>1.2 Antecedentes y problemática</w:t>
       </w:r>
@@ -3966,7 +3998,7 @@
       <w:pPr>
         <w:pStyle w:val="Ttulo2"/>
       </w:pPr>
-      <w:bookmarkStart w:id="3" w:name="_Toc240377965"/>
+      <w:bookmarkStart w:id="3" w:name="_Toc240378447"/>
       <w:r>
         <w:t>1.3 Sit</w:t>
       </w:r>
@@ -3997,100 +4029,10 @@
           <w:noProof/>
         </w:rPr>
         <w:drawing>
-          <wp:inline distT="0" distB="0" distL="0" distR="0" wp14:anchorId="1D612DBC" wp14:editId="34244177">
+          <wp:inline distT="0" distB="0" distL="0" distR="0" wp14:anchorId="7AF5ADD9" wp14:editId="3E1B5C3D">
             <wp:extent cx="5715000" cy="3314700"/>
             <wp:effectExtent l="0" t="0" r="0" b="0"/>
-            <wp:docPr id="1" name="Figura 1. Situación actual (As Is): trabajo sin control de versiones." descr="Figura 1. Situación actual (As Is): trabajo sin control de versiones." title="Figura 1. Situación actual (As Is): trabajo sin control de versiones."/>
-            <wp:cNvGraphicFramePr>
-              <a:graphicFrameLocks xmlns:a="http://schemas.openxmlformats.org/drawingml/2006/main" noChangeAspect="1"/>
-            </wp:cNvGraphicFramePr>
-            <a:graphic xmlns:a="http://schemas.openxmlformats.org/drawingml/2006/main">
-              <a:graphicData uri="http://schemas.openxmlformats.org/drawingml/2006/picture">
-                <pic:pic xmlns:pic="http://schemas.openxmlformats.org/drawingml/2006/picture">
-                  <pic:nvPicPr>
-                    <pic:cNvPr id="0" name=""/>
-                    <pic:cNvPicPr>
-                      <a:picLocks noChangeAspect="1" noChangeArrowheads="1"/>
-                    </pic:cNvPicPr>
-                  </pic:nvPicPr>
-                  <pic:blipFill>
-                    <a:blip r:embed="rId7"/>
-                    <a:srcRect/>
-                    <a:stretch>
-                      <a:fillRect/>
-                    </a:stretch>
-                  </pic:blipFill>
-                  <pic:spPr bwMode="auto">
-                    <a:xfrm>
-                      <a:off x="0" y="0"/>
-                      <a:ext cx="5715000" cy="3314700"/>
-                    </a:xfrm>
-                    <a:prstGeom prst="rect">
-                      <a:avLst/>
-                    </a:prstGeom>
-                  </pic:spPr>
-                </pic:pic>
-              </a:graphicData>
-            </a:graphic>
-          </wp:inline>
-        </w:drawing>
-      </w:r>
-    </w:p>
-    <w:p>
-      <w:pPr>
-        <w:spacing w:after="220"/>
-        <w:jc w:val="center"/>
-      </w:pPr>
-      <w:r>
-        <w:rPr>
-          <w:b/>
-          <w:bCs/>
-          <w:sz w:val="20"/>
-          <w:szCs w:val="20"/>
-        </w:rPr>
-        <w:t>Figura 1. Situación actual (As Is): trabajo sin control de versiones.</w:t>
-      </w:r>
-    </w:p>
-    <w:p>
-      <w:pPr>
-        <w:pStyle w:val="Ttulo2"/>
-      </w:pPr>
-      <w:bookmarkStart w:id="4" w:name="_Toc240377966"/>
-      <w:r>
-        <w:t>1.4 Situación propuesta (To Be)</w:t>
-      </w:r>
-      <w:bookmarkEnd w:id="4"/>
-    </w:p>
-    <w:p>
-      <w:pPr>
-        <w:spacing w:after="140" w:line="300" w:lineRule="auto"/>
-        <w:jc w:val="both"/>
-      </w:pPr>
-      <w:r>
-        <w:t>La solución propuesta establece un repositorio remoto único en GitHub como fuente de verdad del proyecto. Ca</w:t>
-      </w:r>
-      <w:r>
-        <w:t xml:space="preserve">da integrante trabaja en su propia rama de característica dentro de su entorno local con Visual Studio Code y Git, publica sus cambios mediante push, y el equipo integra el trabajo en la rama develop. Una vez validada la integración, develop se fusiona en </w:t>
-      </w:r>
-      <w:r>
-        <w:t>main y la versión se etiqueta como release.</w:t>
-      </w:r>
-    </w:p>
-    <w:p>
-      <w:pPr>
-        <w:spacing w:before="120" w:after="60"/>
-        <w:jc w:val="center"/>
-      </w:pPr>
-      <w:r>
-        <w:rPr>
-          <w:noProof/>
-        </w:rPr>
-        <w:lastRenderedPageBreak/>
-        <w:drawing>
-          <wp:inline distT="0" distB="0" distL="0" distR="0" wp14:anchorId="6DF04699" wp14:editId="35D149A7">
-            <wp:extent cx="5715000" cy="3209925"/>
-            <wp:effectExtent l="0" t="0" r="0" b="0"/>
-            <wp:docPr id="2" name="Figura 2. Situación propuesta (To Be): flujo colaborativo con Git y GitHub." descr="Figura 2. Situación propuesta (To Be): flujo colaborativo con Git y GitHub." title="Figura 2. Situación propuesta (To Be): flujo colaborativo con Git y GitHub."/>
+            <wp:docPr id="2" name="Figura 1. Situación actual (As Is): trabajo sin control de versiones." descr="Figura 1. Situación actual (As Is): trabajo sin control de versiones." title="Figura 1. Situación actual (As Is): trabajo sin control de versiones."/>
             <wp:cNvGraphicFramePr>
               <a:graphicFrameLocks xmlns:a="http://schemas.openxmlformats.org/drawingml/2006/main" noChangeAspect="1"/>
             </wp:cNvGraphicFramePr>
@@ -4113,7 +4055,7 @@
                   <pic:spPr bwMode="auto">
                     <a:xfrm>
                       <a:off x="0" y="0"/>
-                      <a:ext cx="5715000" cy="3209925"/>
+                      <a:ext cx="5715000" cy="3314700"/>
                     </a:xfrm>
                     <a:prstGeom prst="rect">
                       <a:avLst/>
@@ -4138,8 +4080,18 @@
           <w:sz w:val="20"/>
           <w:szCs w:val="20"/>
         </w:rPr>
-        <w:t>Figura 2. Situación propuesta (To Be): flujo colaborativo con Git y GitHub.</w:t>
-      </w:r>
+        <w:t>Figura 1. Situación actual (As Is): trabajo sin control de versiones.</w:t>
+      </w:r>
+    </w:p>
+    <w:p>
+      <w:pPr>
+        <w:pStyle w:val="Ttulo2"/>
+      </w:pPr>
+      <w:bookmarkStart w:id="4" w:name="_Toc240378448"/>
+      <w:r>
+        <w:t>1.4 Situación propuesta (To Be)</w:t>
+      </w:r>
+      <w:bookmarkEnd w:id="4"/>
     </w:p>
     <w:p>
       <w:pPr>
@@ -4147,32 +4099,13 @@
         <w:jc w:val="both"/>
       </w:pPr>
       <w:r>
-        <w:t>Con este esquema, cada cambio queda registrado con su autor, su fecha y su motivo; el trabajo en paralelo deja de sobrescribirse; es p</w:t>
-      </w:r>
-      <w:r>
-        <w:t>osible retornar a cualquier estado anterior con un solo comando; y las versiones entregadas quedan identificadas mediante etiquetas.</w:t>
-      </w:r>
-    </w:p>
-    <w:p>
-      <w:pPr>
-        <w:pStyle w:val="Ttulo2"/>
-      </w:pPr>
-      <w:bookmarkStart w:id="5" w:name="_Toc240377967"/>
-      <w:r>
-        <w:t>1.5 Arquitectura</w:t>
-      </w:r>
-      <w:bookmarkEnd w:id="5"/>
-    </w:p>
-    <w:p>
-      <w:pPr>
-        <w:spacing w:after="140" w:line="300" w:lineRule="auto"/>
-        <w:jc w:val="both"/>
-      </w:pPr>
-      <w:r>
-        <w:t>La solución se construyó como una aplicación web de arquitectura cliente-servidor desacoplada. El frontend</w:t>
-      </w:r>
-      <w:r>
-        <w:t xml:space="preserve"> es una aplicación de página única (SPA) desarrollada en React que consume, mediante peticiones HTTP en formato JSON, una API REST construida en Laravel. La persistencia se resuelve con el ORM Eloquent sobre una base de datos relacional.</w:t>
+        <w:t>La solución propuesta establece un repositorio remoto único en GitHub como fuente de verdad del proyecto. Ca</w:t>
+      </w:r>
+      <w:r>
+        <w:t xml:space="preserve">da integrante trabaja en su propia rama de característica dentro de su entorno local con Visual Studio Code y Git, publica sus cambios mediante push, y el equipo integra el trabajo en la rama develop. Una vez validada la integración, develop se fusiona en </w:t>
+      </w:r>
+      <w:r>
+        <w:t>main y la versión se etiqueta como release.</w:t>
       </w:r>
     </w:p>
     <w:p>
@@ -4184,11 +4117,12 @@
         <w:rPr>
           <w:noProof/>
         </w:rPr>
+        <w:lastRenderedPageBreak/>
         <w:drawing>
-          <wp:inline distT="0" distB="0" distL="0" distR="0" wp14:anchorId="39035F10" wp14:editId="5162C905">
-            <wp:extent cx="5715000" cy="2752725"/>
+          <wp:inline distT="0" distB="0" distL="0" distR="0" wp14:anchorId="3AAE541F" wp14:editId="4CDDF96F">
+            <wp:extent cx="5715000" cy="3209925"/>
             <wp:effectExtent l="0" t="0" r="0" b="0"/>
-            <wp:docPr id="3" name="Figura 3. Arquitectura de la solución BiblioTech UTP." descr="Figura 3. Arquitectura de la solución BiblioTech UTP." title="Figura 3. Arquitectura de la solución BiblioTech UTP."/>
+            <wp:docPr id="3" name="Figura 2. Situación propuesta (To Be): flujo colaborativo con Git y GitHub." descr="Figura 2. Situación propuesta (To Be): flujo colaborativo con Git y GitHub." title="Figura 2. Situación propuesta (To Be): flujo colaborativo con Git y GitHub."/>
             <wp:cNvGraphicFramePr>
               <a:graphicFrameLocks xmlns:a="http://schemas.openxmlformats.org/drawingml/2006/main" noChangeAspect="1"/>
             </wp:cNvGraphicFramePr>
@@ -4203,6 +4137,104 @@
                   </pic:nvPicPr>
                   <pic:blipFill>
                     <a:blip r:embed="rId9"/>
+                    <a:srcRect/>
+                    <a:stretch>
+                      <a:fillRect/>
+                    </a:stretch>
+                  </pic:blipFill>
+                  <pic:spPr bwMode="auto">
+                    <a:xfrm>
+                      <a:off x="0" y="0"/>
+                      <a:ext cx="5715000" cy="3209925"/>
+                    </a:xfrm>
+                    <a:prstGeom prst="rect">
+                      <a:avLst/>
+                    </a:prstGeom>
+                  </pic:spPr>
+                </pic:pic>
+              </a:graphicData>
+            </a:graphic>
+          </wp:inline>
+        </w:drawing>
+      </w:r>
+    </w:p>
+    <w:p>
+      <w:pPr>
+        <w:spacing w:after="220"/>
+        <w:jc w:val="center"/>
+      </w:pPr>
+      <w:r>
+        <w:rPr>
+          <w:b/>
+          <w:bCs/>
+          <w:sz w:val="20"/>
+          <w:szCs w:val="20"/>
+        </w:rPr>
+        <w:t>Figura 2. Situación propuesta (To Be): flujo colaborativo con Git y GitHub.</w:t>
+      </w:r>
+    </w:p>
+    <w:p>
+      <w:pPr>
+        <w:spacing w:after="140" w:line="300" w:lineRule="auto"/>
+        <w:jc w:val="both"/>
+      </w:pPr>
+      <w:r>
+        <w:t>Con este esquema, cada cambio queda registrado con su autor, su fecha y su motivo; el trabajo en paralelo deja de sobrescribirse; es p</w:t>
+      </w:r>
+      <w:r>
+        <w:t>osible retornar a cualquier estado anterior con un solo comando; y las versiones entregadas quedan identificadas mediante etiquetas.</w:t>
+      </w:r>
+    </w:p>
+    <w:p>
+      <w:pPr>
+        <w:pStyle w:val="Ttulo2"/>
+      </w:pPr>
+      <w:bookmarkStart w:id="5" w:name="_Toc240378449"/>
+      <w:r>
+        <w:t>1.5 Arquitectura</w:t>
+      </w:r>
+      <w:bookmarkEnd w:id="5"/>
+    </w:p>
+    <w:p>
+      <w:pPr>
+        <w:spacing w:after="140" w:line="300" w:lineRule="auto"/>
+        <w:jc w:val="both"/>
+      </w:pPr>
+      <w:r>
+        <w:t>La solución se construyó como una aplicación web de arquitectura cliente-servidor desacoplada. El frontend</w:t>
+      </w:r>
+      <w:r>
+        <w:t xml:space="preserve"> es una aplicación de página única (SPA) desarrollada en React que consume, mediante peticiones HTTP en formato JSON, una API REST construida en Laravel. La persistencia se resuelve con el ORM Eloquent sobre una base de datos relacional.</w:t>
+      </w:r>
+    </w:p>
+    <w:p>
+      <w:pPr>
+        <w:spacing w:before="120" w:after="60"/>
+        <w:jc w:val="center"/>
+      </w:pPr>
+      <w:r>
+        <w:rPr>
+          <w:noProof/>
+        </w:rPr>
+        <w:drawing>
+          <wp:inline distT="0" distB="0" distL="0" distR="0" wp14:anchorId="7AB6FECC" wp14:editId="5959D264">
+            <wp:extent cx="5715000" cy="2752725"/>
+            <wp:effectExtent l="0" t="0" r="0" b="0"/>
+            <wp:docPr id="4" name="Figura 3. Arquitectura de la solución BiblioTech UTP." descr="Figura 3. Arquitectura de la solución BiblioTech UTP." title="Figura 3. Arquitectura de la solución BiblioTech UTP."/>
+            <wp:cNvGraphicFramePr>
+              <a:graphicFrameLocks xmlns:a="http://schemas.openxmlformats.org/drawingml/2006/main" noChangeAspect="1"/>
+            </wp:cNvGraphicFramePr>
+            <a:graphic xmlns:a="http://schemas.openxmlformats.org/drawingml/2006/main">
+              <a:graphicData uri="http://schemas.openxmlformats.org/drawingml/2006/picture">
+                <pic:pic xmlns:pic="http://schemas.openxmlformats.org/drawingml/2006/picture">
+                  <pic:nvPicPr>
+                    <pic:cNvPr id="0" name=""/>
+                    <pic:cNvPicPr>
+                      <a:picLocks noChangeAspect="1" noChangeArrowheads="1"/>
+                    </pic:cNvPicPr>
+                  </pic:nvPicPr>
+                  <pic:blipFill>
+                    <a:blip r:embed="rId10"/>
                     <a:srcRect/>
                     <a:stretch>
                       <a:fillRect/>
@@ -5958,7 +5990,7 @@
       <w:pPr>
         <w:pStyle w:val="Ttulo2"/>
       </w:pPr>
-      <w:bookmarkStart w:id="6" w:name="_Toc240377968"/>
+      <w:bookmarkStart w:id="6" w:name="_Toc240378450"/>
       <w:r>
         <w:t>1.6 Plan de trabajo</w:t>
       </w:r>
@@ -6992,7 +7024,7 @@
       <w:pPr>
         <w:pStyle w:val="Ttulo2"/>
       </w:pPr>
-      <w:bookmarkStart w:id="7" w:name="_Toc240377969"/>
+      <w:bookmarkStart w:id="7" w:name="_Toc240378451"/>
       <w:r>
         <w:t>1.7 Riesgos</w:t>
       </w:r>
@@ -8311,7 +8343,7 @@
       <w:pPr>
         <w:pStyle w:val="Ttulo1"/>
       </w:pPr>
-      <w:bookmarkStart w:id="8" w:name="_Toc240377970"/>
+      <w:bookmarkStart w:id="8" w:name="_Toc240378452"/>
       <w:r>
         <w:lastRenderedPageBreak/>
         <w:t>2. Procedimiento y Configuración del Proyecto</w:t>
@@ -8322,7 +8354,7 @@
       <w:pPr>
         <w:pStyle w:val="Ttulo2"/>
       </w:pPr>
-      <w:bookmarkStart w:id="9" w:name="_Toc240377971"/>
+      <w:bookmarkStart w:id="9" w:name="_Toc240378453"/>
       <w:r>
         <w:t>2.1 Configuración Inicial del Repositorio</w:t>
       </w:r>
@@ -8332,7 +8364,7 @@
       <w:pPr>
         <w:pStyle w:val="Ttulo3"/>
       </w:pPr>
-      <w:bookmarkStart w:id="10" w:name="_Toc240377972"/>
+      <w:bookmarkStart w:id="10" w:name="_Toc240378454"/>
       <w:r>
         <w:t>a) Pasos realizados para crear el repositorio en GitHub</w:t>
       </w:r>
@@ -8429,7 +8461,7 @@
       <w:pPr>
         <w:pStyle w:val="Ttulo3"/>
       </w:pPr>
-      <w:bookmarkStart w:id="11" w:name="_Toc240377973"/>
+      <w:bookmarkStart w:id="11" w:name="_Toc240378455"/>
       <w:r>
         <w:t>b) Enlace del repositorio remoto</w:t>
       </w:r>
@@ -8448,7 +8480,7 @@
         <w:spacing w:after="180"/>
         <w:jc w:val="center"/>
       </w:pPr>
-      <w:hyperlink r:id="rId10" w:history="1">
+      <w:hyperlink r:id="rId11" w:history="1">
         <w:r>
           <w:rPr>
             <w:rStyle w:val="Hipervnculo"/>
@@ -8471,7 +8503,7 @@
       <w:pPr>
         <w:pStyle w:val="Ttulo3"/>
       </w:pPr>
-      <w:bookmarkStart w:id="12" w:name="_Toc240377974"/>
+      <w:bookmarkStart w:id="12" w:name="_Toc240378456"/>
       <w:r>
         <w:t>c) Configuración del entorno local</w:t>
       </w:r>
@@ -8726,16 +8758,7 @@
           <w:sz w:val="18"/>
           <w:szCs w:val="18"/>
         </w:rPr>
-        <w:t>git remote add o</w:t>
-      </w:r>
-      <w:r>
-        <w:rPr>
-          <w:rFonts w:ascii="Consolas" w:eastAsia="Consolas" w:hAnsi="Consolas" w:cs="Consolas"/>
-          <w:color w:val="1F2933"/>
-          <w:sz w:val="18"/>
-          <w:szCs w:val="18"/>
-        </w:rPr>
-        <w:t>rigin https://github.com/nocompe/Herramienta-de-desarrollo-biblioteca.git</w:t>
+        <w:t>git remote add origin https://github.com/nocompe/Herramienta-de-desarrollo-biblioteca.git</w:t>
       </w:r>
     </w:p>
     <w:p>
@@ -8783,7 +8806,16 @@
           <w:sz w:val="18"/>
           <w:szCs w:val="18"/>
         </w:rPr>
-        <w:t># Primer commit y publicacion</w:t>
+        <w:t>#</w:t>
+      </w:r>
+      <w:r>
+        <w:rPr>
+          <w:rFonts w:ascii="Consolas" w:eastAsia="Consolas" w:hAnsi="Consolas" w:cs="Consolas"/>
+          <w:color w:val="1F2933"/>
+          <w:sz w:val="18"/>
+          <w:szCs w:val="18"/>
+        </w:rPr>
+        <w:t xml:space="preserve"> Primer commit y publicacion</w:t>
       </w:r>
     </w:p>
     <w:p>
@@ -8841,10 +8873,10 @@
         <w:jc w:val="both"/>
       </w:pPr>
       <w:r>
-        <w:t>Los</w:t>
-      </w:r>
-      <w:r>
-        <w:t xml:space="preserve"> demás integrantes no repiten la inicialización: clonan el repositorio ya publicado y configuran su propia identidad.</w:t>
+        <w:t>Los demás integrantes no repiten la inicialización: clonan el repositorio ya publicado y confi</w:t>
+      </w:r>
+      <w:r>
+        <w:t>guran su propia identidad.</w:t>
       </w:r>
     </w:p>
     <w:p>
@@ -8892,16 +8924,7 @@
           <w:sz w:val="18"/>
           <w:szCs w:val="18"/>
         </w:rPr>
-        <w:t>cd Herramienta-de-desarrollo-bib</w:t>
-      </w:r>
-      <w:r>
-        <w:rPr>
-          <w:rFonts w:ascii="Consolas" w:eastAsia="Consolas" w:hAnsi="Consolas" w:cs="Consolas"/>
-          <w:color w:val="1F2933"/>
-          <w:sz w:val="18"/>
-          <w:szCs w:val="18"/>
-        </w:rPr>
-        <w:t>lioteca</w:t>
+        <w:t>cd Herramienta-de-desarrollo-biblioteca</w:t>
       </w:r>
     </w:p>
     <w:p>
@@ -8972,7 +8995,7 @@
       <w:pPr>
         <w:pStyle w:val="Ttulo3"/>
       </w:pPr>
-      <w:bookmarkStart w:id="13" w:name="_Toc240377975"/>
+      <w:bookmarkStart w:id="13" w:name="_Toc240378457"/>
       <w:r>
         <w:t>d) Configuración de las ramas principal y de trabajo</w:t>
       </w:r>
@@ -9000,7 +9023,16 @@
           <w:sz w:val="18"/>
           <w:szCs w:val="18"/>
         </w:rPr>
-        <w:t># Rama de integracion del equipo, creada a partir de main</w:t>
+        <w:t># Rama de integra</w:t>
+      </w:r>
+      <w:r>
+        <w:rPr>
+          <w:rFonts w:ascii="Consolas" w:eastAsia="Consolas" w:hAnsi="Consolas" w:cs="Consolas"/>
+          <w:color w:val="1F2933"/>
+          <w:sz w:val="18"/>
+          <w:szCs w:val="18"/>
+        </w:rPr>
+        <w:t>cion del equipo, creada a partir de main</w:t>
       </w:r>
     </w:p>
     <w:p>
@@ -9064,16 +9096,7 @@
           <w:sz w:val="18"/>
           <w:szCs w:val="18"/>
         </w:rPr>
-        <w:t># Rama de trabajo de cada integ</w:t>
-      </w:r>
-      <w:r>
-        <w:rPr>
-          <w:rFonts w:ascii="Consolas" w:eastAsia="Consolas" w:hAnsi="Consolas" w:cs="Consolas"/>
-          <w:color w:val="1F2933"/>
-          <w:sz w:val="18"/>
-          <w:szCs w:val="18"/>
-        </w:rPr>
-        <w:t>rante, creada a partir de develop</w:t>
+        <w:t># Rama de trabajo de cada integrante, creada a partir de develop</w:t>
       </w:r>
     </w:p>
     <w:p>
@@ -9137,14 +9160,23 @@
           <w:sz w:val="18"/>
           <w:szCs w:val="18"/>
         </w:rPr>
-        <w:t>git push -u origin feature/catalogo-libros</w:t>
+        <w:t xml:space="preserve">git push -u </w:t>
+      </w:r>
+      <w:r>
+        <w:rPr>
+          <w:rFonts w:ascii="Consolas" w:eastAsia="Consolas" w:hAnsi="Consolas" w:cs="Consolas"/>
+          <w:color w:val="1F2933"/>
+          <w:sz w:val="18"/>
+          <w:szCs w:val="18"/>
+        </w:rPr>
+        <w:t>origin feature/catalogo-libros</w:t>
       </w:r>
     </w:p>
     <w:p>
       <w:pPr>
         <w:pStyle w:val="Ttulo2"/>
       </w:pPr>
-      <w:bookmarkStart w:id="14" w:name="_Toc240377976"/>
+      <w:bookmarkStart w:id="14" w:name="_Toc240378458"/>
       <w:r>
         <w:t>2.2 Estructura del Proyecto</w:t>
       </w:r>
@@ -9156,13 +9188,10 @@
         <w:jc w:val="both"/>
       </w:pPr>
       <w:r>
-        <w:t>El código se organizó en un único repositorio (monorepo) que conti</w:t>
-      </w:r>
-      <w:r>
-        <w:t>ene dos aplicaciones independientes —backend y frontend— más una carpeta de documentación. Dentro de cada aplicación los archivos se agrupan por responsabilidad, y los cuatro módulos del sistema se distinguen con claridad tanto en los controladores del bac</w:t>
-      </w:r>
-      <w:r>
-        <w:t>kend como en las páginas de React.</w:t>
+        <w:t>El código se organizó en un único repositorio (monorepo) que contiene dos aplicaciones independientes —backend y frontend— más una carpeta de documentación. Dentro de cada aplicación los archivos s</w:t>
+      </w:r>
+      <w:r>
+        <w:t>e agrupan por responsabilidad, y los cuatro módulos del sistema se distinguen con claridad tanto en los controladores del backend como en las páginas de React.</w:t>
       </w:r>
     </w:p>
     <w:p>
@@ -9194,7 +9223,16 @@
           <w:sz w:val="18"/>
           <w:szCs w:val="18"/>
         </w:rPr>
-        <w:t>|-- .gitignore                          Exclusiones del repositorio</w:t>
+        <w:t>|-- .gitignore                          Exclusiones del re</w:t>
+      </w:r>
+      <w:r>
+        <w:rPr>
+          <w:rFonts w:ascii="Consolas" w:eastAsia="Consolas" w:hAnsi="Consolas" w:cs="Consolas"/>
+          <w:color w:val="1F2933"/>
+          <w:sz w:val="18"/>
+          <w:szCs w:val="18"/>
+        </w:rPr>
+        <w:t>positorio</w:t>
       </w:r>
     </w:p>
     <w:p>
@@ -9226,16 +9264,7 @@
           <w:sz w:val="18"/>
           <w:szCs w:val="18"/>
         </w:rPr>
-        <w:t xml:space="preserve">|-- CONTRIBUTING.md          </w:t>
-      </w:r>
-      <w:r>
-        <w:rPr>
-          <w:rFonts w:ascii="Consolas" w:eastAsia="Consolas" w:hAnsi="Consolas" w:cs="Consolas"/>
-          <w:color w:val="1F2933"/>
-          <w:sz w:val="18"/>
-          <w:szCs w:val="18"/>
-        </w:rPr>
-        <w:t xml:space="preserve">           Guia para colaboradores</w:t>
+        <w:t>|-- CONTRIBUTING.md                     Guia para colaboradores</w:t>
       </w:r>
     </w:p>
     <w:p>
@@ -9427,32 +9456,32 @@
           <w:sz w:val="18"/>
           <w:szCs w:val="18"/>
         </w:rPr>
-        <w:t>|   |       +-- Prestamo.php</w:t>
-      </w:r>
-    </w:p>
-    <w:p>
-      <w:pPr>
-        <w:shd w:val="clear" w:color="auto" w:fill="F2F2F2"/>
-        <w:spacing w:line="250" w:lineRule="auto"/>
-        <w:ind w:left="140" w:right="140"/>
-      </w:pPr>
-      <w:r>
-        <w:rPr>
-          <w:rFonts w:ascii="Consolas" w:eastAsia="Consolas" w:hAnsi="Consolas" w:cs="Consolas"/>
-          <w:color w:val="1F2933"/>
-          <w:sz w:val="18"/>
-          <w:szCs w:val="18"/>
-        </w:rPr>
-        <w:t>|   |-- bootstrap/app.php               Registro de rutas y manejo de excepcion</w:t>
-      </w:r>
-      <w:r>
-        <w:rPr>
-          <w:rFonts w:ascii="Consolas" w:eastAsia="Consolas" w:hAnsi="Consolas" w:cs="Consolas"/>
-          <w:color w:val="1F2933"/>
-          <w:sz w:val="18"/>
-          <w:szCs w:val="18"/>
-        </w:rPr>
-        <w:t>es</w:t>
+        <w:t>|   |       +-- Prestamo.ph</w:t>
+      </w:r>
+      <w:r>
+        <w:rPr>
+          <w:rFonts w:ascii="Consolas" w:eastAsia="Consolas" w:hAnsi="Consolas" w:cs="Consolas"/>
+          <w:color w:val="1F2933"/>
+          <w:sz w:val="18"/>
+          <w:szCs w:val="18"/>
+        </w:rPr>
+        <w:t>p</w:t>
+      </w:r>
+    </w:p>
+    <w:p>
+      <w:pPr>
+        <w:shd w:val="clear" w:color="auto" w:fill="F2F2F2"/>
+        <w:spacing w:line="250" w:lineRule="auto"/>
+        <w:ind w:left="140" w:right="140"/>
+      </w:pPr>
+      <w:r>
+        <w:rPr>
+          <w:rFonts w:ascii="Consolas" w:eastAsia="Consolas" w:hAnsi="Consolas" w:cs="Consolas"/>
+          <w:color w:val="1F2933"/>
+          <w:sz w:val="18"/>
+          <w:szCs w:val="18"/>
+        </w:rPr>
+        <w:t>|   |-- bootstrap/app.php               Registro de rutas y manejo de excepciones</w:t>
       </w:r>
     </w:p>
     <w:p>
@@ -9532,32 +9561,32 @@
           <w:sz w:val="18"/>
           <w:szCs w:val="18"/>
         </w:rPr>
-        <w:t>|   |   |   +-- ..._create_prestamos_table.php</w:t>
-      </w:r>
-    </w:p>
-    <w:p>
-      <w:pPr>
-        <w:shd w:val="clear" w:color="auto" w:fill="F2F2F2"/>
-        <w:spacing w:line="250" w:lineRule="auto"/>
-        <w:ind w:left="140" w:right="140"/>
-      </w:pPr>
-      <w:r>
-        <w:rPr>
-          <w:rFonts w:ascii="Consolas" w:eastAsia="Consolas" w:hAnsi="Consolas" w:cs="Consolas"/>
-          <w:color w:val="1F2933"/>
-          <w:sz w:val="18"/>
-          <w:szCs w:val="18"/>
-        </w:rPr>
-        <w:t xml:space="preserve">|   |   +-- seeders/               </w:t>
-      </w:r>
-      <w:r>
-        <w:rPr>
-          <w:rFonts w:ascii="Consolas" w:eastAsia="Consolas" w:hAnsi="Consolas" w:cs="Consolas"/>
-          <w:color w:val="1F2933"/>
-          <w:sz w:val="18"/>
-          <w:szCs w:val="18"/>
-        </w:rPr>
-        <w:t xml:space="preserve">     Datos de prueba, uno por modulo</w:t>
+        <w:t>|</w:t>
+      </w:r>
+      <w:r>
+        <w:rPr>
+          <w:rFonts w:ascii="Consolas" w:eastAsia="Consolas" w:hAnsi="Consolas" w:cs="Consolas"/>
+          <w:color w:val="1F2933"/>
+          <w:sz w:val="18"/>
+          <w:szCs w:val="18"/>
+        </w:rPr>
+        <w:t xml:space="preserve">   |   |   +-- ..._create_prestamos_table.php</w:t>
+      </w:r>
+    </w:p>
+    <w:p>
+      <w:pPr>
+        <w:shd w:val="clear" w:color="auto" w:fill="F2F2F2"/>
+        <w:spacing w:line="250" w:lineRule="auto"/>
+        <w:ind w:left="140" w:right="140"/>
+      </w:pPr>
+      <w:r>
+        <w:rPr>
+          <w:rFonts w:ascii="Consolas" w:eastAsia="Consolas" w:hAnsi="Consolas" w:cs="Consolas"/>
+          <w:color w:val="1F2933"/>
+          <w:sz w:val="18"/>
+          <w:szCs w:val="18"/>
+        </w:rPr>
+        <w:t>|   |   +-- seeders/                    Datos de prueba, uno por modulo</w:t>
       </w:r>
     </w:p>
     <w:p>
@@ -9606,7 +9635,16 @@
           <w:szCs w:val="18"/>
         </w:rPr>
         <w:lastRenderedPageBreak/>
-        <w:t>|-- frontend/                           Aplicacion React 19 + Vite 8</w:t>
+        <w:t>|-- frontend/                           Aplicacio</w:t>
+      </w:r>
+      <w:r>
+        <w:rPr>
+          <w:rFonts w:ascii="Consolas" w:eastAsia="Consolas" w:hAnsi="Consolas" w:cs="Consolas"/>
+          <w:color w:val="1F2933"/>
+          <w:sz w:val="18"/>
+          <w:szCs w:val="18"/>
+        </w:rPr>
+        <w:t>n React 19 + Vite 8</w:t>
       </w:r>
     </w:p>
     <w:p>
@@ -9638,16 +9676,7 @@
           <w:sz w:val="18"/>
           <w:szCs w:val="18"/>
         </w:rPr>
-        <w:t xml:space="preserve">|       |-- api/client.js               Cliente </w:t>
-      </w:r>
-      <w:r>
-        <w:rPr>
-          <w:rFonts w:ascii="Consolas" w:eastAsia="Consolas" w:hAnsi="Consolas" w:cs="Consolas"/>
-          <w:color w:val="1F2933"/>
-          <w:sz w:val="18"/>
-          <w:szCs w:val="18"/>
-        </w:rPr>
-        <w:t>Axios compartido</w:t>
+        <w:t>|       |-- api/client.js               Cliente Axios compartido</w:t>
       </w:r>
     </w:p>
     <w:p>
@@ -9711,7 +9740,16 @@
           <w:sz w:val="18"/>
           <w:szCs w:val="18"/>
         </w:rPr>
-        <w:t>|       |   +-- Modal.jsx               Ventana modal reutilizable</w:t>
+        <w:t xml:space="preserve">|    </w:t>
+      </w:r>
+      <w:r>
+        <w:rPr>
+          <w:rFonts w:ascii="Consolas" w:eastAsia="Consolas" w:hAnsi="Consolas" w:cs="Consolas"/>
+          <w:color w:val="1F2933"/>
+          <w:sz w:val="18"/>
+          <w:szCs w:val="18"/>
+        </w:rPr>
+        <w:t xml:space="preserve">   |   +-- Modal.jsx               Ventana modal reutilizable</w:t>
       </w:r>
     </w:p>
     <w:p>
@@ -9823,16 +9861,7 @@
           <w:sz w:val="18"/>
           <w:szCs w:val="18"/>
         </w:rPr>
-        <w:t xml:space="preserve">|       |   +-- Dashboard.jsx        </w:t>
-      </w:r>
-      <w:r>
-        <w:rPr>
-          <w:rFonts w:ascii="Consolas" w:eastAsia="Consolas" w:hAnsi="Consolas" w:cs="Consolas"/>
-          <w:color w:val="1F2933"/>
-          <w:sz w:val="18"/>
-          <w:szCs w:val="18"/>
-        </w:rPr>
-        <w:t xml:space="preserve">   Modulo 4</w:t>
+        <w:t>|       |   +-- Dashboard.jsx           Modulo 4</w:t>
       </w:r>
     </w:p>
     <w:p>
@@ -9864,7 +9893,16 @@
           <w:sz w:val="18"/>
           <w:szCs w:val="18"/>
         </w:rPr>
-        <w:t>|       +-- index.css                   Estilos globales</w:t>
+        <w:t>|       +-- index.css                   Estilo</w:t>
+      </w:r>
+      <w:r>
+        <w:rPr>
+          <w:rFonts w:ascii="Consolas" w:eastAsia="Consolas" w:hAnsi="Consolas" w:cs="Consolas"/>
+          <w:color w:val="1F2933"/>
+          <w:sz w:val="18"/>
+          <w:szCs w:val="18"/>
+        </w:rPr>
+        <w:t>s globales</w:t>
       </w:r>
     </w:p>
     <w:p>
@@ -9928,16 +9966,7 @@
           <w:sz w:val="18"/>
           <w:szCs w:val="18"/>
         </w:rPr>
-        <w:t xml:space="preserve">    |-- capturas/                    </w:t>
-      </w:r>
-      <w:r>
-        <w:rPr>
-          <w:rFonts w:ascii="Consolas" w:eastAsia="Consolas" w:hAnsi="Consolas" w:cs="Consolas"/>
-          <w:color w:val="1F2933"/>
-          <w:sz w:val="18"/>
-          <w:szCs w:val="18"/>
-        </w:rPr>
-        <w:t xml:space="preserve">   Pantallas del sistema en ejecucion</w:t>
+        <w:t xml:space="preserve">    |-- capturas/                       Pantallas del sistema en ejecucion</w:t>
       </w:r>
     </w:p>
     <w:p>
@@ -9962,10 +9991,13 @@
         <w:jc w:val="both"/>
       </w:pPr>
       <w:r>
-        <w:t>Junto al .gitignore, la organización del repositorio incorpora un acuerdo explícito del equipo. Los tres archivos que necesariamente son editad</w:t>
-      </w:r>
-      <w:r>
-        <w:t>os por todos —backend/routes/api.php, frontend/src/App.jsx y backend/database/seeders/DatabaseSeeder.php— están divididos en zonas comentadas, una por módulo, y cada integrante escribe únicamente dentro de la suya:</w:t>
+        <w:t>Junto al</w:t>
+      </w:r>
+      <w:r>
+        <w:t xml:space="preserve"> .gitignore, la organización del repositorio incorpora un acuerdo explícito del equipo. Los tres archivos que necesariamente son editados por todos —backend/routes/api.php, frontend/src/App.jsx y backend/database/seeders/DatabaseSeeder.php— están divididos</w:t>
+      </w:r>
+      <w:r>
+        <w:t xml:space="preserve"> en zonas comentadas, una por módulo, y cada integrante escribe únicamente dentro de la suya:</w:t>
       </w:r>
     </w:p>
     <w:p>
@@ -9981,16 +10013,7 @@
           <w:sz w:val="18"/>
           <w:szCs w:val="18"/>
         </w:rPr>
-        <w:t xml:space="preserve">// --- ZONA MODULO 1: CATALOGO DE LIBROS </w:t>
-      </w:r>
-      <w:r>
-        <w:rPr>
-          <w:rFonts w:ascii="Consolas" w:eastAsia="Consolas" w:hAnsi="Consolas" w:cs="Consolas"/>
-          <w:color w:val="1F2933"/>
-          <w:sz w:val="18"/>
-          <w:szCs w:val="18"/>
-        </w:rPr>
-        <w:t>(feature/catalogo-libros) ---</w:t>
+        <w:t>// --- ZONA MODULO 1: CATALOGO DE LIBROS (feature/catalogo-libros) ---</w:t>
       </w:r>
     </w:p>
     <w:p>
@@ -10038,32 +10061,32 @@
           <w:sz w:val="18"/>
           <w:szCs w:val="18"/>
         </w:rPr>
-        <w:t>// --- ZONA MODULO 2: GESTION DE SOCIOS (feature/gestion-socios) ---</w:t>
-      </w:r>
-    </w:p>
-    <w:p>
-      <w:pPr>
-        <w:shd w:val="clear" w:color="auto" w:fill="F2F2F2"/>
-        <w:spacing w:line="250" w:lineRule="auto"/>
-        <w:ind w:left="140" w:right="140"/>
-      </w:pPr>
-      <w:r>
-        <w:rPr>
-          <w:rFonts w:ascii="Consolas" w:eastAsia="Consolas" w:hAnsi="Consolas" w:cs="Consolas"/>
-          <w:color w:val="1F2933"/>
-          <w:sz w:val="18"/>
-          <w:szCs w:val="18"/>
-        </w:rPr>
-        <w:t>Route::apiResource('socios', \App\Http\Controllers\Api\SocioController::cla</w:t>
-      </w:r>
-      <w:r>
-        <w:rPr>
-          <w:rFonts w:ascii="Consolas" w:eastAsia="Consolas" w:hAnsi="Consolas" w:cs="Consolas"/>
-          <w:color w:val="1F2933"/>
-          <w:sz w:val="18"/>
-          <w:szCs w:val="18"/>
-        </w:rPr>
-        <w:t>ss);</w:t>
+        <w:t>// --- ZO</w:t>
+      </w:r>
+      <w:r>
+        <w:rPr>
+          <w:rFonts w:ascii="Consolas" w:eastAsia="Consolas" w:hAnsi="Consolas" w:cs="Consolas"/>
+          <w:color w:val="1F2933"/>
+          <w:sz w:val="18"/>
+          <w:szCs w:val="18"/>
+        </w:rPr>
+        <w:t>NA MODULO 2: GESTION DE SOCIOS (feature/gestion-socios) ---</w:t>
+      </w:r>
+    </w:p>
+    <w:p>
+      <w:pPr>
+        <w:shd w:val="clear" w:color="auto" w:fill="F2F2F2"/>
+        <w:spacing w:line="250" w:lineRule="auto"/>
+        <w:ind w:left="140" w:right="140"/>
+      </w:pPr>
+      <w:r>
+        <w:rPr>
+          <w:rFonts w:ascii="Consolas" w:eastAsia="Consolas" w:hAnsi="Consolas" w:cs="Consolas"/>
+          <w:color w:val="1F2933"/>
+          <w:sz w:val="18"/>
+          <w:szCs w:val="18"/>
+        </w:rPr>
+        <w:t>Route::apiResource('socios', \App\Http\Controllers\Api\SocioController::class);</w:t>
       </w:r>
     </w:p>
     <w:p>
@@ -10127,7 +10150,16 @@
           <w:sz w:val="18"/>
           <w:szCs w:val="18"/>
         </w:rPr>
-        <w:t>Route::get('prestamos', [\App\Http\Controllers\Api\PrestamoController::class, 'index']);</w:t>
+        <w:t>Route::get('prestamos', [\App\Http\Controllers\Api\PrestamoController::clas</w:t>
+      </w:r>
+      <w:r>
+        <w:rPr>
+          <w:rFonts w:ascii="Consolas" w:eastAsia="Consolas" w:hAnsi="Consolas" w:cs="Consolas"/>
+          <w:color w:val="1F2933"/>
+          <w:sz w:val="18"/>
+          <w:szCs w:val="18"/>
+        </w:rPr>
+        <w:t>s, 'index']);</w:t>
       </w:r>
     </w:p>
     <w:p>
@@ -10501,7 +10533,7 @@
       <w:pPr>
         <w:pStyle w:val="Ttulo2"/>
       </w:pPr>
-      <w:bookmarkStart w:id="15" w:name="_Toc240377977"/>
+      <w:bookmarkStart w:id="15" w:name="_Toc240378459"/>
       <w:r>
         <w:t>2.3 Gestión de Ramas</w:t>
       </w:r>
@@ -11997,9 +12029,7 @@
             </w:pPr>
             <w:r>
               <w:rPr>
-                <w:b/>
-                <w:bCs/>
-                <w:color w:val="1D4ED8"/>
+                <w:color w:val="1F2933"/>
                 <w:sz w:val="19"/>
                 <w:szCs w:val="19"/>
               </w:rPr>
@@ -12763,10 +12793,10 @@
           <w:noProof/>
         </w:rPr>
         <w:drawing>
-          <wp:inline distT="0" distB="0" distL="0" distR="0" wp14:anchorId="55C6A759" wp14:editId="410ED5B4">
+          <wp:inline distT="0" distB="0" distL="0" distR="0" wp14:anchorId="65E930F3" wp14:editId="3E07C653">
             <wp:extent cx="5715000" cy="2828925"/>
             <wp:effectExtent l="0" t="0" r="0" b="0"/>
-            <wp:docPr id="4" name="Figura 4. Estrategia de ramas aplicada en el proyecto (Git Flow simplificado)." descr="Figura 4. Estrategia de ramas aplicada en el proyecto (Git Flow simplificado)." title="Figura 4. Estrategia de ramas aplicada en el proyecto (Git Flow simplificado)."/>
+            <wp:docPr id="5" name="Figura 4. Estrategia de ramas aplicada en el proyecto (Git Flow simplificado)." descr="Figura 4. Estrategia de ramas aplicada en el proyecto (Git Flow simplificado)." title="Figura 4. Estrategia de ramas aplicada en el proyecto (Git Flow simplificado)."/>
             <wp:cNvGraphicFramePr>
               <a:graphicFrameLocks xmlns:a="http://schemas.openxmlformats.org/drawingml/2006/main" noChangeAspect="1"/>
             </wp:cNvGraphicFramePr>
@@ -12780,7 +12810,7 @@
                     </pic:cNvPicPr>
                   </pic:nvPicPr>
                   <pic:blipFill>
-                    <a:blip r:embed="rId11"/>
+                    <a:blip r:embed="rId12"/>
                     <a:srcRect/>
                     <a:stretch>
                       <a:fillRect/>
@@ -12826,7 +12856,7 @@
       <w:pPr>
         <w:pStyle w:val="Ttulo1"/>
       </w:pPr>
-      <w:bookmarkStart w:id="16" w:name="_Toc240377978"/>
+      <w:bookmarkStart w:id="16" w:name="_Toc240378460"/>
       <w:r>
         <w:lastRenderedPageBreak/>
         <w:t>3. Procedimientos de Control de Versiones</w:t>
@@ -12837,7 +12867,7 @@
       <w:pPr>
         <w:pStyle w:val="Ttulo2"/>
       </w:pPr>
-      <w:bookmarkStart w:id="17" w:name="_Toc240377979"/>
+      <w:bookmarkStart w:id="17" w:name="_Toc240378461"/>
       <w:r>
         <w:t>3.1 Realización de Commits</w:t>
       </w:r>
@@ -12847,7 +12877,7 @@
       <w:pPr>
         <w:pStyle w:val="Ttulo3"/>
       </w:pPr>
-      <w:bookmarkStart w:id="18" w:name="_Toc240377980"/>
+      <w:bookmarkStart w:id="18" w:name="_Toc240378462"/>
       <w:r>
         <w:t>a) Cuándo se realiza un commit</w:t>
       </w:r>
@@ -12933,7 +12963,7 @@
       <w:pPr>
         <w:pStyle w:val="Ttulo3"/>
       </w:pPr>
-      <w:bookmarkStart w:id="19" w:name="_Toc240377981"/>
+      <w:bookmarkStart w:id="19" w:name="_Toc240378463"/>
       <w:r>
         <w:t>b) Cómo se realiza un commit</w:t>
       </w:r>
@@ -13133,7 +13163,16 @@
           <w:sz w:val="18"/>
           <w:szCs w:val="18"/>
         </w:rPr>
-        <w:t>git commit -m "feat(libros): implementar LibroController con CRUD y busqueda por titulo, autor e ISBN"</w:t>
+        <w:t>git commit -m "feat(libros): implementar LibroController con CRUD y busqueda po</w:t>
+      </w:r>
+      <w:r>
+        <w:rPr>
+          <w:rFonts w:ascii="Consolas" w:eastAsia="Consolas" w:hAnsi="Consolas" w:cs="Consolas"/>
+          <w:color w:val="1F2933"/>
+          <w:sz w:val="18"/>
+          <w:szCs w:val="18"/>
+        </w:rPr>
+        <w:t>r titulo, autor e ISBN"</w:t>
       </w:r>
     </w:p>
     <w:p>
@@ -13188,7 +13227,7 @@
       <w:pPr>
         <w:pStyle w:val="Ttulo3"/>
       </w:pPr>
-      <w:bookmarkStart w:id="20" w:name="_Toc240377982"/>
+      <w:bookmarkStart w:id="20" w:name="_Toc240378464"/>
       <w:r>
         <w:t>c) Convención de mensajes de commit</w:t>
       </w:r>
@@ -13997,7 +14036,7 @@
       <w:pPr>
         <w:pStyle w:val="Ttulo3"/>
       </w:pPr>
-      <w:bookmarkStart w:id="21" w:name="_Toc240377983"/>
+      <w:bookmarkStart w:id="21" w:name="_Toc240378465"/>
       <w:r>
         <w:t>d) Historial real de commits del proyecto</w:t>
       </w:r>
@@ -20290,7 +20329,7 @@
       <w:pPr>
         <w:pStyle w:val="Ttulo2"/>
       </w:pPr>
-      <w:bookmarkStart w:id="22" w:name="_Toc240377984"/>
+      <w:bookmarkStart w:id="22" w:name="_Toc240378466"/>
       <w:r>
         <w:t>3.2</w:t>
       </w:r>
@@ -20315,7 +20354,7 @@
       <w:pPr>
         <w:pStyle w:val="Ttulo3"/>
       </w:pPr>
-      <w:bookmarkStart w:id="23" w:name="_Toc240377985"/>
+      <w:bookmarkStart w:id="23" w:name="_Toc240378467"/>
       <w:r>
         <w:t>a) Comandos utilizados para realizar la fusión</w:t>
       </w:r>
@@ -20543,7 +20582,7 @@
       <w:pPr>
         <w:pStyle w:val="Ttulo3"/>
       </w:pPr>
-      <w:bookmarkStart w:id="24" w:name="_Toc240377986"/>
+      <w:bookmarkStart w:id="24" w:name="_Toc240378468"/>
       <w:r>
         <w:t>b) Resultado obtenido en la fusión del módulo 1</w:t>
       </w:r>
@@ -20793,7 +20832,7 @@
       <w:pPr>
         <w:pStyle w:val="Ttulo3"/>
       </w:pPr>
-      <w:bookmarkStart w:id="25" w:name="_Toc240377987"/>
+      <w:bookmarkStart w:id="25" w:name="_Toc240378469"/>
       <w:r>
         <w:t>c) Fusión final a main y etiquetado del release</w:t>
       </w:r>
@@ -20927,7 +20966,7 @@
       <w:pPr>
         <w:pStyle w:val="Ttulo3"/>
       </w:pPr>
-      <w:bookmarkStart w:id="26" w:name="_Toc240377988"/>
+      <w:bookmarkStart w:id="26" w:name="_Toc240378470"/>
       <w:r>
         <w:t>d) Fusión de trabajo publicado por otro integrante en el remoto</w:t>
       </w:r>
@@ -21320,7 +21359,7 @@
       <w:pPr>
         <w:pStyle w:val="Ttulo2"/>
       </w:pPr>
-      <w:bookmarkStart w:id="27" w:name="_Toc240377989"/>
+      <w:bookmarkStart w:id="27" w:name="_Toc240378471"/>
       <w:r>
         <w:t>3.3 Manejo de Conflictos de Fusión</w:t>
       </w:r>
@@ -21330,7 +21369,7 @@
       <w:pPr>
         <w:pStyle w:val="Ttulo3"/>
       </w:pPr>
-      <w:bookmarkStart w:id="28" w:name="_Toc240377990"/>
+      <w:bookmarkStart w:id="28" w:name="_Toc240378472"/>
       <w:r>
         <w:t>a) Origen del conflicto</w:t>
       </w:r>
@@ -21406,7 +21445,7 @@
       <w:pPr>
         <w:pStyle w:val="Ttulo3"/>
       </w:pPr>
-      <w:bookmarkStart w:id="29" w:name="_Toc240377991"/>
+      <w:bookmarkStart w:id="29" w:name="_Toc240378473"/>
       <w:r>
         <w:t>b) Detección del conflicto</w:t>
       </w:r>
@@ -21811,7 +21850,7 @@
       <w:pPr>
         <w:pStyle w:val="Ttulo3"/>
       </w:pPr>
-      <w:bookmarkStart w:id="30" w:name="_Toc240377992"/>
+      <w:bookmarkStart w:id="30" w:name="_Toc240378474"/>
       <w:r>
         <w:t>c) Contenido del archivo en conflicto</w:t>
       </w:r>
@@ -22509,7 +22548,7 @@
       <w:pPr>
         <w:pStyle w:val="Ttulo3"/>
       </w:pPr>
-      <w:bookmarkStart w:id="31" w:name="_Toc240377993"/>
+      <w:bookmarkStart w:id="31" w:name="_Toc240378475"/>
       <w:r>
         <w:lastRenderedPageBreak/>
         <w:t>d) Pasos detallados para resolver el conflicto</w:t>
@@ -22801,7 +22840,7 @@
       <w:pPr>
         <w:pStyle w:val="Ttulo3"/>
       </w:pPr>
-      <w:bookmarkStart w:id="32" w:name="_Toc240377994"/>
+      <w:bookmarkStart w:id="32" w:name="_Toc240378476"/>
       <w:r>
         <w:t>e) Resultado de la resolución</w:t>
       </w:r>
@@ -23344,7 +23383,7 @@
       <w:pPr>
         <w:pStyle w:val="Ttulo3"/>
       </w:pPr>
-      <w:bookmarkStart w:id="33" w:name="_Toc240377995"/>
+      <w:bookmarkStart w:id="33" w:name="_Toc240378477"/>
       <w:r>
         <w:t>f) Corrección posterior al release medi</w:t>
       </w:r>
@@ -23753,7 +23792,7 @@
       <w:pPr>
         <w:pStyle w:val="Ttulo3"/>
       </w:pPr>
-      <w:bookmarkStart w:id="34" w:name="_Toc240377996"/>
+      <w:bookmarkStart w:id="34" w:name="_Toc240378478"/>
       <w:r>
         <w:t>g) Segundo conflicto: cuando combinar no es la respues</w:t>
       </w:r>
@@ -24250,7 +24289,7 @@
       <w:pPr>
         <w:pStyle w:val="Ttulo1"/>
       </w:pPr>
-      <w:bookmarkStart w:id="35" w:name="_Toc240377997"/>
+      <w:bookmarkStart w:id="35" w:name="_Toc240378479"/>
       <w:r>
         <w:lastRenderedPageBreak/>
         <w:t>4. Documentación Técnica</w:t>
@@ -24270,7 +24309,7 @@
       <w:pPr>
         <w:pStyle w:val="Ttulo2"/>
       </w:pPr>
-      <w:bookmarkStart w:id="36" w:name="_Toc240377998"/>
+      <w:bookmarkStart w:id="36" w:name="_Toc240378480"/>
       <w:r>
         <w:t>4.1 Guía para Colaborado</w:t>
       </w:r>
@@ -24283,7 +24322,7 @@
       <w:pPr>
         <w:pStyle w:val="Ttulo3"/>
       </w:pPr>
-      <w:bookmarkStart w:id="37" w:name="_Toc240377999"/>
+      <w:bookmarkStart w:id="37" w:name="_Toc240378481"/>
       <w:r>
         <w:t>a) Requisitos previos</w:t>
       </w:r>
@@ -24964,7 +25003,7 @@
       <w:pPr>
         <w:pStyle w:val="Ttulo3"/>
       </w:pPr>
-      <w:bookmarkStart w:id="38" w:name="_Toc240378000"/>
+      <w:bookmarkStart w:id="38" w:name="_Toc240378482"/>
       <w:r>
         <w:t>b) Cómo clonar el repositorio</w:t>
       </w:r>
@@ -25070,7 +25109,7 @@
       <w:pPr>
         <w:pStyle w:val="Ttulo3"/>
       </w:pPr>
-      <w:bookmarkStart w:id="39" w:name="_Toc240378001"/>
+      <w:bookmarkStart w:id="39" w:name="_Toc240378483"/>
       <w:r>
         <w:t>c) Instalación y ejecución del proyecto</w:t>
       </w:r>
@@ -25414,7 +25453,7 @@
       <w:pPr>
         <w:pStyle w:val="Ttulo3"/>
       </w:pPr>
-      <w:bookmarkStart w:id="40" w:name="_Toc240378002"/>
+      <w:bookmarkStart w:id="40" w:name="_Toc240378484"/>
       <w:r>
         <w:t>d) Cómo crear ramas y realizar commits</w:t>
       </w:r>
@@ -25796,7 +25835,7 @@
       <w:pPr>
         <w:pStyle w:val="Ttulo3"/>
       </w:pPr>
-      <w:bookmarkStart w:id="41" w:name="_Toc240378003"/>
+      <w:bookmarkStart w:id="41" w:name="_Toc240378485"/>
       <w:r>
         <w:t>e) Reglas acor</w:t>
       </w:r>
@@ -25890,7 +25929,7 @@
       <w:pPr>
         <w:pStyle w:val="Ttulo3"/>
       </w:pPr>
-      <w:bookmarkStart w:id="42" w:name="_Toc240378004"/>
+      <w:bookmarkStart w:id="42" w:name="_Toc240378486"/>
       <w:r>
         <w:t>f) Endpoints de la API</w:t>
       </w:r>
@@ -28704,7 +28743,7 @@
       <w:pPr>
         <w:pStyle w:val="Ttulo3"/>
       </w:pPr>
-      <w:bookmarkStart w:id="43" w:name="_Toc240378005"/>
+      <w:bookmarkStart w:id="43" w:name="_Toc240378487"/>
       <w:r>
         <w:t>g) Reglas de negocio implementadas</w:t>
       </w:r>
@@ -29126,7 +29165,7 @@
       <w:pPr>
         <w:pStyle w:val="Ttulo3"/>
       </w:pPr>
-      <w:bookmarkStart w:id="44" w:name="_Toc240378006"/>
+      <w:bookmarkStart w:id="44" w:name="_Toc240378488"/>
       <w:r>
         <w:t>h) Evidencia de funcionamiento del sistema</w:t>
       </w:r>
@@ -29154,75 +29193,10 @@
           <w:noProof/>
         </w:rPr>
         <w:drawing>
-          <wp:inline distT="0" distB="0" distL="0" distR="0" wp14:anchorId="71292218" wp14:editId="520DEC67">
+          <wp:inline distT="0" distB="0" distL="0" distR="0" wp14:anchorId="4B503525" wp14:editId="5F13A1DC">
             <wp:extent cx="3524250" cy="4638675"/>
             <wp:effectExtent l="0" t="0" r="0" b="0"/>
-            <wp:docPr id="5" name="Figura 5. Página de inicio con el estado de conexión a la API." descr="Figura 5. Página de inicio con el estado de conexión a la API." title="Figura 5. Página de inicio con el estado de conexión a la API."/>
-            <wp:cNvGraphicFramePr>
-              <a:graphicFrameLocks xmlns:a="http://schemas.openxmlformats.org/drawingml/2006/main" noChangeAspect="1"/>
-            </wp:cNvGraphicFramePr>
-            <a:graphic xmlns:a="http://schemas.openxmlformats.org/drawingml/2006/main">
-              <a:graphicData uri="http://schemas.openxmlformats.org/drawingml/2006/picture">
-                <pic:pic xmlns:pic="http://schemas.openxmlformats.org/drawingml/2006/picture">
-                  <pic:nvPicPr>
-                    <pic:cNvPr id="0" name=""/>
-                    <pic:cNvPicPr>
-                      <a:picLocks noChangeAspect="1" noChangeArrowheads="1"/>
-                    </pic:cNvPicPr>
-                  </pic:nvPicPr>
-                  <pic:blipFill>
-                    <a:blip r:embed="rId12"/>
-                    <a:srcRect/>
-                    <a:stretch>
-                      <a:fillRect/>
-                    </a:stretch>
-                  </pic:blipFill>
-                  <pic:spPr bwMode="auto">
-                    <a:xfrm>
-                      <a:off x="0" y="0"/>
-                      <a:ext cx="3524250" cy="4638675"/>
-                    </a:xfrm>
-                    <a:prstGeom prst="rect">
-                      <a:avLst/>
-                    </a:prstGeom>
-                  </pic:spPr>
-                </pic:pic>
-              </a:graphicData>
-            </a:graphic>
-          </wp:inline>
-        </w:drawing>
-      </w:r>
-    </w:p>
-    <w:p>
-      <w:pPr>
-        <w:spacing w:after="220"/>
-        <w:jc w:val="center"/>
-      </w:pPr>
-      <w:r>
-        <w:rPr>
-          <w:b/>
-          <w:bCs/>
-          <w:sz w:val="20"/>
-          <w:szCs w:val="20"/>
-        </w:rPr>
-        <w:t>Figura 5. Página de inicio con el estado de conexión a la API.</w:t>
-      </w:r>
-    </w:p>
-    <w:p>
-      <w:pPr>
-        <w:spacing w:before="120" w:after="60"/>
-        <w:jc w:val="center"/>
-      </w:pPr>
-      <w:r>
-        <w:rPr>
-          <w:noProof/>
-        </w:rPr>
-        <w:lastRenderedPageBreak/>
-        <w:drawing>
-          <wp:inline distT="0" distB="0" distL="0" distR="0" wp14:anchorId="7B3304A7" wp14:editId="6F4687AE">
-            <wp:extent cx="4953000" cy="3276600"/>
-            <wp:effectExtent l="0" t="0" r="0" b="0"/>
-            <wp:docPr id="6" name="Figura 6. Pantalla de inicio de sesión." descr="Figura 6. Pantalla de inicio de sesión." title="Figura 6. Pantalla de inicio de sesión."/>
+            <wp:docPr id="6" name="Figura 5. Página de inicio con el estado de conexión a la API." descr="Figura 5. Página de inicio con el estado de conexión a la API." title="Figura 5. Página de inicio con el estado de conexión a la API."/>
             <wp:cNvGraphicFramePr>
               <a:graphicFrameLocks xmlns:a="http://schemas.openxmlformats.org/drawingml/2006/main" noChangeAspect="1"/>
             </wp:cNvGraphicFramePr>
@@ -29245,7 +29219,7 @@
                   <pic:spPr bwMode="auto">
                     <a:xfrm>
                       <a:off x="0" y="0"/>
-                      <a:ext cx="4953000" cy="3276600"/>
+                      <a:ext cx="3524250" cy="4638675"/>
                     </a:xfrm>
                     <a:prstGeom prst="rect">
                       <a:avLst/>
@@ -29270,7 +29244,7 @@
           <w:sz w:val="20"/>
           <w:szCs w:val="20"/>
         </w:rPr>
-        <w:t>Figura 6. Pantalla de inicio de sesión.</w:t>
+        <w:t>Figura 5. Página de inicio con el estado de conexión a la API.</w:t>
       </w:r>
     </w:p>
     <w:p>
@@ -29282,11 +29256,12 @@
         <w:rPr>
           <w:noProof/>
         </w:rPr>
+        <w:lastRenderedPageBreak/>
         <w:drawing>
-          <wp:inline distT="0" distB="0" distL="0" distR="0" wp14:anchorId="7FD018B7" wp14:editId="6D512415">
-            <wp:extent cx="4286250" cy="4343400"/>
+          <wp:inline distT="0" distB="0" distL="0" distR="0" wp14:anchorId="0F355176" wp14:editId="0B82DBDC">
+            <wp:extent cx="4953000" cy="3276600"/>
             <wp:effectExtent l="0" t="0" r="0" b="0"/>
-            <wp:docPr id="7" name="Figura 7. Módulo 1 — Catálogo de libros: registro, búsqueda y control de ejemplares." descr="Figura 7. Módulo 1 — Catálogo de libros: registro, búsqueda y control de ejemplares." title="Figura 7. Módulo 1 — Catálogo de libros: registro, búsqueda y control de ejemplares."/>
+            <wp:docPr id="7" name="Figura 6. Pantalla de inicio de sesión." descr="Figura 6. Pantalla de inicio de sesión." title="Figura 6. Pantalla de inicio de sesión."/>
             <wp:cNvGraphicFramePr>
               <a:graphicFrameLocks xmlns:a="http://schemas.openxmlformats.org/drawingml/2006/main" noChangeAspect="1"/>
             </wp:cNvGraphicFramePr>
@@ -29309,7 +29284,7 @@
                   <pic:spPr bwMode="auto">
                     <a:xfrm>
                       <a:off x="0" y="0"/>
-                      <a:ext cx="4286250" cy="4343400"/>
+                      <a:ext cx="4953000" cy="3276600"/>
                     </a:xfrm>
                     <a:prstGeom prst="rect">
                       <a:avLst/>
@@ -29334,7 +29309,7 @@
           <w:sz w:val="20"/>
           <w:szCs w:val="20"/>
         </w:rPr>
-        <w:t>Figura 7. Módulo 1 — Catálogo de libros: registro, búsqueda y control de ejemplares.</w:t>
+        <w:t>Figura 6. Pantalla de inicio de sesión.</w:t>
       </w:r>
     </w:p>
     <w:p>
@@ -29346,12 +29321,11 @@
         <w:rPr>
           <w:noProof/>
         </w:rPr>
-        <w:lastRenderedPageBreak/>
         <w:drawing>
-          <wp:inline distT="0" distB="0" distL="0" distR="0" wp14:anchorId="5CE2205B" wp14:editId="6A001E18">
-            <wp:extent cx="4572000" cy="3895725"/>
+          <wp:inline distT="0" distB="0" distL="0" distR="0" wp14:anchorId="36393F0B" wp14:editId="4D3464B5">
+            <wp:extent cx="4286250" cy="4343400"/>
             <wp:effectExtent l="0" t="0" r="0" b="0"/>
-            <wp:docPr id="8" name="Figura 8. Módulo 2 — Gestión de socios: alta, edición y suspensión." descr="Figura 8. Módulo 2 — Gestión de socios: alta, edición y suspensión." title="Figura 8. Módulo 2 — Gestión de socios: alta, edición y suspensión."/>
+            <wp:docPr id="8" name="Figura 7. Módulo 1 — Catálogo de libros: registro, búsqueda y control de ejemplares." descr="Figura 7. Módulo 1 — Catálogo de libros: registro, búsqueda y control de ejemplares." title="Figura 7. Módulo 1 — Catálogo de libros: registro, búsqueda y control de ejemplares."/>
             <wp:cNvGraphicFramePr>
               <a:graphicFrameLocks xmlns:a="http://schemas.openxmlformats.org/drawingml/2006/main" noChangeAspect="1"/>
             </wp:cNvGraphicFramePr>
@@ -29374,7 +29348,7 @@
                   <pic:spPr bwMode="auto">
                     <a:xfrm>
                       <a:off x="0" y="0"/>
-                      <a:ext cx="4572000" cy="3895725"/>
+                      <a:ext cx="4286250" cy="4343400"/>
                     </a:xfrm>
                     <a:prstGeom prst="rect">
                       <a:avLst/>
@@ -29399,7 +29373,7 @@
           <w:sz w:val="20"/>
           <w:szCs w:val="20"/>
         </w:rPr>
-        <w:t>Figura 8. Módulo 2 — Gestión de socios: alta, edición y suspensión.</w:t>
+        <w:t>Figura 7. Módulo 1 — Catálogo de libros: registro, búsqueda y control de ejemplares.</w:t>
       </w:r>
     </w:p>
     <w:p>
@@ -29411,11 +29385,12 @@
         <w:rPr>
           <w:noProof/>
         </w:rPr>
+        <w:lastRenderedPageBreak/>
         <w:drawing>
-          <wp:inline distT="0" distB="0" distL="0" distR="0" wp14:anchorId="218F7329" wp14:editId="1741A9B7">
-            <wp:extent cx="4762500" cy="3743325"/>
+          <wp:inline distT="0" distB="0" distL="0" distR="0" wp14:anchorId="6E085A2E" wp14:editId="51787C2A">
+            <wp:extent cx="4572000" cy="3895725"/>
             <wp:effectExtent l="0" t="0" r="0" b="0"/>
-            <wp:docPr id="9" name="Figura 9. Módulo 3 — Préstamos y devoluciones con cálculo de días de retraso." descr="Figura 9. Módulo 3 — Préstamos y devoluciones con cálculo de días de retraso." title="Figura 9. Módulo 3 — Préstamos y devoluciones con cálculo de días de retraso."/>
+            <wp:docPr id="9" name="Figura 8. Módulo 2 — Gestión de socios: alta, edición y suspensión." descr="Figura 8. Módulo 2 — Gestión de socios: alta, edición y suspensión." title="Figura 8. Módulo 2 — Gestión de socios: alta, edición y suspensión."/>
             <wp:cNvGraphicFramePr>
               <a:graphicFrameLocks xmlns:a="http://schemas.openxmlformats.org/drawingml/2006/main" noChangeAspect="1"/>
             </wp:cNvGraphicFramePr>
@@ -29438,7 +29413,7 @@
                   <pic:spPr bwMode="auto">
                     <a:xfrm>
                       <a:off x="0" y="0"/>
-                      <a:ext cx="4762500" cy="3743325"/>
+                      <a:ext cx="4572000" cy="3895725"/>
                     </a:xfrm>
                     <a:prstGeom prst="rect">
                       <a:avLst/>
@@ -29463,7 +29438,7 @@
           <w:sz w:val="20"/>
           <w:szCs w:val="20"/>
         </w:rPr>
-        <w:t>Figura 9. Módulo 3 — Préstamos y devoluciones con cálculo de días de retraso.</w:t>
+        <w:t>Figura 8. Módulo 2 — Gestión de socios: alta, edición y suspensión.</w:t>
       </w:r>
     </w:p>
     <w:p>
@@ -29475,12 +29450,11 @@
         <w:rPr>
           <w:noProof/>
         </w:rPr>
-        <w:lastRenderedPageBreak/>
         <w:drawing>
-          <wp:inline distT="0" distB="0" distL="0" distR="0" wp14:anchorId="4D187F56" wp14:editId="3FD9E660">
-            <wp:extent cx="3714750" cy="4467225"/>
+          <wp:inline distT="0" distB="0" distL="0" distR="0" wp14:anchorId="16402F00" wp14:editId="3757E160">
+            <wp:extent cx="4762500" cy="3743325"/>
             <wp:effectExtent l="0" t="0" r="0" b="0"/>
-            <wp:docPr id="10" name="Figura 10. Módulo 4 — Dashboard de indicadores y ranking de libros." descr="Figura 10. Módulo 4 — Dashboard de indicadores y ranking de libros." title="Figura 10. Módulo 4 — Dashboard de indicadores y ranking de libros."/>
+            <wp:docPr id="10" name="Figura 9. Módulo 3 — Préstamos y devoluciones con cálculo de días de retraso." descr="Figura 9. Módulo 3 — Préstamos y devoluciones con cálculo de días de retraso." title="Figura 9. Módulo 3 — Préstamos y devoluciones con cálculo de días de retraso."/>
             <wp:cNvGraphicFramePr>
               <a:graphicFrameLocks xmlns:a="http://schemas.openxmlformats.org/drawingml/2006/main" noChangeAspect="1"/>
             </wp:cNvGraphicFramePr>
@@ -29503,6 +29477,71 @@
                   <pic:spPr bwMode="auto">
                     <a:xfrm>
                       <a:off x="0" y="0"/>
+                      <a:ext cx="4762500" cy="3743325"/>
+                    </a:xfrm>
+                    <a:prstGeom prst="rect">
+                      <a:avLst/>
+                    </a:prstGeom>
+                  </pic:spPr>
+                </pic:pic>
+              </a:graphicData>
+            </a:graphic>
+          </wp:inline>
+        </w:drawing>
+      </w:r>
+    </w:p>
+    <w:p>
+      <w:pPr>
+        <w:spacing w:after="220"/>
+        <w:jc w:val="center"/>
+      </w:pPr>
+      <w:r>
+        <w:rPr>
+          <w:b/>
+          <w:bCs/>
+          <w:sz w:val="20"/>
+          <w:szCs w:val="20"/>
+        </w:rPr>
+        <w:t>Figura 9. Módulo 3 — Préstamos y devoluciones con cálculo de días de retraso.</w:t>
+      </w:r>
+    </w:p>
+    <w:p>
+      <w:pPr>
+        <w:spacing w:before="120" w:after="60"/>
+        <w:jc w:val="center"/>
+      </w:pPr>
+      <w:r>
+        <w:rPr>
+          <w:noProof/>
+        </w:rPr>
+        <w:lastRenderedPageBreak/>
+        <w:drawing>
+          <wp:inline distT="0" distB="0" distL="0" distR="0" wp14:anchorId="416DF990" wp14:editId="330BF369">
+            <wp:extent cx="3714750" cy="4467225"/>
+            <wp:effectExtent l="0" t="0" r="0" b="0"/>
+            <wp:docPr id="11" name="Figura 10. Módulo 4 — Dashboard de indicadores y ranking de libros." descr="Figura 10. Módulo 4 — Dashboard de indicadores y ranking de libros." title="Figura 10. Módulo 4 — Dashboard de indicadores y ranking de libros."/>
+            <wp:cNvGraphicFramePr>
+              <a:graphicFrameLocks xmlns:a="http://schemas.openxmlformats.org/drawingml/2006/main" noChangeAspect="1"/>
+            </wp:cNvGraphicFramePr>
+            <a:graphic xmlns:a="http://schemas.openxmlformats.org/drawingml/2006/main">
+              <a:graphicData uri="http://schemas.openxmlformats.org/drawingml/2006/picture">
+                <pic:pic xmlns:pic="http://schemas.openxmlformats.org/drawingml/2006/picture">
+                  <pic:nvPicPr>
+                    <pic:cNvPr id="0" name=""/>
+                    <pic:cNvPicPr>
+                      <a:picLocks noChangeAspect="1" noChangeArrowheads="1"/>
+                    </pic:cNvPicPr>
+                  </pic:nvPicPr>
+                  <pic:blipFill>
+                    <a:blip r:embed="rId18"/>
+                    <a:srcRect/>
+                    <a:stretch>
+                      <a:fillRect/>
+                    </a:stretch>
+                  </pic:blipFill>
+                  <pic:spPr bwMode="auto">
+                    <a:xfrm>
+                      <a:off x="0" y="0"/>
                       <a:ext cx="3714750" cy="4467225"/>
                     </a:xfrm>
                     <a:prstGeom prst="rect">
@@ -29549,7 +29588,7 @@
       <w:pPr>
         <w:pStyle w:val="Ttulo1"/>
       </w:pPr>
-      <w:bookmarkStart w:id="45" w:name="_Toc240378007"/>
+      <w:bookmarkStart w:id="45" w:name="_Toc240378489"/>
       <w:r>
         <w:lastRenderedPageBreak/>
         <w:t>5. Conclusiones</w:t>
@@ -29560,7 +29599,7 @@
       <w:pPr>
         <w:pStyle w:val="Ttulo2"/>
       </w:pPr>
-      <w:bookmarkStart w:id="46" w:name="_Toc240378008"/>
+      <w:bookmarkStart w:id="46" w:name="_Toc240378490"/>
       <w:r>
         <w:t>5.1 Lecciones Aprendidas</w:t>
       </w:r>
@@ -29786,7 +29825,7 @@
       <w:pPr>
         <w:pStyle w:val="Ttulo3"/>
       </w:pPr>
-      <w:bookmarkStart w:id="47" w:name="_Toc240378009"/>
+      <w:bookmarkStart w:id="47" w:name="_Toc240378491"/>
       <w:r>
         <w:lastRenderedPageBreak/>
         <w:t>Desafíos encontrados</w:t>
@@ -29877,7 +29916,7 @@
       <w:pPr>
         <w:pStyle w:val="Ttulo2"/>
       </w:pPr>
-      <w:bookmarkStart w:id="48" w:name="_Toc240378010"/>
+      <w:bookmarkStart w:id="48" w:name="_Toc240378492"/>
       <w:r>
         <w:t>5.2 Mejoras Futuras</w:t>
       </w:r>
@@ -30091,7 +30130,7 @@
       <w:pPr>
         <w:pStyle w:val="Ttulo1"/>
       </w:pPr>
-      <w:bookmarkStart w:id="49" w:name="_Toc240378011"/>
+      <w:bookmarkStart w:id="49" w:name="_Toc240378493"/>
       <w:r>
         <w:lastRenderedPageBreak/>
         <w:t>Anexo A. Evidencias del repositorio</w:t>
@@ -30114,7 +30153,7 @@
       <w:pPr>
         <w:pStyle w:val="Ttulo2"/>
       </w:pPr>
-      <w:bookmarkStart w:id="50" w:name="_Toc240378012"/>
+      <w:bookmarkStart w:id="50" w:name="_Toc240378494"/>
       <w:r>
         <w:t>A.1 Historial completo con estructura de ramas</w:t>
       </w:r>
@@ -30875,7 +30914,7 @@
       <w:pPr>
         <w:pStyle w:val="Ttulo2"/>
       </w:pPr>
-      <w:bookmarkStart w:id="51" w:name="_Toc240378013"/>
+      <w:bookmarkStart w:id="51" w:name="_Toc240378495"/>
       <w:r>
         <w:t>A.2 Ramas del repositorio</w:t>
       </w:r>
@@ -31126,7 +31165,7 @@
       <w:pPr>
         <w:pStyle w:val="Ttulo2"/>
       </w:pPr>
-      <w:bookmarkStart w:id="52" w:name="_Toc240378014"/>
+      <w:bookmarkStart w:id="52" w:name="_Toc240378496"/>
       <w:r>
         <w:t>A.3 Publicación en el repositorio remoto</w:t>
       </w:r>
@@ -31426,7 +31465,7 @@
       <w:pPr>
         <w:pStyle w:val="Ttulo2"/>
       </w:pPr>
-      <w:bookmarkStart w:id="53" w:name="_Toc240378015"/>
+      <w:bookmarkStart w:id="53" w:name="_Toc240378497"/>
       <w:r>
         <w:t>A.4 Resumen cuantitativo del proyecto</w:t>
       </w:r>
@@ -32406,7 +32445,7 @@
       <w:pPr>
         <w:pStyle w:val="Ttulo1"/>
       </w:pPr>
-      <w:bookmarkStart w:id="54" w:name="_Toc240378016"/>
+      <w:bookmarkStart w:id="54" w:name="_Toc240378498"/>
       <w:r>
         <w:lastRenderedPageBreak/>
         <w:t>Anexo B. Cumplimiento de la rúbrica</w:t>
@@ -33316,7 +33355,7 @@
         </w:rPr>
         <w:t xml:space="preserve">Repositorio del proyecto: </w:t>
       </w:r>
-      <w:hyperlink r:id="rId18" w:history="1">
+      <w:hyperlink r:id="rId19" w:history="1">
         <w:r>
           <w:rPr>
             <w:rStyle w:val="Hipervnculo"/>
@@ -33328,10 +33367,10 @@
       </w:hyperlink>
     </w:p>
     <w:sectPr>
-      <w:headerReference w:type="default" r:id="rId19"/>
-      <w:footerReference w:type="default" r:id="rId20"/>
-      <w:headerReference w:type="first" r:id="rId21"/>
-      <w:footerReference w:type="first" r:id="rId22"/>
+      <w:headerReference w:type="default" r:id="rId20"/>
+      <w:footerReference w:type="default" r:id="rId21"/>
+      <w:headerReference w:type="first" r:id="rId22"/>
+      <w:footerReference w:type="first" r:id="rId23"/>
       <w:pgSz w:w="11906" w:h="16838"/>
       <w:pgMar w:top="1440" w:right="1440" w:bottom="1440" w:left="1440" w:header="708" w:footer="708" w:gutter="0"/>
       <w:cols w:space="720"/>
@@ -33429,10 +33468,10 @@
 <file path=word/numbering.xml><?xml version="1.0" encoding="utf-8"?>
 <w:numbering xmlns:wpc="http://schemas.microsoft.com/office/word/2010/wordprocessingCanvas" xmlns:cx="http://schemas.microsoft.com/office/drawing/2014/chartex" xmlns:cx1="http://schemas.microsoft.com/office/drawing/2015/9/8/chartex" xmlns:cx2="http://schemas.microsoft.com/office/drawing/2015/10/21/chartex" xmlns:cx3="http://schemas.microsoft.com/office/drawing/2016/5/9/chartex" xmlns:cx4="http://schemas.microsoft.com/office/drawing/2016/5/10/chartex" xmlns:cx5="http://schemas.microsoft.com/office/drawing/2016/5/11/chartex" xmlns:cx6="http://schemas.microsoft.com/office/drawing/2016/5/12/chartex" xmlns:cx7="http://schemas.microsoft.com/office/drawing/2016/5/13/chartex" xmlns:cx8="http://schemas.microsoft.com/office/drawing/2016/5/14/chartex" xmlns:mc="http://schemas.openxmlformats.org/markup-compatibility/2006" xmlns:aink="http://schemas.microsoft.com/office/drawing/2016/ink" xmlns:am3d="http://schemas.microsoft.com/office/drawing/2017/model3d" xmlns:o="urn:schemas-microsoft-com:office:office" xmlns:r="http://schemas.openxmlformats.org/officeDocument/2006/relationships" xmlns:m="http://schemas.openxmlformats.org/officeDocument/2006/math" xmlns:v="urn:schemas-microsoft-com:vml" xmlns:wp14="http://schemas.microsoft.com/office/word/2010/wordprocessingDrawing" xmlns:wp="http://schemas.openxmlformats.org/drawingml/2006/wordprocessingDrawing" xmlns:w10="urn:schemas-microsoft-com:office:word" xmlns:w="http://schemas.openxmlformats.org/wordprocessingml/2006/main" xmlns:w14="http://schemas.microsoft.com/office/word/2010/wordml" xmlns:w15="http://schemas.microsoft.com/office/word/2012/wordml" xmlns:w16cex="http://schemas.microsoft.com/office/word/2018/wordml/cex" xmlns:w16cid="http://schemas.microsoft.com/office/word/2016/wordml/cid" xmlns:w16="http://schemas.microsoft.com/office/word/2018/wordml" xmlns:w16sdtdh="http://schemas.microsoft.com/office/word/2020/wordml/sdtdatahash" xmlns:w16se="http://schemas.microsoft.com/office/word/2015/wordml/symex" xmlns:wpg="http://schemas.microsoft.com/office/word/2010/wordprocessingGroup" xmlns:wpi="http://schemas.microsoft.com/office/word/2010/wordprocessingInk" xmlns:wne="http://schemas.microsoft.com/office/word/2006/wordml" xmlns:wps="http://schemas.microsoft.com/office/word/2010/wordprocessingShape" mc:Ignorable="w14 w15 w16se w16cid w16 w16cex w16sdtdh wp14">
   <w:abstractNum w:abstractNumId="0" w15:restartNumberingAfterBreak="0">
-    <w:nsid w:val="1C134AA4"/>
+    <w:nsid w:val="0D4075C3"/>
     <w:multiLevelType w:val="hybridMultilevel"/>
-    <w:tmpl w:val="7938BC1C"/>
-    <w:lvl w:ilvl="0" w:tplc="1DE43E10">
+    <w:tmpl w:val="FF946440"/>
+    <w:lvl w:ilvl="0" w:tplc="6E9237A4">
       <w:start w:val="1"/>
       <w:numFmt w:val="decimal"/>
       <w:lvlText w:val="%1."/>
@@ -33441,255 +33480,255 @@
         <w:ind w:left="560" w:hanging="280"/>
       </w:pPr>
     </w:lvl>
-    <w:lvl w:ilvl="1" w:tplc="47782E84">
+    <w:lvl w:ilvl="1" w:tplc="0B3078BC">
       <w:numFmt w:val="decimal"/>
       <w:lvlText w:val=""/>
       <w:lvlJc w:val="left"/>
     </w:lvl>
-    <w:lvl w:ilvl="2" w:tplc="F7C266BE">
+    <w:lvl w:ilvl="2" w:tplc="3B48A3D0">
       <w:numFmt w:val="decimal"/>
       <w:lvlText w:val=""/>
       <w:lvlJc w:val="left"/>
     </w:lvl>
-    <w:lvl w:ilvl="3" w:tplc="02AE3282">
+    <w:lvl w:ilvl="3" w:tplc="0EC4C320">
       <w:numFmt w:val="decimal"/>
       <w:lvlText w:val=""/>
       <w:lvlJc w:val="left"/>
     </w:lvl>
-    <w:lvl w:ilvl="4" w:tplc="02D4BDAC">
+    <w:lvl w:ilvl="4" w:tplc="486813C8">
       <w:numFmt w:val="decimal"/>
       <w:lvlText w:val=""/>
       <w:lvlJc w:val="left"/>
     </w:lvl>
-    <w:lvl w:ilvl="5" w:tplc="F8A81202">
+    <w:lvl w:ilvl="5" w:tplc="528891FA">
       <w:numFmt w:val="decimal"/>
       <w:lvlText w:val=""/>
       <w:lvlJc w:val="left"/>
     </w:lvl>
-    <w:lvl w:ilvl="6" w:tplc="4B96183C">
+    <w:lvl w:ilvl="6" w:tplc="93D6DDA4">
       <w:numFmt w:val="decimal"/>
       <w:lvlText w:val=""/>
       <w:lvlJc w:val="left"/>
     </w:lvl>
-    <w:lvl w:ilvl="7" w:tplc="3AC64754">
+    <w:lvl w:ilvl="7" w:tplc="7318D790">
       <w:numFmt w:val="decimal"/>
       <w:lvlText w:val=""/>
       <w:lvlJc w:val="left"/>
     </w:lvl>
-    <w:lvl w:ilvl="8" w:tplc="EB40B600">
+    <w:lvl w:ilvl="8" w:tplc="289E9990">
       <w:numFmt w:val="decimal"/>
       <w:lvlText w:val=""/>
       <w:lvlJc w:val="left"/>
     </w:lvl>
   </w:abstractNum>
   <w:abstractNum w:abstractNumId="1" w15:restartNumberingAfterBreak="0">
-    <w:nsid w:val="3AC83C2E"/>
+    <w:nsid w:val="42CB1F27"/>
     <w:multiLevelType w:val="hybridMultilevel"/>
-    <w:tmpl w:val="FF925346"/>
-    <w:lvl w:ilvl="0" w:tplc="1CB00FFC">
+    <w:tmpl w:val="90F46024"/>
+    <w:lvl w:ilvl="0" w:tplc="ADC6246A">
       <w:start w:val="1"/>
-      <w:numFmt w:val="bullet"/>
-      <w:lvlText w:val="●"/>
+      <w:numFmt w:val="decimal"/>
+      <w:lvlText w:val="%1."/>
       <w:lvlJc w:val="left"/>
       <w:pPr>
-        <w:ind w:left="720" w:hanging="360"/>
+        <w:ind w:left="560" w:hanging="280"/>
       </w:pPr>
     </w:lvl>
-    <w:lvl w:ilvl="1" w:tplc="76B44784">
-      <w:start w:val="1"/>
-      <w:numFmt w:val="bullet"/>
-      <w:lvlText w:val="○"/>
-      <w:lvlJc w:val="left"/>
-      <w:pPr>
-        <w:ind w:left="1440" w:hanging="360"/>
-      </w:pPr>
-    </w:lvl>
-    <w:lvl w:ilvl="2" w:tplc="FEDE4B9C">
-      <w:start w:val="1"/>
-      <w:numFmt w:val="bullet"/>
-      <w:lvlText w:val="■"/>
-      <w:lvlJc w:val="left"/>
-      <w:pPr>
-        <w:ind w:left="2160" w:hanging="360"/>
-      </w:pPr>
-    </w:lvl>
-    <w:lvl w:ilvl="3" w:tplc="EF589E84">
-      <w:start w:val="1"/>
-      <w:numFmt w:val="bullet"/>
-      <w:lvlText w:val="●"/>
-      <w:lvlJc w:val="left"/>
-      <w:pPr>
-        <w:ind w:left="2880" w:hanging="360"/>
-      </w:pPr>
-    </w:lvl>
-    <w:lvl w:ilvl="4" w:tplc="BC20AA66">
-      <w:start w:val="1"/>
-      <w:numFmt w:val="bullet"/>
-      <w:lvlText w:val="○"/>
-      <w:lvlJc w:val="left"/>
-      <w:pPr>
-        <w:ind w:left="3600" w:hanging="360"/>
-      </w:pPr>
-    </w:lvl>
-    <w:lvl w:ilvl="5" w:tplc="84E2780A">
-      <w:start w:val="1"/>
-      <w:numFmt w:val="bullet"/>
-      <w:lvlText w:val="■"/>
-      <w:lvlJc w:val="left"/>
-      <w:pPr>
-        <w:ind w:left="4320" w:hanging="360"/>
-      </w:pPr>
-    </w:lvl>
-    <w:lvl w:ilvl="6" w:tplc="82F2E73E">
-      <w:start w:val="1"/>
-      <w:numFmt w:val="bullet"/>
-      <w:lvlText w:val="●"/>
-      <w:lvlJc w:val="left"/>
-      <w:pPr>
-        <w:ind w:left="5040" w:hanging="360"/>
-      </w:pPr>
-    </w:lvl>
-    <w:lvl w:ilvl="7" w:tplc="EE86090A">
-      <w:start w:val="1"/>
-      <w:numFmt w:val="bullet"/>
-      <w:lvlText w:val="●"/>
-      <w:lvlJc w:val="left"/>
-      <w:pPr>
-        <w:ind w:left="5760" w:hanging="360"/>
-      </w:pPr>
-    </w:lvl>
-    <w:lvl w:ilvl="8" w:tplc="2F5EA802">
-      <w:start w:val="1"/>
-      <w:numFmt w:val="bullet"/>
-      <w:lvlText w:val="●"/>
-      <w:lvlJc w:val="left"/>
-      <w:pPr>
-        <w:ind w:left="6480" w:hanging="360"/>
-      </w:pPr>
-    </w:lvl>
-  </w:abstractNum>
-  <w:abstractNum w:abstractNumId="2" w15:restartNumberingAfterBreak="0">
-    <w:nsid w:val="601850E0"/>
-    <w:multiLevelType w:val="hybridMultilevel"/>
-    <w:tmpl w:val="B76A0D42"/>
-    <w:lvl w:ilvl="0" w:tplc="EE5E2DB8">
-      <w:start w:val="1"/>
-      <w:numFmt w:val="bullet"/>
-      <w:lvlText w:val="•"/>
-      <w:lvlJc w:val="left"/>
-      <w:pPr>
-        <w:ind w:left="560" w:hanging="280"/>
-      </w:pPr>
-    </w:lvl>
-    <w:lvl w:ilvl="1" w:tplc="3878D1D0">
+    <w:lvl w:ilvl="1" w:tplc="4EDCE52E">
       <w:numFmt w:val="decimal"/>
       <w:lvlText w:val=""/>
       <w:lvlJc w:val="left"/>
     </w:lvl>
-    <w:lvl w:ilvl="2" w:tplc="BD96D2C8">
+    <w:lvl w:ilvl="2" w:tplc="A516D31E">
       <w:numFmt w:val="decimal"/>
       <w:lvlText w:val=""/>
       <w:lvlJc w:val="left"/>
     </w:lvl>
-    <w:lvl w:ilvl="3" w:tplc="E862944C">
+    <w:lvl w:ilvl="3" w:tplc="E2986DC0">
       <w:numFmt w:val="decimal"/>
       <w:lvlText w:val=""/>
       <w:lvlJc w:val="left"/>
     </w:lvl>
-    <w:lvl w:ilvl="4" w:tplc="C032D458">
+    <w:lvl w:ilvl="4" w:tplc="C29695D8">
       <w:numFmt w:val="decimal"/>
       <w:lvlText w:val=""/>
       <w:lvlJc w:val="left"/>
     </w:lvl>
-    <w:lvl w:ilvl="5" w:tplc="BAF62256">
+    <w:lvl w:ilvl="5" w:tplc="1370189E">
       <w:numFmt w:val="decimal"/>
       <w:lvlText w:val=""/>
       <w:lvlJc w:val="left"/>
     </w:lvl>
-    <w:lvl w:ilvl="6" w:tplc="C79AE278">
+    <w:lvl w:ilvl="6" w:tplc="B9160390">
       <w:numFmt w:val="decimal"/>
       <w:lvlText w:val=""/>
       <w:lvlJc w:val="left"/>
     </w:lvl>
-    <w:lvl w:ilvl="7" w:tplc="994EBED2">
+    <w:lvl w:ilvl="7" w:tplc="E51E61B0">
       <w:numFmt w:val="decimal"/>
       <w:lvlText w:val=""/>
       <w:lvlJc w:val="left"/>
     </w:lvl>
-    <w:lvl w:ilvl="8" w:tplc="F2822206">
+    <w:lvl w:ilvl="8" w:tplc="1C94D9F4">
       <w:numFmt w:val="decimal"/>
       <w:lvlText w:val=""/>
       <w:lvlJc w:val="left"/>
     </w:lvl>
   </w:abstractNum>
+  <w:abstractNum w:abstractNumId="2" w15:restartNumberingAfterBreak="0">
+    <w:nsid w:val="58B5626D"/>
+    <w:multiLevelType w:val="hybridMultilevel"/>
+    <w:tmpl w:val="7B32AD08"/>
+    <w:lvl w:ilvl="0" w:tplc="C23CF172">
+      <w:start w:val="1"/>
+      <w:numFmt w:val="bullet"/>
+      <w:lvlText w:val="●"/>
+      <w:lvlJc w:val="left"/>
+      <w:pPr>
+        <w:ind w:left="720" w:hanging="360"/>
+      </w:pPr>
+    </w:lvl>
+    <w:lvl w:ilvl="1" w:tplc="21F2B0F8">
+      <w:start w:val="1"/>
+      <w:numFmt w:val="bullet"/>
+      <w:lvlText w:val="○"/>
+      <w:lvlJc w:val="left"/>
+      <w:pPr>
+        <w:ind w:left="1440" w:hanging="360"/>
+      </w:pPr>
+    </w:lvl>
+    <w:lvl w:ilvl="2" w:tplc="A1105AEC">
+      <w:start w:val="1"/>
+      <w:numFmt w:val="bullet"/>
+      <w:lvlText w:val="■"/>
+      <w:lvlJc w:val="left"/>
+      <w:pPr>
+        <w:ind w:left="2160" w:hanging="360"/>
+      </w:pPr>
+    </w:lvl>
+    <w:lvl w:ilvl="3" w:tplc="6A4EBD6E">
+      <w:start w:val="1"/>
+      <w:numFmt w:val="bullet"/>
+      <w:lvlText w:val="●"/>
+      <w:lvlJc w:val="left"/>
+      <w:pPr>
+        <w:ind w:left="2880" w:hanging="360"/>
+      </w:pPr>
+    </w:lvl>
+    <w:lvl w:ilvl="4" w:tplc="D8142F96">
+      <w:start w:val="1"/>
+      <w:numFmt w:val="bullet"/>
+      <w:lvlText w:val="○"/>
+      <w:lvlJc w:val="left"/>
+      <w:pPr>
+        <w:ind w:left="3600" w:hanging="360"/>
+      </w:pPr>
+    </w:lvl>
+    <w:lvl w:ilvl="5" w:tplc="0B0C43E2">
+      <w:start w:val="1"/>
+      <w:numFmt w:val="bullet"/>
+      <w:lvlText w:val="■"/>
+      <w:lvlJc w:val="left"/>
+      <w:pPr>
+        <w:ind w:left="4320" w:hanging="360"/>
+      </w:pPr>
+    </w:lvl>
+    <w:lvl w:ilvl="6" w:tplc="8B12CFE0">
+      <w:start w:val="1"/>
+      <w:numFmt w:val="bullet"/>
+      <w:lvlText w:val="●"/>
+      <w:lvlJc w:val="left"/>
+      <w:pPr>
+        <w:ind w:left="5040" w:hanging="360"/>
+      </w:pPr>
+    </w:lvl>
+    <w:lvl w:ilvl="7" w:tplc="4210B470">
+      <w:start w:val="1"/>
+      <w:numFmt w:val="bullet"/>
+      <w:lvlText w:val="●"/>
+      <w:lvlJc w:val="left"/>
+      <w:pPr>
+        <w:ind w:left="5760" w:hanging="360"/>
+      </w:pPr>
+    </w:lvl>
+    <w:lvl w:ilvl="8" w:tplc="CCBCD5EA">
+      <w:start w:val="1"/>
+      <w:numFmt w:val="bullet"/>
+      <w:lvlText w:val="●"/>
+      <w:lvlJc w:val="left"/>
+      <w:pPr>
+        <w:ind w:left="6480" w:hanging="360"/>
+      </w:pPr>
+    </w:lvl>
+  </w:abstractNum>
   <w:abstractNum w:abstractNumId="3" w15:restartNumberingAfterBreak="0">
-    <w:nsid w:val="64251C5D"/>
+    <w:nsid w:val="776700D8"/>
     <w:multiLevelType w:val="hybridMultilevel"/>
-    <w:tmpl w:val="AC468D70"/>
-    <w:lvl w:ilvl="0" w:tplc="9F585E5A">
+    <w:tmpl w:val="25AE0E54"/>
+    <w:lvl w:ilvl="0" w:tplc="E814CE64">
       <w:start w:val="1"/>
-      <w:numFmt w:val="decimal"/>
-      <w:lvlText w:val="%1."/>
+      <w:numFmt w:val="bullet"/>
+      <w:lvlText w:val="•"/>
       <w:lvlJc w:val="left"/>
       <w:pPr>
         <w:ind w:left="560" w:hanging="280"/>
       </w:pPr>
     </w:lvl>
-    <w:lvl w:ilvl="1" w:tplc="4014A56A">
+    <w:lvl w:ilvl="1" w:tplc="859E8F8C">
       <w:numFmt w:val="decimal"/>
       <w:lvlText w:val=""/>
       <w:lvlJc w:val="left"/>
     </w:lvl>
-    <w:lvl w:ilvl="2" w:tplc="862E2DA4">
+    <w:lvl w:ilvl="2" w:tplc="8138E21C">
       <w:numFmt w:val="decimal"/>
       <w:lvlText w:val=""/>
       <w:lvlJc w:val="left"/>
     </w:lvl>
-    <w:lvl w:ilvl="3" w:tplc="63D66B12">
+    <w:lvl w:ilvl="3" w:tplc="0914C292">
       <w:numFmt w:val="decimal"/>
       <w:lvlText w:val=""/>
       <w:lvlJc w:val="left"/>
     </w:lvl>
-    <w:lvl w:ilvl="4" w:tplc="197E6940">
+    <w:lvl w:ilvl="4" w:tplc="FF947862">
       <w:numFmt w:val="decimal"/>
       <w:lvlText w:val=""/>
       <w:lvlJc w:val="left"/>
     </w:lvl>
-    <w:lvl w:ilvl="5" w:tplc="3F32E54E">
+    <w:lvl w:ilvl="5" w:tplc="CB864EDE">
       <w:numFmt w:val="decimal"/>
       <w:lvlText w:val=""/>
       <w:lvlJc w:val="left"/>
     </w:lvl>
-    <w:lvl w:ilvl="6" w:tplc="9B2EBAE6">
+    <w:lvl w:ilvl="6" w:tplc="041AAADC">
       <w:numFmt w:val="decimal"/>
       <w:lvlText w:val=""/>
       <w:lvlJc w:val="left"/>
     </w:lvl>
-    <w:lvl w:ilvl="7" w:tplc="7F544218">
+    <w:lvl w:ilvl="7" w:tplc="3F224E80">
       <w:numFmt w:val="decimal"/>
       <w:lvlText w:val=""/>
       <w:lvlJc w:val="left"/>
     </w:lvl>
-    <w:lvl w:ilvl="8" w:tplc="F0C2CF66">
+    <w:lvl w:ilvl="8" w:tplc="D708082A">
       <w:numFmt w:val="decimal"/>
       <w:lvlText w:val=""/>
       <w:lvlJc w:val="left"/>
     </w:lvl>
   </w:abstractNum>
   <w:num w:numId="1">
-    <w:abstractNumId w:val="1"/>
+    <w:abstractNumId w:val="2"/>
     <w:lvlOverride w:ilvl="0">
       <w:startOverride w:val="1"/>
     </w:lvlOverride>
   </w:num>
   <w:num w:numId="2">
-    <w:abstractNumId w:val="2"/>
+    <w:abstractNumId w:val="3"/>
     <w:lvlOverride w:ilvl="0">
       <w:startOverride w:val="1"/>
     </w:lvlOverride>
   </w:num>
   <w:num w:numId="3">
-    <w:abstractNumId w:val="3"/>
+    <w:abstractNumId w:val="1"/>
     <w:lvlOverride w:ilvl="0">
       <w:startOverride w:val="1"/>
     </w:lvlOverride>
@@ -34319,7 +34358,7 @@
     <w:autoRedefine/>
     <w:uiPriority w:val="39"/>
     <w:unhideWhenUsed/>
-    <w:rsid w:val="00522764"/>
+    <w:rsid w:val="00914B0C"/>
     <w:pPr>
       <w:spacing w:after="100"/>
     </w:pPr>
@@ -34331,7 +34370,7 @@
     <w:autoRedefine/>
     <w:uiPriority w:val="39"/>
     <w:unhideWhenUsed/>
-    <w:rsid w:val="00522764"/>
+    <w:rsid w:val="00914B0C"/>
     <w:pPr>
       <w:spacing w:after="100"/>
       <w:ind w:left="220"/>
@@ -34344,7 +34383,7 @@
     <w:autoRedefine/>
     <w:uiPriority w:val="39"/>
     <w:unhideWhenUsed/>
-    <w:rsid w:val="00522764"/>
+    <w:rsid w:val="00914B0C"/>
     <w:pPr>
       <w:spacing w:after="100"/>
       <w:ind w:left="440"/>

</xml_diff>